<commit_message>
Diploma chapter 4: cross-asset improvement + embedded figures
Added chapter 4 "Углублённое улучшение модели" with 7 sections (E1-E4 experiments),
6 embedded figures, and full production integration narrative.

Volume: 502 paragraphs, 9 tables, 12,899 words, ≈46-58 pages.

Co-Authored-By: Claude Opus 4.7 <noreply@anthropic.com>
</commit_message>
<xml_diff>
--- a/docs/ВКР_Silver_Trading_Assistant.docx
+++ b/docs/ВКР_Silver_Trading_Assistant.docx
@@ -341,6 +341,22 @@
           <w:i w:val="0"/>
           <w:sz w:val="28"/>
         </w:rPr>
+        <w:t>4 Углублённое улучшение модели: cross-asset transfer learning и adaptive barriers 4.1 Постановка задачи и направления улучшения 4.2 Расширение данных через cross-asset подход 4.3 Архитектура экспериментов E1–E4 4.4 Результаты экспериментов 4.5 Финальная модель E3b: характеристики и feature importance 4.6 Сравнение с базовой production-моделью 4.7 Production-интеграция и непрерывное переобучение</w:t>
+      </w:r>
+    </w:p>
+    <w:p>
+      <w:pPr>
+        <w:spacing w:line="360" w:lineRule="auto" w:before="0" w:after="0"/>
+        <w:ind w:firstLine="709"/>
+        <w:jc w:val="both"/>
+      </w:pPr>
+      <w:r>
+        <w:rPr>
+          <w:rFonts w:ascii="Times New Roman" w:hAnsi="Times New Roman" w:cs="Times New Roman" w:eastAsia="Times New Roman"/>
+          <w:b w:val="0"/>
+          <w:i w:val="0"/>
+          <w:sz w:val="28"/>
+        </w:rPr>
         <w:t>ЗАКЛЮЧЕНИЕ</w:t>
       </w:r>
     </w:p>
@@ -715,7 +731,23 @@
           <w:i w:val="0"/>
           <w:sz w:val="28"/>
         </w:rPr>
-        <w:t>Общий объём выпускной квалификационной работы составляет 45–60 страниц.</w:t>
+        <w:t>В четвёртой главе представлен углублённый этап исследования с разработкой улучшенной модели через cross-asset transfer learning, отбор признаков методом mutual information и адаптивные volatility-scaled барьеры. Описаны шесть инкрементальных экспериментов (E1–E4) с честной атрибуцией вклада каждого компонента, выявлены ключевые методологические находки (curse of dimensionality, ограниченность макроиндикаторов в forward-fill режиме, эффективность адаптивных барьеров), приводится сравнение с базовой production-моделью и описание production-интеграции через GitHub Actions.</w:t>
+      </w:r>
+    </w:p>
+    <w:p>
+      <w:pPr>
+        <w:spacing w:line="360" w:lineRule="auto" w:before="0" w:after="0"/>
+        <w:ind w:firstLine="709"/>
+        <w:jc w:val="both"/>
+      </w:pPr>
+      <w:r>
+        <w:rPr>
+          <w:rFonts w:ascii="Times New Roman" w:hAnsi="Times New Roman" w:cs="Times New Roman" w:eastAsia="Times New Roman"/>
+          <w:b w:val="0"/>
+          <w:i w:val="0"/>
+          <w:sz w:val="28"/>
+        </w:rPr>
+        <w:t>Общий объём выпускной квалификационной работы составляет 60–80 страниц.</w:t>
       </w:r>
     </w:p>
     <w:p>
@@ -8725,7 +8757,24 @@
           <w:i w:val="0"/>
           <w:sz w:val="28"/>
         </w:rPr>
-        <w:t>ЗАКЛЮЧЕНИЕ</w:t>
+        <w:t>4 Углублённое улучшение модели: cross-asset transfer learning и adaptive barriers</w:t>
+      </w:r>
+    </w:p>
+    <w:p>
+      <w:pPr>
+        <w:keepNext/>
+        <w:spacing w:line="360" w:lineRule="auto" w:before="240" w:after="120"/>
+        <w:ind w:firstLine="709"/>
+        <w:jc w:val="left"/>
+      </w:pPr>
+      <w:r>
+        <w:rPr>
+          <w:rFonts w:ascii="Times New Roman" w:hAnsi="Times New Roman" w:cs="Times New Roman" w:eastAsia="Times New Roman"/>
+          <w:b/>
+          <w:i w:val="0"/>
+          <w:sz w:val="28"/>
+        </w:rPr>
+        <w:t>4.1 Постановка задачи и направления улучшения</w:t>
       </w:r>
     </w:p>
     <w:p>
@@ -8741,7 +8790,7 @@
           <w:i w:val="0"/>
           <w:sz w:val="28"/>
         </w:rPr>
-        <w:t>В рамках выпускной квалификационной работы была разработана и реализована программная система интеллектуального торгового помощника на основе ансамбля моделей машинного обучения, предназначенная для формирования торговых сигналов на рынке фьючерсов на серебро.</w:t>
+        <w:t>После получения базовых результатов был выполнен углублённый этап исследования с целью улучшения предсказательной точности модели. В качестве направлений улучшения рассматривались четыре ключевых аспекта, каждый из которых проверялся отдельным экспериментом для обеспечения честной атрибуции вклада.</w:t>
       </w:r>
     </w:p>
     <w:p>
@@ -8757,7 +8806,7 @@
           <w:i w:val="0"/>
           <w:sz w:val="28"/>
         </w:rPr>
-        <w:t>В ходе выполнения работы удалось объединить несколько связанных направлений – формирование признакового описания состояния рынка, разметку обучающих данных по методу тройного барьерного размечивания, обучение ансамблевой ML-модели с режим-зависимой специализацией, исполнение торговых сигналов с применением механики trailing stop и периода охлаждения, валидацию результатов методом walk-forward, а также автоматизированную доставку рекомендаций пользователю через веб-интерфейс и мессенджер. В результате был создан программный продукт, позволяющий выполнять полный цикл формирования торговых рекомендаций без необходимости ручного запуска отдельных скриптов или интерпретации промежуточных результатов.</w:t>
+        <w:t>Анализ базовой модели выявил ряд методологических ограничений. Во-первых, модель использовала только 56 признаков, преимущественно являющихся производными цены самого серебра. Это означает, что модель учила автокорреляционные паттерны, а не причинные зависимости с рыночной средой. Во-вторых, фиксированные барьеры триплет-разметки (±1,5 ATR на 20 дней) одинаково применялись к спокойным и волатильным периодам, что приводило к неоднородному качеству меток. В-третьих, обучающая выборка из примерно 3 000 наблюдений могла быть недостаточной для устойчивого обучения сложных моделей.</w:t>
       </w:r>
     </w:p>
     <w:p>
@@ -8773,7 +8822,7 @@
           <w:i w:val="0"/>
           <w:sz w:val="28"/>
         </w:rPr>
-        <w:t>Практическая проверка системы на исторических данных за восьмилетний период показала, что предложенный подход способен формировать торговые сигналы с положительной накопленной доходностью в +31.4% при выполнении 38 сделок, тогда как контрольная стратегия со случайными сигналами демонстрирует отрицательную доходность -2.7% при 78 сделках. Особенно заметный эффект ML-модели был получен в стабильных рыночных условиях периода 2018–2024 годов, где модель добавила +10.45 процентных пункта годовой доходности относительно случайного baseline. Одновременно эксперименты с аномальным периодом 2025 года показали, что в условиях существенного сдвига рыночного режима качество ML-стратегии может временно ухудшаться, что согласуется с известным в литературе свойством моделей машинного обучения деградировать при изменении распределения входных данных.</w:t>
+        <w:t>Сформулированы четыре исследовательских гипотезы:</w:t>
       </w:r>
     </w:p>
     <w:p>
@@ -8789,7 +8838,7 @@
           <w:i w:val="0"/>
           <w:sz w:val="28"/>
         </w:rPr>
-        <w:t>В процессе разработки удалось не только реализовать базовую функциональность системы, но и выявить ряд практических ограничений, которые напрямую влияют на итоговый результат. Наиболее заметные сложности были связаны с нестационарностью финансовых временных рядов, с необходимостью корректного учёта внутридневных движений цены при тройном барьерном размечивании, с обеспечением устойчивости классификации рыночного режима, с обработкой временной недоступности внешних сервисов (Tinkoff Invest API, Telegram Bot API) и с проблемой деградации модели при структурном сдвиге рынка. Отдельного внимания потребовала задача организации автоматизированного переобучения модели на свежих данных, реализованного через платформу GitHub Actions с тремя ежедневными запусками.</w:t>
+        <w:t>– H1: расширение признакового пространства до cross-asset данных пяти металлов (silver, gold, platinum, palladium, copper) повысит обобщающую способность модели за счёт извлечения межрыночных паттернов;</w:t>
       </w:r>
     </w:p>
     <w:p>
@@ -8805,7 +8854,7 @@
           <w:i w:val="0"/>
           <w:sz w:val="28"/>
         </w:rPr>
-        <w:t>Полученный опыт показал, что дальнейшее развитие разработанной системы может быть связано не только с улучшением самой модели, но и с развитием всего пайплайна формирования сигналов. Перспективным направлением является интеграция дополнительных признаков из альтернативных источников данных (макроэкономические показатели, индексы настроений рынка), повышение качества классификации рыночного режима через применение более сложных методов (скрытые марковские модели), внедрение адаптивного порога формирования сигналов в зависимости от текущей волатильности, а также расширение поддержки на другие инструменты драгоценных металлов (золото, платина, палладий).</w:t>
+        <w:t>– H2: добавление макроэкономических индикаторов (TIPS yield, DXY, breakeven inflation, VIX, COT positioning) даст дополнительный контекст для классификации рыночного режима;</w:t>
       </w:r>
     </w:p>
     <w:p>
@@ -8821,7 +8870,7 @@
           <w:i w:val="0"/>
           <w:sz w:val="28"/>
         </w:rPr>
-        <w:t>Особое направление развития связано с проблемой адаптации к структурным сдвигам рынка. Текущая реализация полагается на регулярное переобучение модели на свежих данных, однако в периоды резких сдвигов рыночного режима этот механизм может оказаться недостаточным. Перспективным направлением является разработка специализированных методов детектирования структурного сдвига и автоматического переключения между моделями, обученными на разных режимах, что позволит сократить период деградации качества модели после смены рыночных условий.</w:t>
+        <w:t>– H3: переход от фиксированных барьеров к volatility-scaled adaptive barriers улучшит качество разметки за счёт самоадаптации под текущую рыночную волатильность;</w:t>
       </w:r>
     </w:p>
     <w:p>
@@ -8837,7 +8886,4325 @@
           <w:i w:val="0"/>
           <w:sz w:val="28"/>
         </w:rPr>
-        <w:t>Результаты выполненной работы подтверждают, что поставленная цель была достигнута, а разработанная система уже может использоваться как практический инструмент формирования торговых сигналов на рынке фьючерсов на серебро в стабильных рыночных условиях. При этом проведённые эксперименты показали наличие дальнейшего потенциала развития, что делает разработанный программный продукт хорошей основой для последующих исследований в области применения машинного обучения в алгоритмической торговле.</w:t>
+        <w:t>– H4: объединение нескольких моделей в stacking-ансамбль (HistGradientBoosting + LightGBM + CatBoost + LogisticRegression) повысит результативность за счёт diversity базовых моделей.</w:t>
+      </w:r>
+    </w:p>
+    <w:p>
+      <w:pPr>
+        <w:spacing w:line="360" w:lineRule="auto" w:before="0" w:after="0"/>
+        <w:ind w:firstLine="709"/>
+        <w:jc w:val="both"/>
+      </w:pPr>
+      <w:r>
+        <w:rPr>
+          <w:rFonts w:ascii="Times New Roman" w:hAnsi="Times New Roman" w:cs="Times New Roman" w:eastAsia="Times New Roman"/>
+          <w:b w:val="0"/>
+          <w:i w:val="0"/>
+          <w:sz w:val="28"/>
+        </w:rPr>
+        <w:t>Для проверки каждой гипотезы был спроектирован отдельный эксперимент с инкрементальным добавлением одного компонента к baseline. Это позволяет точно атрибутировать вклад каждого изменения и избежать смешения эффектов.</w:t>
+      </w:r>
+    </w:p>
+    <w:p>
+      <w:pPr>
+        <w:keepNext/>
+        <w:spacing w:line="360" w:lineRule="auto" w:before="240" w:after="120"/>
+        <w:ind w:firstLine="709"/>
+        <w:jc w:val="left"/>
+      </w:pPr>
+      <w:r>
+        <w:rPr>
+          <w:rFonts w:ascii="Times New Roman" w:hAnsi="Times New Roman" w:cs="Times New Roman" w:eastAsia="Times New Roman"/>
+          <w:b/>
+          <w:i w:val="0"/>
+          <w:sz w:val="28"/>
+        </w:rPr>
+        <w:t>4.2 Расширение данных через cross-asset подход</w:t>
+      </w:r>
+    </w:p>
+    <w:p>
+      <w:pPr>
+        <w:spacing w:line="360" w:lineRule="auto" w:before="0" w:after="0"/>
+        <w:ind w:firstLine="709"/>
+        <w:jc w:val="both"/>
+      </w:pPr>
+      <w:r>
+        <w:rPr>
+          <w:rFonts w:ascii="Times New Roman" w:hAnsi="Times New Roman" w:cs="Times New Roman" w:eastAsia="Times New Roman"/>
+          <w:b w:val="0"/>
+          <w:i w:val="0"/>
+          <w:sz w:val="28"/>
+        </w:rPr>
+        <w:t>Первым этапом стало расширение исходной базы данных. Через библиотеку yfinance были загружены дневные котировки за период 2010–2026 годов по пяти металлам, что увеличило общий объём данных более чем в шестнадцать раз относительно исходной выборки 2013–2025 годов по одному активу.</w:t>
+      </w:r>
+    </w:p>
+    <w:p>
+      <w:pPr>
+        <w:spacing w:line="360" w:lineRule="auto" w:before="0" w:after="0"/>
+        <w:ind w:firstLine="709"/>
+        <w:jc w:val="both"/>
+      </w:pPr>
+      <w:r>
+        <w:rPr>
+          <w:rFonts w:ascii="Times New Roman" w:hAnsi="Times New Roman" w:cs="Times New Roman" w:eastAsia="Times New Roman"/>
+          <w:b w:val="0"/>
+          <w:i w:val="0"/>
+          <w:sz w:val="28"/>
+        </w:rPr>
+        <w:t>Дополнительно через публичный API Федерального резервного банка Сент-Луиса (FRED) были загружены девять макроэкономических индикаторов: доходности казначейских облигаций США (10-летние номинальные DGS10 и реальные DFII10), индекс ожиданий инфляции (T10YIE), индекс доллара (DTWEXBGS), VIX, индекс промышленного производства (INDPRO), индекс потребительских цен (CPIAUCSL), цена нефти WTI (DCOILWTICO). Курс USDRUB загружался через yfinance для учёта специфики российского рынка фьючерсов.</w:t>
+      </w:r>
+    </w:p>
+    <w:p>
+      <w:pPr>
+        <w:spacing w:line="360" w:lineRule="auto" w:before="0" w:after="0"/>
+        <w:ind w:firstLine="709"/>
+        <w:jc w:val="both"/>
+      </w:pPr>
+      <w:r>
+        <w:rPr>
+          <w:rFonts w:ascii="Times New Roman" w:hAnsi="Times New Roman" w:cs="Times New Roman" w:eastAsia="Times New Roman"/>
+          <w:b w:val="0"/>
+          <w:i w:val="0"/>
+          <w:sz w:val="28"/>
+        </w:rPr>
+        <w:t>В результате был сформирован комбинированный набор данных из 105 признаков, включающий технические индикаторы для каждого из пяти металлов (RSI, ADX, ATR, BB, моментум), cross-asset отношения и корреляции (gold/silver ratio, silver/copper ratio, 90-дневная корреляция silver-gold), а также макроэкономический контекст с возрастом каждого индикатора в днях.</w:t>
+      </w:r>
+    </w:p>
+    <w:p>
+      <w:pPr>
+        <w:spacing w:line="360" w:lineRule="auto" w:before="0" w:after="0"/>
+        <w:ind w:firstLine="709"/>
+        <w:jc w:val="both"/>
+      </w:pPr>
+      <w:r>
+        <w:rPr>
+          <w:rFonts w:ascii="Times New Roman" w:hAnsi="Times New Roman" w:cs="Times New Roman" w:eastAsia="Times New Roman"/>
+          <w:b w:val="0"/>
+          <w:i w:val="0"/>
+          <w:sz w:val="28"/>
+        </w:rPr>
+        <w:t>Multi-horizon разметка дополнительно увеличила эффективный объём supervision signal в четыре раза: для каждого наблюдения формировались параллельные метки на горизонтах 5, 10, 20 и 60 торговых дней. В результате эффективный размер обучающей выборки достиг примерно 62 200 пар (наблюдение, метка), что соответствует росту в 21 раз относительно исходных 3 000 пар.</w:t>
+      </w:r>
+    </w:p>
+    <w:p>
+      <w:pPr>
+        <w:keepNext/>
+        <w:spacing w:line="360" w:lineRule="auto" w:before="240" w:after="120"/>
+        <w:ind w:firstLine="709"/>
+        <w:jc w:val="left"/>
+      </w:pPr>
+      <w:r>
+        <w:rPr>
+          <w:rFonts w:ascii="Times New Roman" w:hAnsi="Times New Roman" w:cs="Times New Roman" w:eastAsia="Times New Roman"/>
+          <w:b/>
+          <w:i w:val="0"/>
+          <w:sz w:val="28"/>
+        </w:rPr>
+        <w:t>4.3 Архитектура экспериментов E1–E4</w:t>
+      </w:r>
+    </w:p>
+    <w:p>
+      <w:pPr>
+        <w:spacing w:line="360" w:lineRule="auto" w:before="0" w:after="0"/>
+        <w:ind w:firstLine="709"/>
+        <w:jc w:val="both"/>
+      </w:pPr>
+      <w:r>
+        <w:rPr>
+          <w:rFonts w:ascii="Times New Roman" w:hAnsi="Times New Roman" w:cs="Times New Roman" w:eastAsia="Times New Roman"/>
+          <w:b w:val="0"/>
+          <w:i w:val="0"/>
+          <w:sz w:val="28"/>
+        </w:rPr>
+        <w:t>Все эксперименты выполнялись по единой методологии walk-forward анализа: скользящее окно обучения размером 1 000 торговых дней, шаг сдвига 30 дней, тестовое окно 30 дней, purging 20 дней и эмбарго 1 день в соответствии с рекомендациями М. Лопеза де Прадо. Параметры исполнения сделок (порог входа 0,48, период охлаждения 25 дней, trailing stop 12%, максимальное время удержания 30 дней) сохранялись неизменными во всех экспериментах для обеспечения честного сравнения.</w:t>
+      </w:r>
+    </w:p>
+    <w:p>
+      <w:pPr>
+        <w:spacing w:line="360" w:lineRule="auto" w:before="0" w:after="0"/>
+        <w:ind w:firstLine="709"/>
+        <w:jc w:val="both"/>
+      </w:pPr>
+      <w:r>
+        <w:rPr>
+          <w:rFonts w:ascii="Times New Roman" w:hAnsi="Times New Roman" w:cs="Times New Roman" w:eastAsia="Times New Roman"/>
+          <w:b w:val="0"/>
+          <w:i w:val="0"/>
+          <w:sz w:val="28"/>
+        </w:rPr>
+        <w:t>Эксперимент E1 (baseline) использовал только технические признаки серебра — 14 переменных, фиксированные барьеры разметки, единственный горизонт 20 дней и один классификатор HistGradientBoosting. Этот эксперимент был воспроизведён на новой инфраструктуре для установления контрольной точки сравнения.</w:t>
+      </w:r>
+    </w:p>
+    <w:p>
+      <w:pPr>
+        <w:spacing w:line="360" w:lineRule="auto" w:before="0" w:after="0"/>
+        <w:ind w:firstLine="709"/>
+        <w:jc w:val="both"/>
+      </w:pPr>
+      <w:r>
+        <w:rPr>
+          <w:rFonts w:ascii="Times New Roman" w:hAnsi="Times New Roman" w:cs="Times New Roman" w:eastAsia="Times New Roman"/>
+          <w:b w:val="0"/>
+          <w:i w:val="0"/>
+          <w:sz w:val="28"/>
+        </w:rPr>
+        <w:t>Эксперимент E2 (naive cross-asset) добавил 70 технических признаков по четырём дополнительным металлам и 10 cross-asset отношений, доводя общее число признаков до 84. Никакого отбора признаков или регуляризации не применялось — это намеренная проверка эффекта "сырого" добавления данных.</w:t>
+      </w:r>
+    </w:p>
+    <w:p>
+      <w:pPr>
+        <w:spacing w:line="360" w:lineRule="auto" w:before="0" w:after="0"/>
+        <w:ind w:firstLine="709"/>
+        <w:jc w:val="both"/>
+      </w:pPr>
+      <w:r>
+        <w:rPr>
+          <w:rFonts w:ascii="Times New Roman" w:hAnsi="Times New Roman" w:cs="Times New Roman" w:eastAsia="Times New Roman"/>
+          <w:b w:val="0"/>
+          <w:i w:val="0"/>
+          <w:sz w:val="28"/>
+        </w:rPr>
+        <w:t>Эксперимент E2b (feature selection) применил отбор признаков методом mutual information: на каждом фолде walk-forward выбирались 25 лучших признаков по взаимной информации с целевой меткой. Это направлено на устранение проклятия размерности при сохранении cross-asset контекста.</w:t>
+      </w:r>
+    </w:p>
+    <w:p>
+      <w:pPr>
+        <w:spacing w:line="360" w:lineRule="auto" w:before="0" w:after="0"/>
+        <w:ind w:firstLine="709"/>
+        <w:jc w:val="both"/>
+      </w:pPr>
+      <w:r>
+        <w:rPr>
+          <w:rFonts w:ascii="Times New Roman" w:hAnsi="Times New Roman" w:cs="Times New Roman" w:eastAsia="Times New Roman"/>
+          <w:b w:val="0"/>
+          <w:i w:val="0"/>
+          <w:sz w:val="28"/>
+        </w:rPr>
+        <w:t>Эксперимент E3a добавил 18 макроэкономических признаков, доведя общий пул до 102, с тем же отбором top-30 на каждом фолде.</w:t>
+      </w:r>
+    </w:p>
+    <w:p>
+      <w:pPr>
+        <w:spacing w:line="360" w:lineRule="auto" w:before="0" w:after="0"/>
+        <w:ind w:firstLine="709"/>
+        <w:jc w:val="both"/>
+      </w:pPr>
+      <w:r>
+        <w:rPr>
+          <w:rFonts w:ascii="Times New Roman" w:hAnsi="Times New Roman" w:cs="Times New Roman" w:eastAsia="Times New Roman"/>
+          <w:b w:val="0"/>
+          <w:i w:val="0"/>
+          <w:sz w:val="28"/>
+        </w:rPr>
+        <w:t>Эксперимент E3b заменил фиксированные барьеры разметки на адаптивные: для каждого наблюдения вычислялась 20-дневная реализованная волатильность, и барьеры устанавливались как кратные ей с учётом текущего рыночного режима (uptrend / downtrend / sideways).</w:t>
+      </w:r>
+    </w:p>
+    <w:p>
+      <w:pPr>
+        <w:spacing w:line="360" w:lineRule="auto" w:before="0" w:after="0"/>
+        <w:ind w:firstLine="709"/>
+        <w:jc w:val="both"/>
+      </w:pPr>
+      <w:r>
+        <w:rPr>
+          <w:rFonts w:ascii="Times New Roman" w:hAnsi="Times New Roman" w:cs="Times New Roman" w:eastAsia="Times New Roman"/>
+          <w:b w:val="0"/>
+          <w:i w:val="0"/>
+          <w:sz w:val="28"/>
+        </w:rPr>
+        <w:t>Эксперимент E3c добавил мета-разметку (López de Prado, 2018): обучалась дополнительная бинарная модель, фильтрующая слабые сигналы первичной модели.</w:t>
+      </w:r>
+    </w:p>
+    <w:p>
+      <w:pPr>
+        <w:spacing w:line="360" w:lineRule="auto" w:before="0" w:after="0"/>
+        <w:ind w:firstLine="709"/>
+        <w:jc w:val="both"/>
+      </w:pPr>
+      <w:r>
+        <w:rPr>
+          <w:rFonts w:ascii="Times New Roman" w:hAnsi="Times New Roman" w:cs="Times New Roman" w:eastAsia="Times New Roman"/>
+          <w:b w:val="0"/>
+          <w:i w:val="0"/>
+          <w:sz w:val="28"/>
+        </w:rPr>
+        <w:t>Эксперимент E4 заменил единственный HistGradientBoosting на ансамбль из трёх разнородных моделей (HistGradientBoosting, LightGBM, CatBoost) с обучением мета-модели (LogisticRegression) на out-of-fold предсказаниях через внутреннюю 5-фолдовую кросс-валидацию.</w:t>
+      </w:r>
+    </w:p>
+    <w:p>
+      <w:pPr>
+        <w:keepNext/>
+        <w:spacing w:line="360" w:lineRule="auto" w:before="240" w:after="120"/>
+        <w:ind w:firstLine="709"/>
+        <w:jc w:val="left"/>
+      </w:pPr>
+      <w:r>
+        <w:rPr>
+          <w:rFonts w:ascii="Times New Roman" w:hAnsi="Times New Roman" w:cs="Times New Roman" w:eastAsia="Times New Roman"/>
+          <w:b/>
+          <w:i w:val="0"/>
+          <w:sz w:val="28"/>
+        </w:rPr>
+        <w:t>4.4 Результаты экспериментов</w:t>
+      </w:r>
+    </w:p>
+    <w:p>
+      <w:pPr>
+        <w:spacing w:line="360" w:lineRule="auto" w:before="0" w:after="0"/>
+        <w:ind w:firstLine="709"/>
+        <w:jc w:val="both"/>
+      </w:pPr>
+      <w:r>
+        <w:rPr>
+          <w:rFonts w:ascii="Times New Roman" w:hAnsi="Times New Roman" w:cs="Times New Roman" w:eastAsia="Times New Roman"/>
+          <w:b w:val="0"/>
+          <w:i w:val="0"/>
+          <w:sz w:val="28"/>
+        </w:rPr>
+        <w:t>Сводные результаты всех шести экспериментов представлены в таблице 4.1. Каждое значение получено на одинаковых walk-forward фолдах, что обеспечивает корректность сравнения.</w:t>
+      </w:r>
+    </w:p>
+    <w:p>
+      <w:pPr>
+        <w:keepNext/>
+        <w:spacing w:line="360" w:lineRule="auto" w:before="120" w:after="80"/>
+        <w:ind w:firstLine="0"/>
+        <w:jc w:val="left"/>
+      </w:pPr>
+      <w:r>
+        <w:rPr>
+          <w:rFonts w:ascii="Times New Roman" w:hAnsi="Times New Roman" w:cs="Times New Roman" w:eastAsia="Times New Roman"/>
+          <w:b w:val="0"/>
+          <w:i w:val="0"/>
+          <w:sz w:val="28"/>
+        </w:rPr>
+        <w:t>Таблица 4.1 – Сравнительные результаты экспериментов E1–E4</w:t>
+      </w:r>
+    </w:p>
+    <w:tbl>
+      <w:tblPr>
+        <w:tblStyle w:val="TableGrid"/>
+        <w:tblW w:type="auto" w:w="0"/>
+        <w:jc w:val="center"/>
+        <w:tblLook w:firstColumn="1" w:firstRow="1" w:lastColumn="0" w:lastRow="0" w:noHBand="0" w:noVBand="1" w:val="04A0"/>
+      </w:tblPr>
+      <w:tblGrid>
+        <w:gridCol w:w="1205"/>
+        <w:gridCol w:w="1205"/>
+        <w:gridCol w:w="1205"/>
+        <w:gridCol w:w="1205"/>
+        <w:gridCol w:w="1205"/>
+        <w:gridCol w:w="1205"/>
+        <w:gridCol w:w="1205"/>
+        <w:gridCol w:w="1205"/>
+      </w:tblGrid>
+      <w:tr>
+        <w:tc>
+          <w:tcPr>
+            <w:tcW w:type="dxa" w:w="1205"/>
+          </w:tcPr>
+          <w:p>
+            <w:pPr>
+              <w:spacing w:line="276" w:lineRule="auto" w:before="0" w:after="0"/>
+              <w:ind w:firstLine="0"/>
+              <w:jc w:val="center"/>
+            </w:pPr>
+            <w:r/>
+            <w:r>
+              <w:rPr>
+                <w:rFonts w:ascii="Times New Roman" w:hAnsi="Times New Roman" w:cs="Times New Roman" w:eastAsia="Times New Roman"/>
+                <w:b/>
+                <w:i w:val="0"/>
+                <w:sz w:val="24"/>
+              </w:rPr>
+              <w:t>Эксперимент</w:t>
+            </w:r>
+          </w:p>
+        </w:tc>
+        <w:tc>
+          <w:tcPr>
+            <w:tcW w:type="dxa" w:w="1205"/>
+          </w:tcPr>
+          <w:p>
+            <w:pPr>
+              <w:spacing w:line="276" w:lineRule="auto" w:before="0" w:after="0"/>
+              <w:ind w:firstLine="0"/>
+              <w:jc w:val="center"/>
+            </w:pPr>
+            <w:r/>
+            <w:r>
+              <w:rPr>
+                <w:rFonts w:ascii="Times New Roman" w:hAnsi="Times New Roman" w:cs="Times New Roman" w:eastAsia="Times New Roman"/>
+                <w:b/>
+                <w:i w:val="0"/>
+                <w:sz w:val="24"/>
+              </w:rPr>
+              <w:t>Признаков</w:t>
+            </w:r>
+          </w:p>
+        </w:tc>
+        <w:tc>
+          <w:tcPr>
+            <w:tcW w:type="dxa" w:w="1205"/>
+          </w:tcPr>
+          <w:p>
+            <w:pPr>
+              <w:spacing w:line="276" w:lineRule="auto" w:before="0" w:after="0"/>
+              <w:ind w:firstLine="0"/>
+              <w:jc w:val="center"/>
+            </w:pPr>
+            <w:r/>
+            <w:r>
+              <w:rPr>
+                <w:rFonts w:ascii="Times New Roman" w:hAnsi="Times New Roman" w:cs="Times New Roman" w:eastAsia="Times New Roman"/>
+                <w:b/>
+                <w:i w:val="0"/>
+                <w:sz w:val="24"/>
+              </w:rPr>
+              <w:t>Sharpe</w:t>
+            </w:r>
+          </w:p>
+        </w:tc>
+        <w:tc>
+          <w:tcPr>
+            <w:tcW w:type="dxa" w:w="1205"/>
+          </w:tcPr>
+          <w:p>
+            <w:pPr>
+              <w:spacing w:line="276" w:lineRule="auto" w:before="0" w:after="0"/>
+              <w:ind w:firstLine="0"/>
+              <w:jc w:val="center"/>
+            </w:pPr>
+            <w:r/>
+            <w:r>
+              <w:rPr>
+                <w:rFonts w:ascii="Times New Roman" w:hAnsi="Times New Roman" w:cs="Times New Roman" w:eastAsia="Times New Roman"/>
+                <w:b/>
+                <w:i w:val="0"/>
+                <w:sz w:val="24"/>
+              </w:rPr>
+              <w:t>Annual return</w:t>
+            </w:r>
+          </w:p>
+        </w:tc>
+        <w:tc>
+          <w:tcPr>
+            <w:tcW w:type="dxa" w:w="1205"/>
+          </w:tcPr>
+          <w:p>
+            <w:pPr>
+              <w:spacing w:line="276" w:lineRule="auto" w:before="0" w:after="0"/>
+              <w:ind w:firstLine="0"/>
+              <w:jc w:val="center"/>
+            </w:pPr>
+            <w:r/>
+            <w:r>
+              <w:rPr>
+                <w:rFonts w:ascii="Times New Roman" w:hAnsi="Times New Roman" w:cs="Times New Roman" w:eastAsia="Times New Roman"/>
+                <w:b/>
+                <w:i w:val="0"/>
+                <w:sz w:val="24"/>
+              </w:rPr>
+              <w:t>Max DD</w:t>
+            </w:r>
+          </w:p>
+        </w:tc>
+        <w:tc>
+          <w:tcPr>
+            <w:tcW w:type="dxa" w:w="1205"/>
+          </w:tcPr>
+          <w:p>
+            <w:pPr>
+              <w:spacing w:line="276" w:lineRule="auto" w:before="0" w:after="0"/>
+              <w:ind w:firstLine="0"/>
+              <w:jc w:val="center"/>
+            </w:pPr>
+            <w:r/>
+            <w:r>
+              <w:rPr>
+                <w:rFonts w:ascii="Times New Roman" w:hAnsi="Times New Roman" w:cs="Times New Roman" w:eastAsia="Times New Roman"/>
+                <w:b/>
+                <w:i w:val="0"/>
+                <w:sz w:val="24"/>
+              </w:rPr>
+              <w:t>Profit factor</w:t>
+            </w:r>
+          </w:p>
+        </w:tc>
+        <w:tc>
+          <w:tcPr>
+            <w:tcW w:type="dxa" w:w="1205"/>
+          </w:tcPr>
+          <w:p>
+            <w:pPr>
+              <w:spacing w:line="276" w:lineRule="auto" w:before="0" w:after="0"/>
+              <w:ind w:firstLine="0"/>
+              <w:jc w:val="center"/>
+            </w:pPr>
+            <w:r/>
+            <w:r>
+              <w:rPr>
+                <w:rFonts w:ascii="Times New Roman" w:hAnsi="Times New Roman" w:cs="Times New Roman" w:eastAsia="Times New Roman"/>
+                <w:b/>
+                <w:i w:val="0"/>
+                <w:sz w:val="24"/>
+              </w:rPr>
+              <w:t>Win rate</w:t>
+            </w:r>
+          </w:p>
+        </w:tc>
+        <w:tc>
+          <w:tcPr>
+            <w:tcW w:type="dxa" w:w="1205"/>
+          </w:tcPr>
+          <w:p>
+            <w:pPr>
+              <w:spacing w:line="276" w:lineRule="auto" w:before="0" w:after="0"/>
+              <w:ind w:firstLine="0"/>
+              <w:jc w:val="center"/>
+            </w:pPr>
+            <w:r/>
+            <w:r>
+              <w:rPr>
+                <w:rFonts w:ascii="Times New Roman" w:hAnsi="Times New Roman" w:cs="Times New Roman" w:eastAsia="Times New Roman"/>
+                <w:b/>
+                <w:i w:val="0"/>
+                <w:sz w:val="24"/>
+              </w:rPr>
+              <w:t>OOS accuracy</w:t>
+            </w:r>
+          </w:p>
+        </w:tc>
+      </w:tr>
+      <w:tr>
+        <w:tc>
+          <w:tcPr>
+            <w:tcW w:type="dxa" w:w="1205"/>
+          </w:tcPr>
+          <w:p>
+            <w:pPr>
+              <w:spacing w:line="276" w:lineRule="auto" w:before="0" w:after="0"/>
+              <w:ind w:firstLine="0"/>
+              <w:jc w:val="left"/>
+            </w:pPr>
+            <w:r/>
+            <w:r>
+              <w:rPr>
+                <w:rFonts w:ascii="Times New Roman" w:hAnsi="Times New Roman" w:cs="Times New Roman" w:eastAsia="Times New Roman"/>
+                <w:b w:val="0"/>
+                <w:i w:val="0"/>
+                <w:sz w:val="24"/>
+              </w:rPr>
+              <w:t>E1 (silver baseline)</w:t>
+            </w:r>
+          </w:p>
+        </w:tc>
+        <w:tc>
+          <w:tcPr>
+            <w:tcW w:type="dxa" w:w="1205"/>
+          </w:tcPr>
+          <w:p>
+            <w:pPr>
+              <w:spacing w:line="276" w:lineRule="auto" w:before="0" w:after="0"/>
+              <w:ind w:firstLine="0"/>
+              <w:jc w:val="center"/>
+            </w:pPr>
+            <w:r/>
+            <w:r>
+              <w:rPr>
+                <w:rFonts w:ascii="Times New Roman" w:hAnsi="Times New Roman" w:cs="Times New Roman" w:eastAsia="Times New Roman"/>
+                <w:b w:val="0"/>
+                <w:i w:val="0"/>
+                <w:sz w:val="24"/>
+              </w:rPr>
+              <w:t>14</w:t>
+            </w:r>
+          </w:p>
+        </w:tc>
+        <w:tc>
+          <w:tcPr>
+            <w:tcW w:type="dxa" w:w="1205"/>
+          </w:tcPr>
+          <w:p>
+            <w:pPr>
+              <w:spacing w:line="276" w:lineRule="auto" w:before="0" w:after="0"/>
+              <w:ind w:firstLine="0"/>
+              <w:jc w:val="center"/>
+            </w:pPr>
+            <w:r/>
+            <w:r>
+              <w:rPr>
+                <w:rFonts w:ascii="Times New Roman" w:hAnsi="Times New Roman" w:cs="Times New Roman" w:eastAsia="Times New Roman"/>
+                <w:b w:val="0"/>
+                <w:i w:val="0"/>
+                <w:sz w:val="24"/>
+              </w:rPr>
+              <w:t>0,459</w:t>
+            </w:r>
+          </w:p>
+        </w:tc>
+        <w:tc>
+          <w:tcPr>
+            <w:tcW w:type="dxa" w:w="1205"/>
+          </w:tcPr>
+          <w:p>
+            <w:pPr>
+              <w:spacing w:line="276" w:lineRule="auto" w:before="0" w:after="0"/>
+              <w:ind w:firstLine="0"/>
+              <w:jc w:val="center"/>
+            </w:pPr>
+            <w:r/>
+            <w:r>
+              <w:rPr>
+                <w:rFonts w:ascii="Times New Roman" w:hAnsi="Times New Roman" w:cs="Times New Roman" w:eastAsia="Times New Roman"/>
+                <w:b w:val="0"/>
+                <w:i w:val="0"/>
+                <w:sz w:val="24"/>
+              </w:rPr>
+              <w:t>+4,6%</w:t>
+            </w:r>
+          </w:p>
+        </w:tc>
+        <w:tc>
+          <w:tcPr>
+            <w:tcW w:type="dxa" w:w="1205"/>
+          </w:tcPr>
+          <w:p>
+            <w:pPr>
+              <w:spacing w:line="276" w:lineRule="auto" w:before="0" w:after="0"/>
+              <w:ind w:firstLine="0"/>
+              <w:jc w:val="center"/>
+            </w:pPr>
+            <w:r/>
+            <w:r>
+              <w:rPr>
+                <w:rFonts w:ascii="Times New Roman" w:hAnsi="Times New Roman" w:cs="Times New Roman" w:eastAsia="Times New Roman"/>
+                <w:b w:val="0"/>
+                <w:i w:val="0"/>
+                <w:sz w:val="24"/>
+              </w:rPr>
+              <w:t>−24,5%</w:t>
+            </w:r>
+          </w:p>
+        </w:tc>
+        <w:tc>
+          <w:tcPr>
+            <w:tcW w:type="dxa" w:w="1205"/>
+          </w:tcPr>
+          <w:p>
+            <w:pPr>
+              <w:spacing w:line="276" w:lineRule="auto" w:before="0" w:after="0"/>
+              <w:ind w:firstLine="0"/>
+              <w:jc w:val="center"/>
+            </w:pPr>
+            <w:r/>
+            <w:r>
+              <w:rPr>
+                <w:rFonts w:ascii="Times New Roman" w:hAnsi="Times New Roman" w:cs="Times New Roman" w:eastAsia="Times New Roman"/>
+                <w:b w:val="0"/>
+                <w:i w:val="0"/>
+                <w:sz w:val="24"/>
+              </w:rPr>
+              <w:t>1,71</w:t>
+            </w:r>
+          </w:p>
+        </w:tc>
+        <w:tc>
+          <w:tcPr>
+            <w:tcW w:type="dxa" w:w="1205"/>
+          </w:tcPr>
+          <w:p>
+            <w:pPr>
+              <w:spacing w:line="276" w:lineRule="auto" w:before="0" w:after="0"/>
+              <w:ind w:firstLine="0"/>
+              <w:jc w:val="center"/>
+            </w:pPr>
+            <w:r/>
+            <w:r>
+              <w:rPr>
+                <w:rFonts w:ascii="Times New Roman" w:hAnsi="Times New Roman" w:cs="Times New Roman" w:eastAsia="Times New Roman"/>
+                <w:b w:val="0"/>
+                <w:i w:val="0"/>
+                <w:sz w:val="24"/>
+              </w:rPr>
+              <w:t>60,0%</w:t>
+            </w:r>
+          </w:p>
+        </w:tc>
+        <w:tc>
+          <w:tcPr>
+            <w:tcW w:type="dxa" w:w="1205"/>
+          </w:tcPr>
+          <w:p>
+            <w:pPr>
+              <w:spacing w:line="276" w:lineRule="auto" w:before="0" w:after="0"/>
+              <w:ind w:firstLine="0"/>
+              <w:jc w:val="center"/>
+            </w:pPr>
+            <w:r/>
+            <w:r>
+              <w:rPr>
+                <w:rFonts w:ascii="Times New Roman" w:hAnsi="Times New Roman" w:cs="Times New Roman" w:eastAsia="Times New Roman"/>
+                <w:b w:val="0"/>
+                <w:i w:val="0"/>
+                <w:sz w:val="24"/>
+              </w:rPr>
+              <w:t>49,0%</w:t>
+            </w:r>
+          </w:p>
+        </w:tc>
+      </w:tr>
+      <w:tr>
+        <w:tc>
+          <w:tcPr>
+            <w:tcW w:type="dxa" w:w="1205"/>
+          </w:tcPr>
+          <w:p>
+            <w:pPr>
+              <w:spacing w:line="276" w:lineRule="auto" w:before="0" w:after="0"/>
+              <w:ind w:firstLine="0"/>
+              <w:jc w:val="left"/>
+            </w:pPr>
+            <w:r/>
+            <w:r>
+              <w:rPr>
+                <w:rFonts w:ascii="Times New Roman" w:hAnsi="Times New Roman" w:cs="Times New Roman" w:eastAsia="Times New Roman"/>
+                <w:b w:val="0"/>
+                <w:i w:val="0"/>
+                <w:sz w:val="24"/>
+              </w:rPr>
+              <w:t>E2 (naive cross-asset)</w:t>
+            </w:r>
+          </w:p>
+        </w:tc>
+        <w:tc>
+          <w:tcPr>
+            <w:tcW w:type="dxa" w:w="1205"/>
+          </w:tcPr>
+          <w:p>
+            <w:pPr>
+              <w:spacing w:line="276" w:lineRule="auto" w:before="0" w:after="0"/>
+              <w:ind w:firstLine="0"/>
+              <w:jc w:val="center"/>
+            </w:pPr>
+            <w:r/>
+            <w:r>
+              <w:rPr>
+                <w:rFonts w:ascii="Times New Roman" w:hAnsi="Times New Roman" w:cs="Times New Roman" w:eastAsia="Times New Roman"/>
+                <w:b w:val="0"/>
+                <w:i w:val="0"/>
+                <w:sz w:val="24"/>
+              </w:rPr>
+              <w:t>84</w:t>
+            </w:r>
+          </w:p>
+        </w:tc>
+        <w:tc>
+          <w:tcPr>
+            <w:tcW w:type="dxa" w:w="1205"/>
+          </w:tcPr>
+          <w:p>
+            <w:pPr>
+              <w:spacing w:line="276" w:lineRule="auto" w:before="0" w:after="0"/>
+              <w:ind w:firstLine="0"/>
+              <w:jc w:val="center"/>
+            </w:pPr>
+            <w:r/>
+            <w:r>
+              <w:rPr>
+                <w:rFonts w:ascii="Times New Roman" w:hAnsi="Times New Roman" w:cs="Times New Roman" w:eastAsia="Times New Roman"/>
+                <w:b w:val="0"/>
+                <w:i w:val="0"/>
+                <w:sz w:val="24"/>
+              </w:rPr>
+              <w:t>−0,248</w:t>
+            </w:r>
+          </w:p>
+        </w:tc>
+        <w:tc>
+          <w:tcPr>
+            <w:tcW w:type="dxa" w:w="1205"/>
+          </w:tcPr>
+          <w:p>
+            <w:pPr>
+              <w:spacing w:line="276" w:lineRule="auto" w:before="0" w:after="0"/>
+              <w:ind w:firstLine="0"/>
+              <w:jc w:val="center"/>
+            </w:pPr>
+            <w:r/>
+            <w:r>
+              <w:rPr>
+                <w:rFonts w:ascii="Times New Roman" w:hAnsi="Times New Roman" w:cs="Times New Roman" w:eastAsia="Times New Roman"/>
+                <w:b w:val="0"/>
+                <w:i w:val="0"/>
+                <w:sz w:val="24"/>
+              </w:rPr>
+              <w:t>−3,9%</w:t>
+            </w:r>
+          </w:p>
+        </w:tc>
+        <w:tc>
+          <w:tcPr>
+            <w:tcW w:type="dxa" w:w="1205"/>
+          </w:tcPr>
+          <w:p>
+            <w:pPr>
+              <w:spacing w:line="276" w:lineRule="auto" w:before="0" w:after="0"/>
+              <w:ind w:firstLine="0"/>
+              <w:jc w:val="center"/>
+            </w:pPr>
+            <w:r/>
+            <w:r>
+              <w:rPr>
+                <w:rFonts w:ascii="Times New Roman" w:hAnsi="Times New Roman" w:cs="Times New Roman" w:eastAsia="Times New Roman"/>
+                <w:b w:val="0"/>
+                <w:i w:val="0"/>
+                <w:sz w:val="24"/>
+              </w:rPr>
+              <w:t>−51,1%</w:t>
+            </w:r>
+          </w:p>
+        </w:tc>
+        <w:tc>
+          <w:tcPr>
+            <w:tcW w:type="dxa" w:w="1205"/>
+          </w:tcPr>
+          <w:p>
+            <w:pPr>
+              <w:spacing w:line="276" w:lineRule="auto" w:before="0" w:after="0"/>
+              <w:ind w:firstLine="0"/>
+              <w:jc w:val="center"/>
+            </w:pPr>
+            <w:r/>
+            <w:r>
+              <w:rPr>
+                <w:rFonts w:ascii="Times New Roman" w:hAnsi="Times New Roman" w:cs="Times New Roman" w:eastAsia="Times New Roman"/>
+                <w:b w:val="0"/>
+                <w:i w:val="0"/>
+                <w:sz w:val="24"/>
+              </w:rPr>
+              <w:t>0,73</w:t>
+            </w:r>
+          </w:p>
+        </w:tc>
+        <w:tc>
+          <w:tcPr>
+            <w:tcW w:type="dxa" w:w="1205"/>
+          </w:tcPr>
+          <w:p>
+            <w:pPr>
+              <w:spacing w:line="276" w:lineRule="auto" w:before="0" w:after="0"/>
+              <w:ind w:firstLine="0"/>
+              <w:jc w:val="center"/>
+            </w:pPr>
+            <w:r/>
+            <w:r>
+              <w:rPr>
+                <w:rFonts w:ascii="Times New Roman" w:hAnsi="Times New Roman" w:cs="Times New Roman" w:eastAsia="Times New Roman"/>
+                <w:b w:val="0"/>
+                <w:i w:val="0"/>
+                <w:sz w:val="24"/>
+              </w:rPr>
+              <w:t>57,7%</w:t>
+            </w:r>
+          </w:p>
+        </w:tc>
+        <w:tc>
+          <w:tcPr>
+            <w:tcW w:type="dxa" w:w="1205"/>
+          </w:tcPr>
+          <w:p>
+            <w:pPr>
+              <w:spacing w:line="276" w:lineRule="auto" w:before="0" w:after="0"/>
+              <w:ind w:firstLine="0"/>
+              <w:jc w:val="center"/>
+            </w:pPr>
+            <w:r/>
+            <w:r>
+              <w:rPr>
+                <w:rFonts w:ascii="Times New Roman" w:hAnsi="Times New Roman" w:cs="Times New Roman" w:eastAsia="Times New Roman"/>
+                <w:b w:val="0"/>
+                <w:i w:val="0"/>
+                <w:sz w:val="24"/>
+              </w:rPr>
+              <w:t>50,5%</w:t>
+            </w:r>
+          </w:p>
+        </w:tc>
+      </w:tr>
+      <w:tr>
+        <w:tc>
+          <w:tcPr>
+            <w:tcW w:type="dxa" w:w="1205"/>
+          </w:tcPr>
+          <w:p>
+            <w:pPr>
+              <w:spacing w:line="276" w:lineRule="auto" w:before="0" w:after="0"/>
+              <w:ind w:firstLine="0"/>
+              <w:jc w:val="left"/>
+            </w:pPr>
+            <w:r/>
+            <w:r>
+              <w:rPr>
+                <w:rFonts w:ascii="Times New Roman" w:hAnsi="Times New Roman" w:cs="Times New Roman" w:eastAsia="Times New Roman"/>
+                <w:b w:val="0"/>
+                <w:i w:val="0"/>
+                <w:sz w:val="24"/>
+              </w:rPr>
+              <w:t>E2b (+ feature selection)</w:t>
+            </w:r>
+          </w:p>
+        </w:tc>
+        <w:tc>
+          <w:tcPr>
+            <w:tcW w:type="dxa" w:w="1205"/>
+          </w:tcPr>
+          <w:p>
+            <w:pPr>
+              <w:spacing w:line="276" w:lineRule="auto" w:before="0" w:after="0"/>
+              <w:ind w:firstLine="0"/>
+              <w:jc w:val="center"/>
+            </w:pPr>
+            <w:r/>
+            <w:r>
+              <w:rPr>
+                <w:rFonts w:ascii="Times New Roman" w:hAnsi="Times New Roman" w:cs="Times New Roman" w:eastAsia="Times New Roman"/>
+                <w:b w:val="0"/>
+                <w:i w:val="0"/>
+                <w:sz w:val="24"/>
+              </w:rPr>
+              <w:t>84 → 25</w:t>
+            </w:r>
+          </w:p>
+        </w:tc>
+        <w:tc>
+          <w:tcPr>
+            <w:tcW w:type="dxa" w:w="1205"/>
+          </w:tcPr>
+          <w:p>
+            <w:pPr>
+              <w:spacing w:line="276" w:lineRule="auto" w:before="0" w:after="0"/>
+              <w:ind w:firstLine="0"/>
+              <w:jc w:val="center"/>
+            </w:pPr>
+            <w:r/>
+            <w:r>
+              <w:rPr>
+                <w:rFonts w:ascii="Times New Roman" w:hAnsi="Times New Roman" w:cs="Times New Roman" w:eastAsia="Times New Roman"/>
+                <w:b w:val="0"/>
+                <w:i w:val="0"/>
+                <w:sz w:val="24"/>
+              </w:rPr>
+              <w:t>0,580</w:t>
+            </w:r>
+          </w:p>
+        </w:tc>
+        <w:tc>
+          <w:tcPr>
+            <w:tcW w:type="dxa" w:w="1205"/>
+          </w:tcPr>
+          <w:p>
+            <w:pPr>
+              <w:spacing w:line="276" w:lineRule="auto" w:before="0" w:after="0"/>
+              <w:ind w:firstLine="0"/>
+              <w:jc w:val="center"/>
+            </w:pPr>
+            <w:r/>
+            <w:r>
+              <w:rPr>
+                <w:rFonts w:ascii="Times New Roman" w:hAnsi="Times New Roman" w:cs="Times New Roman" w:eastAsia="Times New Roman"/>
+                <w:b w:val="0"/>
+                <w:i w:val="0"/>
+                <w:sz w:val="24"/>
+              </w:rPr>
+              <w:t>+5,9%</w:t>
+            </w:r>
+          </w:p>
+        </w:tc>
+        <w:tc>
+          <w:tcPr>
+            <w:tcW w:type="dxa" w:w="1205"/>
+          </w:tcPr>
+          <w:p>
+            <w:pPr>
+              <w:spacing w:line="276" w:lineRule="auto" w:before="0" w:after="0"/>
+              <w:ind w:firstLine="0"/>
+              <w:jc w:val="center"/>
+            </w:pPr>
+            <w:r/>
+            <w:r>
+              <w:rPr>
+                <w:rFonts w:ascii="Times New Roman" w:hAnsi="Times New Roman" w:cs="Times New Roman" w:eastAsia="Times New Roman"/>
+                <w:b w:val="0"/>
+                <w:i w:val="0"/>
+                <w:sz w:val="24"/>
+              </w:rPr>
+              <w:t>−18,3%</w:t>
+            </w:r>
+          </w:p>
+        </w:tc>
+        <w:tc>
+          <w:tcPr>
+            <w:tcW w:type="dxa" w:w="1205"/>
+          </w:tcPr>
+          <w:p>
+            <w:pPr>
+              <w:spacing w:line="276" w:lineRule="auto" w:before="0" w:after="0"/>
+              <w:ind w:firstLine="0"/>
+              <w:jc w:val="center"/>
+            </w:pPr>
+            <w:r/>
+            <w:r>
+              <w:rPr>
+                <w:rFonts w:ascii="Times New Roman" w:hAnsi="Times New Roman" w:cs="Times New Roman" w:eastAsia="Times New Roman"/>
+                <w:b w:val="0"/>
+                <w:i w:val="0"/>
+                <w:sz w:val="24"/>
+              </w:rPr>
+              <w:t>1,97</w:t>
+            </w:r>
+          </w:p>
+        </w:tc>
+        <w:tc>
+          <w:tcPr>
+            <w:tcW w:type="dxa" w:w="1205"/>
+          </w:tcPr>
+          <w:p>
+            <w:pPr>
+              <w:spacing w:line="276" w:lineRule="auto" w:before="0" w:after="0"/>
+              <w:ind w:firstLine="0"/>
+              <w:jc w:val="center"/>
+            </w:pPr>
+            <w:r/>
+            <w:r>
+              <w:rPr>
+                <w:rFonts w:ascii="Times New Roman" w:hAnsi="Times New Roman" w:cs="Times New Roman" w:eastAsia="Times New Roman"/>
+                <w:b w:val="0"/>
+                <w:i w:val="0"/>
+                <w:sz w:val="24"/>
+              </w:rPr>
+              <w:t>67,9%</w:t>
+            </w:r>
+          </w:p>
+        </w:tc>
+        <w:tc>
+          <w:tcPr>
+            <w:tcW w:type="dxa" w:w="1205"/>
+          </w:tcPr>
+          <w:p>
+            <w:pPr>
+              <w:spacing w:line="276" w:lineRule="auto" w:before="0" w:after="0"/>
+              <w:ind w:firstLine="0"/>
+              <w:jc w:val="center"/>
+            </w:pPr>
+            <w:r/>
+            <w:r>
+              <w:rPr>
+                <w:rFonts w:ascii="Times New Roman" w:hAnsi="Times New Roman" w:cs="Times New Roman" w:eastAsia="Times New Roman"/>
+                <w:b w:val="0"/>
+                <w:i w:val="0"/>
+                <w:sz w:val="24"/>
+              </w:rPr>
+              <w:t>51,3%</w:t>
+            </w:r>
+          </w:p>
+        </w:tc>
+      </w:tr>
+      <w:tr>
+        <w:tc>
+          <w:tcPr>
+            <w:tcW w:type="dxa" w:w="1205"/>
+          </w:tcPr>
+          <w:p>
+            <w:pPr>
+              <w:spacing w:line="276" w:lineRule="auto" w:before="0" w:after="0"/>
+              <w:ind w:firstLine="0"/>
+              <w:jc w:val="left"/>
+            </w:pPr>
+            <w:r/>
+            <w:r>
+              <w:rPr>
+                <w:rFonts w:ascii="Times New Roman" w:hAnsi="Times New Roman" w:cs="Times New Roman" w:eastAsia="Times New Roman"/>
+                <w:b w:val="0"/>
+                <w:i w:val="0"/>
+                <w:sz w:val="24"/>
+              </w:rPr>
+              <w:t>E3a (+ macro features)</w:t>
+            </w:r>
+          </w:p>
+        </w:tc>
+        <w:tc>
+          <w:tcPr>
+            <w:tcW w:type="dxa" w:w="1205"/>
+          </w:tcPr>
+          <w:p>
+            <w:pPr>
+              <w:spacing w:line="276" w:lineRule="auto" w:before="0" w:after="0"/>
+              <w:ind w:firstLine="0"/>
+              <w:jc w:val="center"/>
+            </w:pPr>
+            <w:r/>
+            <w:r>
+              <w:rPr>
+                <w:rFonts w:ascii="Times New Roman" w:hAnsi="Times New Roman" w:cs="Times New Roman" w:eastAsia="Times New Roman"/>
+                <w:b w:val="0"/>
+                <w:i w:val="0"/>
+                <w:sz w:val="24"/>
+              </w:rPr>
+              <w:t>102 → 30</w:t>
+            </w:r>
+          </w:p>
+        </w:tc>
+        <w:tc>
+          <w:tcPr>
+            <w:tcW w:type="dxa" w:w="1205"/>
+          </w:tcPr>
+          <w:p>
+            <w:pPr>
+              <w:spacing w:line="276" w:lineRule="auto" w:before="0" w:after="0"/>
+              <w:ind w:firstLine="0"/>
+              <w:jc w:val="center"/>
+            </w:pPr>
+            <w:r/>
+            <w:r>
+              <w:rPr>
+                <w:rFonts w:ascii="Times New Roman" w:hAnsi="Times New Roman" w:cs="Times New Roman" w:eastAsia="Times New Roman"/>
+                <w:b w:val="0"/>
+                <w:i w:val="0"/>
+                <w:sz w:val="24"/>
+              </w:rPr>
+              <w:t>0,424</w:t>
+            </w:r>
+          </w:p>
+        </w:tc>
+        <w:tc>
+          <w:tcPr>
+            <w:tcW w:type="dxa" w:w="1205"/>
+          </w:tcPr>
+          <w:p>
+            <w:pPr>
+              <w:spacing w:line="276" w:lineRule="auto" w:before="0" w:after="0"/>
+              <w:ind w:firstLine="0"/>
+              <w:jc w:val="center"/>
+            </w:pPr>
+            <w:r/>
+            <w:r>
+              <w:rPr>
+                <w:rFonts w:ascii="Times New Roman" w:hAnsi="Times New Roman" w:cs="Times New Roman" w:eastAsia="Times New Roman"/>
+                <w:b w:val="0"/>
+                <w:i w:val="0"/>
+                <w:sz w:val="24"/>
+              </w:rPr>
+              <w:t>+5,5%</w:t>
+            </w:r>
+          </w:p>
+        </w:tc>
+        <w:tc>
+          <w:tcPr>
+            <w:tcW w:type="dxa" w:w="1205"/>
+          </w:tcPr>
+          <w:p>
+            <w:pPr>
+              <w:spacing w:line="276" w:lineRule="auto" w:before="0" w:after="0"/>
+              <w:ind w:firstLine="0"/>
+              <w:jc w:val="center"/>
+            </w:pPr>
+            <w:r/>
+            <w:r>
+              <w:rPr>
+                <w:rFonts w:ascii="Times New Roman" w:hAnsi="Times New Roman" w:cs="Times New Roman" w:eastAsia="Times New Roman"/>
+                <w:b w:val="0"/>
+                <w:i w:val="0"/>
+                <w:sz w:val="24"/>
+              </w:rPr>
+              <w:t>−31,3%</w:t>
+            </w:r>
+          </w:p>
+        </w:tc>
+        <w:tc>
+          <w:tcPr>
+            <w:tcW w:type="dxa" w:w="1205"/>
+          </w:tcPr>
+          <w:p>
+            <w:pPr>
+              <w:spacing w:line="276" w:lineRule="auto" w:before="0" w:after="0"/>
+              <w:ind w:firstLine="0"/>
+              <w:jc w:val="center"/>
+            </w:pPr>
+            <w:r/>
+            <w:r>
+              <w:rPr>
+                <w:rFonts w:ascii="Times New Roman" w:hAnsi="Times New Roman" w:cs="Times New Roman" w:eastAsia="Times New Roman"/>
+                <w:b w:val="0"/>
+                <w:i w:val="0"/>
+                <w:sz w:val="24"/>
+              </w:rPr>
+              <w:t>1,93</w:t>
+            </w:r>
+          </w:p>
+        </w:tc>
+        <w:tc>
+          <w:tcPr>
+            <w:tcW w:type="dxa" w:w="1205"/>
+          </w:tcPr>
+          <w:p>
+            <w:pPr>
+              <w:spacing w:line="276" w:lineRule="auto" w:before="0" w:after="0"/>
+              <w:ind w:firstLine="0"/>
+              <w:jc w:val="center"/>
+            </w:pPr>
+            <w:r/>
+            <w:r>
+              <w:rPr>
+                <w:rFonts w:ascii="Times New Roman" w:hAnsi="Times New Roman" w:cs="Times New Roman" w:eastAsia="Times New Roman"/>
+                <w:b w:val="0"/>
+                <w:i w:val="0"/>
+                <w:sz w:val="24"/>
+              </w:rPr>
+              <w:t>60,0%</w:t>
+            </w:r>
+          </w:p>
+        </w:tc>
+        <w:tc>
+          <w:tcPr>
+            <w:tcW w:type="dxa" w:w="1205"/>
+          </w:tcPr>
+          <w:p>
+            <w:pPr>
+              <w:spacing w:line="276" w:lineRule="auto" w:before="0" w:after="0"/>
+              <w:ind w:firstLine="0"/>
+              <w:jc w:val="center"/>
+            </w:pPr>
+            <w:r/>
+            <w:r>
+              <w:rPr>
+                <w:rFonts w:ascii="Times New Roman" w:hAnsi="Times New Roman" w:cs="Times New Roman" w:eastAsia="Times New Roman"/>
+                <w:b w:val="0"/>
+                <w:i w:val="0"/>
+                <w:sz w:val="24"/>
+              </w:rPr>
+              <w:t>50,5%</w:t>
+            </w:r>
+          </w:p>
+        </w:tc>
+      </w:tr>
+      <w:tr>
+        <w:tc>
+          <w:tcPr>
+            <w:tcW w:type="dxa" w:w="1205"/>
+          </w:tcPr>
+          <w:p>
+            <w:pPr>
+              <w:spacing w:line="276" w:lineRule="auto" w:before="0" w:after="0"/>
+              <w:ind w:firstLine="0"/>
+              <w:jc w:val="left"/>
+            </w:pPr>
+            <w:r/>
+            <w:r>
+              <w:rPr>
+                <w:rFonts w:ascii="Times New Roman" w:hAnsi="Times New Roman" w:cs="Times New Roman" w:eastAsia="Times New Roman"/>
+                <w:b/>
+                <w:i w:val="0"/>
+                <w:sz w:val="24"/>
+              </w:rPr>
+              <w:t>E3b (+ adaptive barriers)</w:t>
+            </w:r>
+          </w:p>
+        </w:tc>
+        <w:tc>
+          <w:tcPr>
+            <w:tcW w:type="dxa" w:w="1205"/>
+          </w:tcPr>
+          <w:p>
+            <w:pPr>
+              <w:spacing w:line="276" w:lineRule="auto" w:before="0" w:after="0"/>
+              <w:ind w:firstLine="0"/>
+              <w:jc w:val="center"/>
+            </w:pPr>
+            <w:r/>
+            <w:r>
+              <w:rPr>
+                <w:rFonts w:ascii="Times New Roman" w:hAnsi="Times New Roman" w:cs="Times New Roman" w:eastAsia="Times New Roman"/>
+                <w:b/>
+                <w:i w:val="0"/>
+                <w:sz w:val="24"/>
+              </w:rPr>
+              <w:t>102 → 30</w:t>
+            </w:r>
+          </w:p>
+        </w:tc>
+        <w:tc>
+          <w:tcPr>
+            <w:tcW w:type="dxa" w:w="1205"/>
+          </w:tcPr>
+          <w:p>
+            <w:pPr>
+              <w:spacing w:line="276" w:lineRule="auto" w:before="0" w:after="0"/>
+              <w:ind w:firstLine="0"/>
+              <w:jc w:val="center"/>
+            </w:pPr>
+            <w:r/>
+            <w:r>
+              <w:rPr>
+                <w:rFonts w:ascii="Times New Roman" w:hAnsi="Times New Roman" w:cs="Times New Roman" w:eastAsia="Times New Roman"/>
+                <w:b/>
+                <w:i w:val="0"/>
+                <w:sz w:val="24"/>
+              </w:rPr>
+              <w:t>0,530</w:t>
+            </w:r>
+          </w:p>
+        </w:tc>
+        <w:tc>
+          <w:tcPr>
+            <w:tcW w:type="dxa" w:w="1205"/>
+          </w:tcPr>
+          <w:p>
+            <w:pPr>
+              <w:spacing w:line="276" w:lineRule="auto" w:before="0" w:after="0"/>
+              <w:ind w:firstLine="0"/>
+              <w:jc w:val="center"/>
+            </w:pPr>
+            <w:r/>
+            <w:r>
+              <w:rPr>
+                <w:rFonts w:ascii="Times New Roman" w:hAnsi="Times New Roman" w:cs="Times New Roman" w:eastAsia="Times New Roman"/>
+                <w:b/>
+                <w:i w:val="0"/>
+                <w:sz w:val="24"/>
+              </w:rPr>
+              <w:t>+7,7%</w:t>
+            </w:r>
+          </w:p>
+        </w:tc>
+        <w:tc>
+          <w:tcPr>
+            <w:tcW w:type="dxa" w:w="1205"/>
+          </w:tcPr>
+          <w:p>
+            <w:pPr>
+              <w:spacing w:line="276" w:lineRule="auto" w:before="0" w:after="0"/>
+              <w:ind w:firstLine="0"/>
+              <w:jc w:val="center"/>
+            </w:pPr>
+            <w:r/>
+            <w:r>
+              <w:rPr>
+                <w:rFonts w:ascii="Times New Roman" w:hAnsi="Times New Roman" w:cs="Times New Roman" w:eastAsia="Times New Roman"/>
+                <w:b/>
+                <w:i w:val="0"/>
+                <w:sz w:val="24"/>
+              </w:rPr>
+              <w:t>−17,9%</w:t>
+            </w:r>
+          </w:p>
+        </w:tc>
+        <w:tc>
+          <w:tcPr>
+            <w:tcW w:type="dxa" w:w="1205"/>
+          </w:tcPr>
+          <w:p>
+            <w:pPr>
+              <w:spacing w:line="276" w:lineRule="auto" w:before="0" w:after="0"/>
+              <w:ind w:firstLine="0"/>
+              <w:jc w:val="center"/>
+            </w:pPr>
+            <w:r/>
+            <w:r>
+              <w:rPr>
+                <w:rFonts w:ascii="Times New Roman" w:hAnsi="Times New Roman" w:cs="Times New Roman" w:eastAsia="Times New Roman"/>
+                <w:b/>
+                <w:i w:val="0"/>
+                <w:sz w:val="24"/>
+              </w:rPr>
+              <w:t>2,12</w:t>
+            </w:r>
+          </w:p>
+        </w:tc>
+        <w:tc>
+          <w:tcPr>
+            <w:tcW w:type="dxa" w:w="1205"/>
+          </w:tcPr>
+          <w:p>
+            <w:pPr>
+              <w:spacing w:line="276" w:lineRule="auto" w:before="0" w:after="0"/>
+              <w:ind w:firstLine="0"/>
+              <w:jc w:val="center"/>
+            </w:pPr>
+            <w:r/>
+            <w:r>
+              <w:rPr>
+                <w:rFonts w:ascii="Times New Roman" w:hAnsi="Times New Roman" w:cs="Times New Roman" w:eastAsia="Times New Roman"/>
+                <w:b/>
+                <w:i w:val="0"/>
+                <w:sz w:val="24"/>
+              </w:rPr>
+              <w:t>68,8%</w:t>
+            </w:r>
+          </w:p>
+        </w:tc>
+        <w:tc>
+          <w:tcPr>
+            <w:tcW w:type="dxa" w:w="1205"/>
+          </w:tcPr>
+          <w:p>
+            <w:pPr>
+              <w:spacing w:line="276" w:lineRule="auto" w:before="0" w:after="0"/>
+              <w:ind w:firstLine="0"/>
+              <w:jc w:val="center"/>
+            </w:pPr>
+            <w:r/>
+            <w:r>
+              <w:rPr>
+                <w:rFonts w:ascii="Times New Roman" w:hAnsi="Times New Roman" w:cs="Times New Roman" w:eastAsia="Times New Roman"/>
+                <w:b/>
+                <w:i w:val="0"/>
+                <w:sz w:val="24"/>
+              </w:rPr>
+              <w:t>55,5%</w:t>
+            </w:r>
+          </w:p>
+        </w:tc>
+      </w:tr>
+      <w:tr>
+        <w:tc>
+          <w:tcPr>
+            <w:tcW w:type="dxa" w:w="1205"/>
+          </w:tcPr>
+          <w:p>
+            <w:pPr>
+              <w:spacing w:line="276" w:lineRule="auto" w:before="0" w:after="0"/>
+              <w:ind w:firstLine="0"/>
+              <w:jc w:val="left"/>
+            </w:pPr>
+            <w:r/>
+            <w:r>
+              <w:rPr>
+                <w:rFonts w:ascii="Times New Roman" w:hAnsi="Times New Roman" w:cs="Times New Roman" w:eastAsia="Times New Roman"/>
+                <w:b w:val="0"/>
+                <w:i w:val="0"/>
+                <w:sz w:val="24"/>
+              </w:rPr>
+              <w:t>E3c (+ meta-labeling)</w:t>
+            </w:r>
+          </w:p>
+        </w:tc>
+        <w:tc>
+          <w:tcPr>
+            <w:tcW w:type="dxa" w:w="1205"/>
+          </w:tcPr>
+          <w:p>
+            <w:pPr>
+              <w:spacing w:line="276" w:lineRule="auto" w:before="0" w:after="0"/>
+              <w:ind w:firstLine="0"/>
+              <w:jc w:val="center"/>
+            </w:pPr>
+            <w:r/>
+            <w:r>
+              <w:rPr>
+                <w:rFonts w:ascii="Times New Roman" w:hAnsi="Times New Roman" w:cs="Times New Roman" w:eastAsia="Times New Roman"/>
+                <w:b w:val="0"/>
+                <w:i w:val="0"/>
+                <w:sz w:val="24"/>
+              </w:rPr>
+              <w:t>102 → 30</w:t>
+            </w:r>
+          </w:p>
+        </w:tc>
+        <w:tc>
+          <w:tcPr>
+            <w:tcW w:type="dxa" w:w="1205"/>
+          </w:tcPr>
+          <w:p>
+            <w:pPr>
+              <w:spacing w:line="276" w:lineRule="auto" w:before="0" w:after="0"/>
+              <w:ind w:firstLine="0"/>
+              <w:jc w:val="center"/>
+            </w:pPr>
+            <w:r/>
+            <w:r>
+              <w:rPr>
+                <w:rFonts w:ascii="Times New Roman" w:hAnsi="Times New Roman" w:cs="Times New Roman" w:eastAsia="Times New Roman"/>
+                <w:b w:val="0"/>
+                <w:i w:val="0"/>
+                <w:sz w:val="24"/>
+              </w:rPr>
+              <w:t>0,530</w:t>
+            </w:r>
+          </w:p>
+        </w:tc>
+        <w:tc>
+          <w:tcPr>
+            <w:tcW w:type="dxa" w:w="1205"/>
+          </w:tcPr>
+          <w:p>
+            <w:pPr>
+              <w:spacing w:line="276" w:lineRule="auto" w:before="0" w:after="0"/>
+              <w:ind w:firstLine="0"/>
+              <w:jc w:val="center"/>
+            </w:pPr>
+            <w:r/>
+            <w:r>
+              <w:rPr>
+                <w:rFonts w:ascii="Times New Roman" w:hAnsi="Times New Roman" w:cs="Times New Roman" w:eastAsia="Times New Roman"/>
+                <w:b w:val="0"/>
+                <w:i w:val="0"/>
+                <w:sz w:val="24"/>
+              </w:rPr>
+              <w:t>+7,7%</w:t>
+            </w:r>
+          </w:p>
+        </w:tc>
+        <w:tc>
+          <w:tcPr>
+            <w:tcW w:type="dxa" w:w="1205"/>
+          </w:tcPr>
+          <w:p>
+            <w:pPr>
+              <w:spacing w:line="276" w:lineRule="auto" w:before="0" w:after="0"/>
+              <w:ind w:firstLine="0"/>
+              <w:jc w:val="center"/>
+            </w:pPr>
+            <w:r/>
+            <w:r>
+              <w:rPr>
+                <w:rFonts w:ascii="Times New Roman" w:hAnsi="Times New Roman" w:cs="Times New Roman" w:eastAsia="Times New Roman"/>
+                <w:b w:val="0"/>
+                <w:i w:val="0"/>
+                <w:sz w:val="24"/>
+              </w:rPr>
+              <w:t>−17,9%</w:t>
+            </w:r>
+          </w:p>
+        </w:tc>
+        <w:tc>
+          <w:tcPr>
+            <w:tcW w:type="dxa" w:w="1205"/>
+          </w:tcPr>
+          <w:p>
+            <w:pPr>
+              <w:spacing w:line="276" w:lineRule="auto" w:before="0" w:after="0"/>
+              <w:ind w:firstLine="0"/>
+              <w:jc w:val="center"/>
+            </w:pPr>
+            <w:r/>
+            <w:r>
+              <w:rPr>
+                <w:rFonts w:ascii="Times New Roman" w:hAnsi="Times New Roman" w:cs="Times New Roman" w:eastAsia="Times New Roman"/>
+                <w:b w:val="0"/>
+                <w:i w:val="0"/>
+                <w:sz w:val="24"/>
+              </w:rPr>
+              <w:t>2,12</w:t>
+            </w:r>
+          </w:p>
+        </w:tc>
+        <w:tc>
+          <w:tcPr>
+            <w:tcW w:type="dxa" w:w="1205"/>
+          </w:tcPr>
+          <w:p>
+            <w:pPr>
+              <w:spacing w:line="276" w:lineRule="auto" w:before="0" w:after="0"/>
+              <w:ind w:firstLine="0"/>
+              <w:jc w:val="center"/>
+            </w:pPr>
+            <w:r/>
+            <w:r>
+              <w:rPr>
+                <w:rFonts w:ascii="Times New Roman" w:hAnsi="Times New Roman" w:cs="Times New Roman" w:eastAsia="Times New Roman"/>
+                <w:b w:val="0"/>
+                <w:i w:val="0"/>
+                <w:sz w:val="24"/>
+              </w:rPr>
+              <w:t>68,8%</w:t>
+            </w:r>
+          </w:p>
+        </w:tc>
+        <w:tc>
+          <w:tcPr>
+            <w:tcW w:type="dxa" w:w="1205"/>
+          </w:tcPr>
+          <w:p>
+            <w:pPr>
+              <w:spacing w:line="276" w:lineRule="auto" w:before="0" w:after="0"/>
+              <w:ind w:firstLine="0"/>
+              <w:jc w:val="center"/>
+            </w:pPr>
+            <w:r/>
+            <w:r>
+              <w:rPr>
+                <w:rFonts w:ascii="Times New Roman" w:hAnsi="Times New Roman" w:cs="Times New Roman" w:eastAsia="Times New Roman"/>
+                <w:b w:val="0"/>
+                <w:i w:val="0"/>
+                <w:sz w:val="24"/>
+              </w:rPr>
+              <w:t>55,5%</w:t>
+            </w:r>
+          </w:p>
+        </w:tc>
+      </w:tr>
+      <w:tr>
+        <w:tc>
+          <w:tcPr>
+            <w:tcW w:type="dxa" w:w="1205"/>
+          </w:tcPr>
+          <w:p>
+            <w:pPr>
+              <w:spacing w:line="276" w:lineRule="auto" w:before="0" w:after="0"/>
+              <w:ind w:firstLine="0"/>
+              <w:jc w:val="left"/>
+            </w:pPr>
+            <w:r/>
+            <w:r>
+              <w:rPr>
+                <w:rFonts w:ascii="Times New Roman" w:hAnsi="Times New Roman" w:cs="Times New Roman" w:eastAsia="Times New Roman"/>
+                <w:b w:val="0"/>
+                <w:i w:val="0"/>
+                <w:sz w:val="24"/>
+              </w:rPr>
+              <w:t>E4 (stacking ensemble)</w:t>
+            </w:r>
+          </w:p>
+        </w:tc>
+        <w:tc>
+          <w:tcPr>
+            <w:tcW w:type="dxa" w:w="1205"/>
+          </w:tcPr>
+          <w:p>
+            <w:pPr>
+              <w:spacing w:line="276" w:lineRule="auto" w:before="0" w:after="0"/>
+              <w:ind w:firstLine="0"/>
+              <w:jc w:val="center"/>
+            </w:pPr>
+            <w:r/>
+            <w:r>
+              <w:rPr>
+                <w:rFonts w:ascii="Times New Roman" w:hAnsi="Times New Roman" w:cs="Times New Roman" w:eastAsia="Times New Roman"/>
+                <w:b w:val="0"/>
+                <w:i w:val="0"/>
+                <w:sz w:val="24"/>
+              </w:rPr>
+              <w:t>102 → 30</w:t>
+            </w:r>
+          </w:p>
+        </w:tc>
+        <w:tc>
+          <w:tcPr>
+            <w:tcW w:type="dxa" w:w="1205"/>
+          </w:tcPr>
+          <w:p>
+            <w:pPr>
+              <w:spacing w:line="276" w:lineRule="auto" w:before="0" w:after="0"/>
+              <w:ind w:firstLine="0"/>
+              <w:jc w:val="center"/>
+            </w:pPr>
+            <w:r/>
+            <w:r>
+              <w:rPr>
+                <w:rFonts w:ascii="Times New Roman" w:hAnsi="Times New Roman" w:cs="Times New Roman" w:eastAsia="Times New Roman"/>
+                <w:b w:val="0"/>
+                <w:i w:val="0"/>
+                <w:sz w:val="24"/>
+              </w:rPr>
+              <w:t>0,194</w:t>
+            </w:r>
+          </w:p>
+        </w:tc>
+        <w:tc>
+          <w:tcPr>
+            <w:tcW w:type="dxa" w:w="1205"/>
+          </w:tcPr>
+          <w:p>
+            <w:pPr>
+              <w:spacing w:line="276" w:lineRule="auto" w:before="0" w:after="0"/>
+              <w:ind w:firstLine="0"/>
+              <w:jc w:val="center"/>
+            </w:pPr>
+            <w:r/>
+            <w:r>
+              <w:rPr>
+                <w:rFonts w:ascii="Times New Roman" w:hAnsi="Times New Roman" w:cs="Times New Roman" w:eastAsia="Times New Roman"/>
+                <w:b w:val="0"/>
+                <w:i w:val="0"/>
+                <w:sz w:val="24"/>
+              </w:rPr>
+              <w:t>+1,9%</w:t>
+            </w:r>
+          </w:p>
+        </w:tc>
+        <w:tc>
+          <w:tcPr>
+            <w:tcW w:type="dxa" w:w="1205"/>
+          </w:tcPr>
+          <w:p>
+            <w:pPr>
+              <w:spacing w:line="276" w:lineRule="auto" w:before="0" w:after="0"/>
+              <w:ind w:firstLine="0"/>
+              <w:jc w:val="center"/>
+            </w:pPr>
+            <w:r/>
+            <w:r>
+              <w:rPr>
+                <w:rFonts w:ascii="Times New Roman" w:hAnsi="Times New Roman" w:cs="Times New Roman" w:eastAsia="Times New Roman"/>
+                <w:b w:val="0"/>
+                <w:i w:val="0"/>
+                <w:sz w:val="24"/>
+              </w:rPr>
+              <w:t>−36,5%</w:t>
+            </w:r>
+          </w:p>
+        </w:tc>
+        <w:tc>
+          <w:tcPr>
+            <w:tcW w:type="dxa" w:w="1205"/>
+          </w:tcPr>
+          <w:p>
+            <w:pPr>
+              <w:spacing w:line="276" w:lineRule="auto" w:before="0" w:after="0"/>
+              <w:ind w:firstLine="0"/>
+              <w:jc w:val="center"/>
+            </w:pPr>
+            <w:r/>
+            <w:r>
+              <w:rPr>
+                <w:rFonts w:ascii="Times New Roman" w:hAnsi="Times New Roman" w:cs="Times New Roman" w:eastAsia="Times New Roman"/>
+                <w:b w:val="0"/>
+                <w:i w:val="0"/>
+                <w:sz w:val="24"/>
+              </w:rPr>
+              <w:t>1,35</w:t>
+            </w:r>
+          </w:p>
+        </w:tc>
+        <w:tc>
+          <w:tcPr>
+            <w:tcW w:type="dxa" w:w="1205"/>
+          </w:tcPr>
+          <w:p>
+            <w:pPr>
+              <w:spacing w:line="276" w:lineRule="auto" w:before="0" w:after="0"/>
+              <w:ind w:firstLine="0"/>
+              <w:jc w:val="center"/>
+            </w:pPr>
+            <w:r/>
+            <w:r>
+              <w:rPr>
+                <w:rFonts w:ascii="Times New Roman" w:hAnsi="Times New Roman" w:cs="Times New Roman" w:eastAsia="Times New Roman"/>
+                <w:b w:val="0"/>
+                <w:i w:val="0"/>
+                <w:sz w:val="24"/>
+              </w:rPr>
+              <w:t>50,0%</w:t>
+            </w:r>
+          </w:p>
+        </w:tc>
+        <w:tc>
+          <w:tcPr>
+            <w:tcW w:type="dxa" w:w="1205"/>
+          </w:tcPr>
+          <w:p>
+            <w:pPr>
+              <w:spacing w:line="276" w:lineRule="auto" w:before="0" w:after="0"/>
+              <w:ind w:firstLine="0"/>
+              <w:jc w:val="center"/>
+            </w:pPr>
+            <w:r/>
+            <w:r>
+              <w:rPr>
+                <w:rFonts w:ascii="Times New Roman" w:hAnsi="Times New Roman" w:cs="Times New Roman" w:eastAsia="Times New Roman"/>
+                <w:b w:val="0"/>
+                <w:i w:val="0"/>
+                <w:sz w:val="24"/>
+              </w:rPr>
+              <w:t>54,4%</w:t>
+            </w:r>
+          </w:p>
+        </w:tc>
+      </w:tr>
+    </w:tbl>
+    <w:p>
+      <w:pPr>
+        <w:spacing w:line="240" w:lineRule="auto" w:before="0" w:after="120"/>
+      </w:pPr>
+    </w:p>
+    <w:p>
+      <w:pPr>
+        <w:spacing w:line="360" w:lineRule="auto" w:before="0" w:after="0"/>
+        <w:ind w:firstLine="709"/>
+        <w:jc w:val="both"/>
+      </w:pPr>
+      <w:r>
+        <w:rPr>
+          <w:rFonts w:ascii="Times New Roman" w:hAnsi="Times New Roman" w:cs="Times New Roman" w:eastAsia="Times New Roman"/>
+          <w:b w:val="0"/>
+          <w:i w:val="0"/>
+          <w:sz w:val="28"/>
+        </w:rPr>
+        <w:t>Визуализация прогрессии Sharpe Ratio по экспериментам представлена на рисунке 4.1.</w:t>
+      </w:r>
+    </w:p>
+    <w:p>
+      <w:pPr>
+        <w:spacing w:line="240" w:lineRule="auto" w:before="240" w:after="0"/>
+        <w:ind w:firstLine="0"/>
+        <w:jc w:val="center"/>
+      </w:pPr>
+      <w:r>
+        <w:drawing>
+          <wp:inline xmlns:a="http://schemas.openxmlformats.org/drawingml/2006/main" xmlns:pic="http://schemas.openxmlformats.org/drawingml/2006/picture">
+            <wp:extent cx="5760000" cy="3365439"/>
+            <wp:docPr id="1" name="Picture 1"/>
+            <wp:cNvGraphicFramePr>
+              <a:graphicFrameLocks noChangeAspect="1"/>
+            </wp:cNvGraphicFramePr>
+            <a:graphic>
+              <a:graphicData uri="http://schemas.openxmlformats.org/drawingml/2006/picture">
+                <pic:pic>
+                  <pic:nvPicPr>
+                    <pic:cNvPr id="0" name="02_sharpe_progression.png"/>
+                    <pic:cNvPicPr/>
+                  </pic:nvPicPr>
+                  <pic:blipFill>
+                    <a:blip r:embed="rId9"/>
+                    <a:stretch>
+                      <a:fillRect/>
+                    </a:stretch>
+                  </pic:blipFill>
+                  <pic:spPr>
+                    <a:xfrm>
+                      <a:off x="0" y="0"/>
+                      <a:ext cx="5760000" cy="3365439"/>
+                    </a:xfrm>
+                    <a:prstGeom prst="rect"/>
+                  </pic:spPr>
+                </pic:pic>
+              </a:graphicData>
+            </a:graphic>
+          </wp:inline>
+        </w:drawing>
+      </w:r>
+    </w:p>
+    <w:p>
+      <w:pPr>
+        <w:spacing w:line="288" w:lineRule="auto" w:before="0" w:after="240"/>
+        <w:ind w:firstLine="0"/>
+        <w:jc w:val="center"/>
+      </w:pPr>
+      <w:r>
+        <w:rPr>
+          <w:rFonts w:ascii="Times New Roman" w:hAnsi="Times New Roman" w:cs="Times New Roman" w:eastAsia="Times New Roman"/>
+          <w:b w:val="0"/>
+          <w:i/>
+          <w:sz w:val="26"/>
+        </w:rPr>
+        <w:t>Рисунок 4.1 – Прогрессия Sharpe Ratio по экспериментам E1-E4. Зелёным выделен победитель E3b.</w:t>
+      </w:r>
+    </w:p>
+    <w:p>
+      <w:pPr>
+        <w:spacing w:line="360" w:lineRule="auto" w:before="0" w:after="0"/>
+        <w:ind w:firstLine="709"/>
+        <w:jc w:val="both"/>
+      </w:pPr>
+      <w:r>
+        <w:rPr>
+          <w:rFonts w:ascii="Times New Roman" w:hAnsi="Times New Roman" w:cs="Times New Roman" w:eastAsia="Times New Roman"/>
+          <w:b w:val="0"/>
+          <w:i w:val="0"/>
+          <w:sz w:val="28"/>
+        </w:rPr>
+        <w:t>Накопленные кривые доходности всех экспериментов в едином временном масштабе представлены на рисунке 4.2. Жирной зелёной линией выделен победивший эксперимент E3b.</w:t>
+      </w:r>
+    </w:p>
+    <w:p>
+      <w:pPr>
+        <w:spacing w:line="240" w:lineRule="auto" w:before="240" w:after="0"/>
+        <w:ind w:firstLine="0"/>
+        <w:jc w:val="center"/>
+      </w:pPr>
+      <w:r>
+        <w:drawing>
+          <wp:inline xmlns:a="http://schemas.openxmlformats.org/drawingml/2006/main" xmlns:pic="http://schemas.openxmlformats.org/drawingml/2006/picture">
+            <wp:extent cx="5760000" cy="2846419"/>
+            <wp:docPr id="2" name="Picture 2"/>
+            <wp:cNvGraphicFramePr>
+              <a:graphicFrameLocks noChangeAspect="1"/>
+            </wp:cNvGraphicFramePr>
+            <a:graphic>
+              <a:graphicData uri="http://schemas.openxmlformats.org/drawingml/2006/picture">
+                <pic:pic>
+                  <pic:nvPicPr>
+                    <pic:cNvPr id="0" name="01_equity_curves.png"/>
+                    <pic:cNvPicPr/>
+                  </pic:nvPicPr>
+                  <pic:blipFill>
+                    <a:blip r:embed="rId10"/>
+                    <a:stretch>
+                      <a:fillRect/>
+                    </a:stretch>
+                  </pic:blipFill>
+                  <pic:spPr>
+                    <a:xfrm>
+                      <a:off x="0" y="0"/>
+                      <a:ext cx="5760000" cy="2846419"/>
+                    </a:xfrm>
+                    <a:prstGeom prst="rect"/>
+                  </pic:spPr>
+                </pic:pic>
+              </a:graphicData>
+            </a:graphic>
+          </wp:inline>
+        </w:drawing>
+      </w:r>
+    </w:p>
+    <w:p>
+      <w:pPr>
+        <w:spacing w:line="288" w:lineRule="auto" w:before="0" w:after="240"/>
+        <w:ind w:firstLine="0"/>
+        <w:jc w:val="center"/>
+      </w:pPr>
+      <w:r>
+        <w:rPr>
+          <w:rFonts w:ascii="Times New Roman" w:hAnsi="Times New Roman" w:cs="Times New Roman" w:eastAsia="Times New Roman"/>
+          <w:b w:val="0"/>
+          <w:i/>
+          <w:sz w:val="26"/>
+        </w:rPr>
+        <w:t>Рисунок 4.2 – Накопленная доходность всех экспериментов на едином walk-forward периоде.</w:t>
+      </w:r>
+    </w:p>
+    <w:p>
+      <w:pPr>
+        <w:spacing w:line="360" w:lineRule="auto" w:before="0" w:after="0"/>
+        <w:ind w:firstLine="709"/>
+        <w:jc w:val="both"/>
+      </w:pPr>
+      <w:r>
+        <w:rPr>
+          <w:rFonts w:ascii="Times New Roman" w:hAnsi="Times New Roman" w:cs="Times New Roman" w:eastAsia="Times New Roman"/>
+          <w:b w:val="0"/>
+          <w:i w:val="0"/>
+          <w:sz w:val="28"/>
+        </w:rPr>
+        <w:t>Анализ результатов выявил четыре ключевых научных открытия.</w:t>
+      </w:r>
+    </w:p>
+    <w:p>
+      <w:pPr>
+        <w:spacing w:line="360" w:lineRule="auto" w:before="0" w:after="0"/>
+        <w:ind w:firstLine="709"/>
+        <w:jc w:val="both"/>
+      </w:pPr>
+      <w:r>
+        <w:rPr>
+          <w:rFonts w:ascii="Times New Roman" w:hAnsi="Times New Roman" w:cs="Times New Roman" w:eastAsia="Times New Roman"/>
+          <w:b w:val="0"/>
+          <w:i w:val="0"/>
+          <w:sz w:val="28"/>
+        </w:rPr>
+      </w:r>
+      <w:r>
+        <w:rPr>
+          <w:rFonts w:ascii="Times New Roman" w:hAnsi="Times New Roman" w:cs="Times New Roman" w:eastAsia="Times New Roman"/>
+          <w:b/>
+          <w:i w:val="0"/>
+          <w:sz w:val="28"/>
+        </w:rPr>
+        <w:t>Открытие 1: проклятие размерности.</w:t>
+      </w:r>
+      <w:r>
+        <w:rPr>
+          <w:rFonts w:ascii="Times New Roman" w:hAnsi="Times New Roman" w:cs="Times New Roman" w:eastAsia="Times New Roman"/>
+          <w:b w:val="0"/>
+          <w:i w:val="0"/>
+          <w:sz w:val="28"/>
+        </w:rPr>
+        <w:t xml:space="preserve"> Простое добавление признаков от родственных активов без отбора привело к ухудшению Sharpe Ratio с +0,459 (E1) до −0,248 (E2). Модель, получив 84 признака, начала переобучаться на шумовых паттернах. Это эмпирически подтверждает известный в литературе эффект curse of dimensionality.</w:t>
+      </w:r>
+    </w:p>
+    <w:p>
+      <w:pPr>
+        <w:spacing w:line="360" w:lineRule="auto" w:before="0" w:after="0"/>
+        <w:ind w:firstLine="709"/>
+        <w:jc w:val="both"/>
+      </w:pPr>
+      <w:r>
+        <w:rPr>
+          <w:rFonts w:ascii="Times New Roman" w:hAnsi="Times New Roman" w:cs="Times New Roman" w:eastAsia="Times New Roman"/>
+          <w:b w:val="0"/>
+          <w:i w:val="0"/>
+          <w:sz w:val="28"/>
+        </w:rPr>
+      </w:r>
+      <w:r>
+        <w:rPr>
+          <w:rFonts w:ascii="Times New Roman" w:hAnsi="Times New Roman" w:cs="Times New Roman" w:eastAsia="Times New Roman"/>
+          <w:b/>
+          <w:i w:val="0"/>
+          <w:sz w:val="28"/>
+        </w:rPr>
+        <w:t>Открытие 2: feature selection — необходимое условие.</w:t>
+      </w:r>
+      <w:r>
+        <w:rPr>
+          <w:rFonts w:ascii="Times New Roman" w:hAnsi="Times New Roman" w:cs="Times New Roman" w:eastAsia="Times New Roman"/>
+          <w:b w:val="0"/>
+          <w:i w:val="0"/>
+          <w:sz w:val="28"/>
+        </w:rPr>
+        <w:t xml:space="preserve"> Применение отбора признаков через mutual information (E2b) восстановило и превзошло baseline: Sharpe Ratio +0,580 при 25 отобранных признаках из 84 доступных. Это показывает, что cross-asset информация ценна, но требует методологически правильной обработки.</w:t>
+      </w:r>
+    </w:p>
+    <w:p>
+      <w:pPr>
+        <w:spacing w:line="360" w:lineRule="auto" w:before="0" w:after="0"/>
+        <w:ind w:firstLine="709"/>
+        <w:jc w:val="both"/>
+      </w:pPr>
+      <w:r>
+        <w:rPr>
+          <w:rFonts w:ascii="Times New Roman" w:hAnsi="Times New Roman" w:cs="Times New Roman" w:eastAsia="Times New Roman"/>
+          <w:b w:val="0"/>
+          <w:i w:val="0"/>
+          <w:sz w:val="28"/>
+        </w:rPr>
+      </w:r>
+      <w:r>
+        <w:rPr>
+          <w:rFonts w:ascii="Times New Roman" w:hAnsi="Times New Roman" w:cs="Times New Roman" w:eastAsia="Times New Roman"/>
+          <w:b/>
+          <w:i w:val="0"/>
+          <w:sz w:val="28"/>
+        </w:rPr>
+        <w:t>Открытие 3: макроэкономические признаки в текущей форме не помогают.</w:t>
+      </w:r>
+      <w:r>
+        <w:rPr>
+          <w:rFonts w:ascii="Times New Roman" w:hAnsi="Times New Roman" w:cs="Times New Roman" w:eastAsia="Times New Roman"/>
+          <w:b w:val="0"/>
+          <w:i w:val="0"/>
+          <w:sz w:val="28"/>
+        </w:rPr>
+        <w:t xml:space="preserve"> Добавление 18 макроиндикаторов (E3a) ухудшило Sharpe с +0,580 до +0,424. Объяснение: индикаторы разной частоты публикации (дневной, недельной, месячной) при forward-fill в дневную сетку создают синтетически гладкие признаки, которые модель использует как proxy для времени и переобучается на спорадические макрособытия. Это важный негативный результат, направляющий дальнейшие исследования к работе с потоковыми макроданными или специальными методами обработки разночастотных рядов.</w:t>
+      </w:r>
+    </w:p>
+    <w:p>
+      <w:pPr>
+        <w:spacing w:line="360" w:lineRule="auto" w:before="0" w:after="0"/>
+        <w:ind w:firstLine="709"/>
+        <w:jc w:val="both"/>
+      </w:pPr>
+      <w:r>
+        <w:rPr>
+          <w:rFonts w:ascii="Times New Roman" w:hAnsi="Times New Roman" w:cs="Times New Roman" w:eastAsia="Times New Roman"/>
+          <w:b w:val="0"/>
+          <w:i w:val="0"/>
+          <w:sz w:val="28"/>
+        </w:rPr>
+      </w:r>
+      <w:r>
+        <w:rPr>
+          <w:rFonts w:ascii="Times New Roman" w:hAnsi="Times New Roman" w:cs="Times New Roman" w:eastAsia="Times New Roman"/>
+          <w:b/>
+          <w:i w:val="0"/>
+          <w:sz w:val="28"/>
+        </w:rPr>
+        <w:t>Открытие 4: adaptive barriers — главный источник улучшения.</w:t>
+      </w:r>
+      <w:r>
+        <w:rPr>
+          <w:rFonts w:ascii="Times New Roman" w:hAnsi="Times New Roman" w:cs="Times New Roman" w:eastAsia="Times New Roman"/>
+          <w:b w:val="0"/>
+          <w:i w:val="0"/>
+          <w:sz w:val="28"/>
+        </w:rPr>
+        <w:t xml:space="preserve"> Замена фиксированных барьеров ±1,5 ATR на volatility-scaled адаптивные барьеры (E3b) дала прирост по всем ключевым метрикам: OOS accuracy выросла с 50,5% до 55,5% (+5 п.п.), annual return с +5,5% до +7,7% (+2,2 п.п.), max drawdown снизился с −31,3% до −17,9% (улучшение на 13,4 п.п.), win rate с 60,0% до 68,8% (+8,8 п.п.). Это самый сильный методологический результат работы.</w:t>
+      </w:r>
+    </w:p>
+    <w:p>
+      <w:pPr>
+        <w:spacing w:line="360" w:lineRule="auto" w:before="0" w:after="0"/>
+        <w:ind w:firstLine="709"/>
+        <w:jc w:val="both"/>
+      </w:pPr>
+      <w:r>
+        <w:rPr>
+          <w:rFonts w:ascii="Times New Roman" w:hAnsi="Times New Roman" w:cs="Times New Roman" w:eastAsia="Times New Roman"/>
+          <w:b w:val="0"/>
+          <w:i w:val="0"/>
+          <w:sz w:val="28"/>
+        </w:rPr>
+      </w:r>
+      <w:r>
+        <w:rPr>
+          <w:rFonts w:ascii="Times New Roman" w:hAnsi="Times New Roman" w:cs="Times New Roman" w:eastAsia="Times New Roman"/>
+          <w:b/>
+          <w:i w:val="0"/>
+          <w:sz w:val="28"/>
+        </w:rPr>
+        <w:t>Открытие 5: stacking ensemble не помог.</w:t>
+      </w:r>
+      <w:r>
+        <w:rPr>
+          <w:rFonts w:ascii="Times New Roman" w:hAnsi="Times New Roman" w:cs="Times New Roman" w:eastAsia="Times New Roman"/>
+          <w:b w:val="0"/>
+          <w:i w:val="0"/>
+          <w:sz w:val="28"/>
+        </w:rPr>
+        <w:t xml:space="preserve"> Объединение трёх моделей через мета-обучение (E4) ухудшило все метрики относительно одиночной модели E3b. Sharpe упал с 0,530 до 0,194, max drawdown увеличился до −36,5%. Причина — переобучение каждой из базовых моделей на ограниченной выборке (1 000 наблюдений в каждом фолде), что снижает diversity ансамбля. Этот результат эмпирически подтверждает принцип Оккама в финансовом машинном обучении: при ограниченных данных более простая модель часто превосходит более сложную.</w:t>
+      </w:r>
+    </w:p>
+    <w:p>
+      <w:pPr>
+        <w:spacing w:line="360" w:lineRule="auto" w:before="0" w:after="0"/>
+        <w:ind w:firstLine="709"/>
+        <w:jc w:val="both"/>
+      </w:pPr>
+      <w:r>
+        <w:rPr>
+          <w:rFonts w:ascii="Times New Roman" w:hAnsi="Times New Roman" w:cs="Times New Roman" w:eastAsia="Times New Roman"/>
+          <w:b w:val="0"/>
+          <w:i w:val="0"/>
+          <w:sz w:val="28"/>
+        </w:rPr>
+        <w:t>Многомерное сравнение четырёх ключевых моделей (E1, E2b, E3b, V25 базовая) представлено на рисунке 4.3.</w:t>
+      </w:r>
+    </w:p>
+    <w:p>
+      <w:pPr>
+        <w:spacing w:line="240" w:lineRule="auto" w:before="240" w:after="0"/>
+        <w:ind w:firstLine="0"/>
+        <w:jc w:val="center"/>
+      </w:pPr>
+      <w:r>
+        <w:drawing>
+          <wp:inline xmlns:a="http://schemas.openxmlformats.org/drawingml/2006/main" xmlns:pic="http://schemas.openxmlformats.org/drawingml/2006/picture">
+            <wp:extent cx="5760000" cy="4756468"/>
+            <wp:docPr id="3" name="Picture 3"/>
+            <wp:cNvGraphicFramePr>
+              <a:graphicFrameLocks noChangeAspect="1"/>
+            </wp:cNvGraphicFramePr>
+            <a:graphic>
+              <a:graphicData uri="http://schemas.openxmlformats.org/drawingml/2006/picture">
+                <pic:pic>
+                  <pic:nvPicPr>
+                    <pic:cNvPr id="0" name="03_metrics_radar.png"/>
+                    <pic:cNvPicPr/>
+                  </pic:nvPicPr>
+                  <pic:blipFill>
+                    <a:blip r:embed="rId11"/>
+                    <a:stretch>
+                      <a:fillRect/>
+                    </a:stretch>
+                  </pic:blipFill>
+                  <pic:spPr>
+                    <a:xfrm>
+                      <a:off x="0" y="0"/>
+                      <a:ext cx="5760000" cy="4756468"/>
+                    </a:xfrm>
+                    <a:prstGeom prst="rect"/>
+                  </pic:spPr>
+                </pic:pic>
+              </a:graphicData>
+            </a:graphic>
+          </wp:inline>
+        </w:drawing>
+      </w:r>
+    </w:p>
+    <w:p>
+      <w:pPr>
+        <w:spacing w:line="288" w:lineRule="auto" w:before="0" w:after="240"/>
+        <w:ind w:firstLine="0"/>
+        <w:jc w:val="center"/>
+      </w:pPr>
+      <w:r>
+        <w:rPr>
+          <w:rFonts w:ascii="Times New Roman" w:hAnsi="Times New Roman" w:cs="Times New Roman" w:eastAsia="Times New Roman"/>
+          <w:b w:val="0"/>
+          <w:i/>
+          <w:sz w:val="26"/>
+        </w:rPr>
+        <w:t>Рисунок 4.3 – Радарная диаграмма пяти метрик для четырёх моделей. Чем больше площадь — тем лучше.</w:t>
+      </w:r>
+    </w:p>
+    <w:p>
+      <w:pPr>
+        <w:spacing w:line="360" w:lineRule="auto" w:before="0" w:after="0"/>
+        <w:ind w:firstLine="709"/>
+        <w:jc w:val="both"/>
+      </w:pPr>
+      <w:r>
+        <w:rPr>
+          <w:rFonts w:ascii="Times New Roman" w:hAnsi="Times New Roman" w:cs="Times New Roman" w:eastAsia="Times New Roman"/>
+          <w:b w:val="0"/>
+          <w:i w:val="0"/>
+          <w:sz w:val="28"/>
+        </w:rPr>
+        <w:t>Сравнение накопленных просадок (drawdown underwater plot) показано на рисунке 4.4, демонстрируя превосходство E3b по риск-профилю.</w:t>
+      </w:r>
+    </w:p>
+    <w:p>
+      <w:pPr>
+        <w:spacing w:line="240" w:lineRule="auto" w:before="240" w:after="0"/>
+        <w:ind w:firstLine="0"/>
+        <w:jc w:val="center"/>
+      </w:pPr>
+      <w:r>
+        <w:drawing>
+          <wp:inline xmlns:a="http://schemas.openxmlformats.org/drawingml/2006/main" xmlns:pic="http://schemas.openxmlformats.org/drawingml/2006/picture">
+            <wp:extent cx="5760000" cy="2638534"/>
+            <wp:docPr id="4" name="Picture 4"/>
+            <wp:cNvGraphicFramePr>
+              <a:graphicFrameLocks noChangeAspect="1"/>
+            </wp:cNvGraphicFramePr>
+            <a:graphic>
+              <a:graphicData uri="http://schemas.openxmlformats.org/drawingml/2006/picture">
+                <pic:pic>
+                  <pic:nvPicPr>
+                    <pic:cNvPr id="0" name="05_drawdown_underwater.png"/>
+                    <pic:cNvPicPr/>
+                  </pic:nvPicPr>
+                  <pic:blipFill>
+                    <a:blip r:embed="rId12"/>
+                    <a:stretch>
+                      <a:fillRect/>
+                    </a:stretch>
+                  </pic:blipFill>
+                  <pic:spPr>
+                    <a:xfrm>
+                      <a:off x="0" y="0"/>
+                      <a:ext cx="5760000" cy="2638534"/>
+                    </a:xfrm>
+                    <a:prstGeom prst="rect"/>
+                  </pic:spPr>
+                </pic:pic>
+              </a:graphicData>
+            </a:graphic>
+          </wp:inline>
+        </w:drawing>
+      </w:r>
+    </w:p>
+    <w:p>
+      <w:pPr>
+        <w:spacing w:line="288" w:lineRule="auto" w:before="0" w:after="240"/>
+        <w:ind w:firstLine="0"/>
+        <w:jc w:val="center"/>
+      </w:pPr>
+      <w:r>
+        <w:rPr>
+          <w:rFonts w:ascii="Times New Roman" w:hAnsi="Times New Roman" w:cs="Times New Roman" w:eastAsia="Times New Roman"/>
+          <w:b w:val="0"/>
+          <w:i/>
+          <w:sz w:val="26"/>
+        </w:rPr>
+        <w:t>Рисунок 4.4 – Накопленные просадки экспериментов. Меньше площадь — лучше.</w:t>
+      </w:r>
+    </w:p>
+    <w:p>
+      <w:pPr>
+        <w:keepNext/>
+        <w:spacing w:line="360" w:lineRule="auto" w:before="240" w:after="120"/>
+        <w:ind w:firstLine="709"/>
+        <w:jc w:val="left"/>
+      </w:pPr>
+      <w:r>
+        <w:rPr>
+          <w:rFonts w:ascii="Times New Roman" w:hAnsi="Times New Roman" w:cs="Times New Roman" w:eastAsia="Times New Roman"/>
+          <w:b/>
+          <w:i w:val="0"/>
+          <w:sz w:val="28"/>
+        </w:rPr>
+        <w:t>4.5 Финальная модель E3b: характеристики и feature importance</w:t>
+      </w:r>
+    </w:p>
+    <w:p>
+      <w:pPr>
+        <w:spacing w:line="360" w:lineRule="auto" w:before="0" w:after="0"/>
+        <w:ind w:firstLine="709"/>
+        <w:jc w:val="both"/>
+      </w:pPr>
+      <w:r>
+        <w:rPr>
+          <w:rFonts w:ascii="Times New Roman" w:hAnsi="Times New Roman" w:cs="Times New Roman" w:eastAsia="Times New Roman"/>
+          <w:b w:val="0"/>
+          <w:i w:val="0"/>
+          <w:sz w:val="28"/>
+        </w:rPr>
+        <w:t>По результатам сравнительного анализа в качестве финальной модели был выбран эксперимент E3b, объединяющий cross-asset признаки, отбор через mutual information и volatility-scaled адаптивные барьеры. Полная характеристика модели:</w:t>
+      </w:r>
+    </w:p>
+    <w:p>
+      <w:pPr>
+        <w:spacing w:line="360" w:lineRule="auto" w:before="0" w:after="0"/>
+        <w:ind w:firstLine="709"/>
+        <w:jc w:val="both"/>
+      </w:pPr>
+      <w:r>
+        <w:rPr>
+          <w:rFonts w:ascii="Times New Roman" w:hAnsi="Times New Roman" w:cs="Times New Roman" w:eastAsia="Times New Roman"/>
+          <w:b w:val="0"/>
+          <w:i w:val="0"/>
+          <w:sz w:val="28"/>
+        </w:rPr>
+        <w:t>– 102 признака в пуле, 30 отобранных на каждом фолде через mutual information;</w:t>
+      </w:r>
+    </w:p>
+    <w:p>
+      <w:pPr>
+        <w:spacing w:line="360" w:lineRule="auto" w:before="0" w:after="0"/>
+        <w:ind w:firstLine="709"/>
+        <w:jc w:val="both"/>
+      </w:pPr>
+      <w:r>
+        <w:rPr>
+          <w:rFonts w:ascii="Times New Roman" w:hAnsi="Times New Roman" w:cs="Times New Roman" w:eastAsia="Times New Roman"/>
+          <w:b w:val="0"/>
+          <w:i w:val="0"/>
+          <w:sz w:val="28"/>
+        </w:rPr>
+        <w:t>– 5 базовых металлов (silver, gold, platinum, palladium, copper);</w:t>
+      </w:r>
+    </w:p>
+    <w:p>
+      <w:pPr>
+        <w:spacing w:line="360" w:lineRule="auto" w:before="0" w:after="0"/>
+        <w:ind w:firstLine="709"/>
+        <w:jc w:val="both"/>
+      </w:pPr>
+      <w:r>
+        <w:rPr>
+          <w:rFonts w:ascii="Times New Roman" w:hAnsi="Times New Roman" w:cs="Times New Roman" w:eastAsia="Times New Roman"/>
+          <w:b w:val="0"/>
+          <w:i w:val="0"/>
+          <w:sz w:val="28"/>
+        </w:rPr>
+        <w:t>– Triple barrier с адаптивными порогами, зависящими от текущей реализованной волатильности и рыночного режима (ADX и наклон 50-дневной MA);</w:t>
+      </w:r>
+    </w:p>
+    <w:p>
+      <w:pPr>
+        <w:spacing w:line="360" w:lineRule="auto" w:before="0" w:after="0"/>
+        <w:ind w:firstLine="709"/>
+        <w:jc w:val="both"/>
+      </w:pPr>
+      <w:r>
+        <w:rPr>
+          <w:rFonts w:ascii="Times New Roman" w:hAnsi="Times New Roman" w:cs="Times New Roman" w:eastAsia="Times New Roman"/>
+          <w:b w:val="0"/>
+          <w:i w:val="0"/>
+          <w:sz w:val="28"/>
+        </w:rPr>
+        <w:t>– Walk-forward валидация на 10,3 года с 1000-дневным sliding window;</w:t>
+      </w:r>
+    </w:p>
+    <w:p>
+      <w:pPr>
+        <w:spacing w:line="360" w:lineRule="auto" w:before="0" w:after="0"/>
+        <w:ind w:firstLine="709"/>
+        <w:jc w:val="both"/>
+      </w:pPr>
+      <w:r>
+        <w:rPr>
+          <w:rFonts w:ascii="Times New Roman" w:hAnsi="Times New Roman" w:cs="Times New Roman" w:eastAsia="Times New Roman"/>
+          <w:b w:val="0"/>
+          <w:i w:val="0"/>
+          <w:sz w:val="28"/>
+        </w:rPr>
+        <w:t>– HistGradientBoostingClassifier с параметрами: max_depth=6, learning_rate=0,05, max_iter=200, min_samples_leaf=30.</w:t>
+      </w:r>
+    </w:p>
+    <w:p>
+      <w:pPr>
+        <w:spacing w:line="360" w:lineRule="auto" w:before="0" w:after="0"/>
+        <w:ind w:firstLine="709"/>
+        <w:jc w:val="both"/>
+      </w:pPr>
+      <w:r>
+        <w:rPr>
+          <w:rFonts w:ascii="Times New Roman" w:hAnsi="Times New Roman" w:cs="Times New Roman" w:eastAsia="Times New Roman"/>
+          <w:b w:val="0"/>
+          <w:i w:val="0"/>
+          <w:sz w:val="28"/>
+        </w:rPr>
+        <w:t>Анализ частоты отбора признаков показал, что наиболее устойчиво модель выбирает cross-asset волатильность и корреляции (рисунок 4.5).</w:t>
+      </w:r>
+    </w:p>
+    <w:p>
+      <w:pPr>
+        <w:spacing w:line="240" w:lineRule="auto" w:before="240" w:after="0"/>
+        <w:ind w:firstLine="0"/>
+        <w:jc w:val="center"/>
+      </w:pPr>
+      <w:r>
+        <w:drawing>
+          <wp:inline xmlns:a="http://schemas.openxmlformats.org/drawingml/2006/main" xmlns:pic="http://schemas.openxmlformats.org/drawingml/2006/picture">
+            <wp:extent cx="5760000" cy="5153921"/>
+            <wp:docPr id="5" name="Picture 5"/>
+            <wp:cNvGraphicFramePr>
+              <a:graphicFrameLocks noChangeAspect="1"/>
+            </wp:cNvGraphicFramePr>
+            <a:graphic>
+              <a:graphicData uri="http://schemas.openxmlformats.org/drawingml/2006/picture">
+                <pic:pic>
+                  <pic:nvPicPr>
+                    <pic:cNvPr id="0" name="06_feature_importance.png"/>
+                    <pic:cNvPicPr/>
+                  </pic:nvPicPr>
+                  <pic:blipFill>
+                    <a:blip r:embed="rId13"/>
+                    <a:stretch>
+                      <a:fillRect/>
+                    </a:stretch>
+                  </pic:blipFill>
+                  <pic:spPr>
+                    <a:xfrm>
+                      <a:off x="0" y="0"/>
+                      <a:ext cx="5760000" cy="5153921"/>
+                    </a:xfrm>
+                    <a:prstGeom prst="rect"/>
+                  </pic:spPr>
+                </pic:pic>
+              </a:graphicData>
+            </a:graphic>
+          </wp:inline>
+        </w:drawing>
+      </w:r>
+    </w:p>
+    <w:p>
+      <w:pPr>
+        <w:spacing w:line="288" w:lineRule="auto" w:before="0" w:after="240"/>
+        <w:ind w:firstLine="0"/>
+        <w:jc w:val="center"/>
+      </w:pPr>
+      <w:r>
+        <w:rPr>
+          <w:rFonts w:ascii="Times New Roman" w:hAnsi="Times New Roman" w:cs="Times New Roman" w:eastAsia="Times New Roman"/>
+          <w:b w:val="0"/>
+          <w:i/>
+          <w:sz w:val="26"/>
+        </w:rPr>
+        <w:t>Рисунок 4.5 – Топ-25 признаков финальной модели по частоте отбора в фолдах walk-forward.</w:t>
+      </w:r>
+    </w:p>
+    <w:p>
+      <w:pPr>
+        <w:keepNext/>
+        <w:spacing w:line="360" w:lineRule="auto" w:before="120" w:after="80"/>
+        <w:ind w:firstLine="0"/>
+        <w:jc w:val="left"/>
+      </w:pPr>
+      <w:r>
+        <w:rPr>
+          <w:rFonts w:ascii="Times New Roman" w:hAnsi="Times New Roman" w:cs="Times New Roman" w:eastAsia="Times New Roman"/>
+          <w:b w:val="0"/>
+          <w:i w:val="0"/>
+          <w:sz w:val="28"/>
+        </w:rPr>
+        <w:t>Таблица 4.2 – Топ-10 признаков финальной модели</w:t>
+      </w:r>
+    </w:p>
+    <w:tbl>
+      <w:tblPr>
+        <w:tblStyle w:val="TableGrid"/>
+        <w:tblW w:type="auto" w:w="0"/>
+        <w:jc w:val="center"/>
+        <w:tblLook w:firstColumn="1" w:firstRow="1" w:lastColumn="0" w:lastRow="0" w:noHBand="0" w:noVBand="1" w:val="04A0"/>
+      </w:tblPr>
+      <w:tblGrid>
+        <w:gridCol w:w="3213"/>
+        <w:gridCol w:w="3213"/>
+        <w:gridCol w:w="3213"/>
+      </w:tblGrid>
+      <w:tr>
+        <w:tc>
+          <w:tcPr>
+            <w:tcW w:type="dxa" w:w="3213"/>
+          </w:tcPr>
+          <w:p>
+            <w:pPr>
+              <w:spacing w:line="276" w:lineRule="auto" w:before="0" w:after="0"/>
+              <w:ind w:firstLine="0"/>
+              <w:jc w:val="center"/>
+            </w:pPr>
+            <w:r/>
+            <w:r>
+              <w:rPr>
+                <w:rFonts w:ascii="Times New Roman" w:hAnsi="Times New Roman" w:cs="Times New Roman" w:eastAsia="Times New Roman"/>
+                <w:b/>
+                <w:i w:val="0"/>
+                <w:sz w:val="24"/>
+              </w:rPr>
+              <w:t>Признак</w:t>
+            </w:r>
+          </w:p>
+        </w:tc>
+        <w:tc>
+          <w:tcPr>
+            <w:tcW w:type="dxa" w:w="3213"/>
+          </w:tcPr>
+          <w:p>
+            <w:pPr>
+              <w:spacing w:line="276" w:lineRule="auto" w:before="0" w:after="0"/>
+              <w:ind w:firstLine="0"/>
+              <w:jc w:val="center"/>
+            </w:pPr>
+            <w:r/>
+            <w:r>
+              <w:rPr>
+                <w:rFonts w:ascii="Times New Roman" w:hAnsi="Times New Roman" w:cs="Times New Roman" w:eastAsia="Times New Roman"/>
+                <w:b/>
+                <w:i w:val="0"/>
+                <w:sz w:val="24"/>
+              </w:rPr>
+              <w:t>Частота отбора</w:t>
+            </w:r>
+          </w:p>
+        </w:tc>
+        <w:tc>
+          <w:tcPr>
+            <w:tcW w:type="dxa" w:w="3213"/>
+          </w:tcPr>
+          <w:p>
+            <w:pPr>
+              <w:spacing w:line="276" w:lineRule="auto" w:before="0" w:after="0"/>
+              <w:ind w:firstLine="0"/>
+              <w:jc w:val="center"/>
+            </w:pPr>
+            <w:r/>
+            <w:r>
+              <w:rPr>
+                <w:rFonts w:ascii="Times New Roman" w:hAnsi="Times New Roman" w:cs="Times New Roman" w:eastAsia="Times New Roman"/>
+                <w:b/>
+                <w:i w:val="0"/>
+                <w:sz w:val="24"/>
+              </w:rPr>
+              <w:t>Интерпретация</w:t>
+            </w:r>
+          </w:p>
+        </w:tc>
+      </w:tr>
+      <w:tr>
+        <w:tc>
+          <w:tcPr>
+            <w:tcW w:type="dxa" w:w="3213"/>
+          </w:tcPr>
+          <w:p>
+            <w:pPr>
+              <w:spacing w:line="276" w:lineRule="auto" w:before="0" w:after="0"/>
+              <w:ind w:firstLine="0"/>
+              <w:jc w:val="left"/>
+            </w:pPr>
+            <w:r/>
+            <w:r>
+              <w:rPr>
+                <w:rFonts w:ascii="Times New Roman" w:hAnsi="Times New Roman" w:cs="Times New Roman" w:eastAsia="Times New Roman"/>
+                <w:b w:val="0"/>
+                <w:i w:val="0"/>
+                <w:sz w:val="24"/>
+              </w:rPr>
+              <w:t>gold_rvol_60</w:t>
+            </w:r>
+          </w:p>
+        </w:tc>
+        <w:tc>
+          <w:tcPr>
+            <w:tcW w:type="dxa" w:w="3213"/>
+          </w:tcPr>
+          <w:p>
+            <w:pPr>
+              <w:spacing w:line="276" w:lineRule="auto" w:before="0" w:after="0"/>
+              <w:ind w:firstLine="0"/>
+              <w:jc w:val="center"/>
+            </w:pPr>
+            <w:r/>
+            <w:r>
+              <w:rPr>
+                <w:rFonts w:ascii="Times New Roman" w:hAnsi="Times New Roman" w:cs="Times New Roman" w:eastAsia="Times New Roman"/>
+                <w:b w:val="0"/>
+                <w:i w:val="0"/>
+                <w:sz w:val="24"/>
+              </w:rPr>
+              <w:t>100%</w:t>
+            </w:r>
+          </w:p>
+        </w:tc>
+        <w:tc>
+          <w:tcPr>
+            <w:tcW w:type="dxa" w:w="3213"/>
+          </w:tcPr>
+          <w:p>
+            <w:pPr>
+              <w:spacing w:line="276" w:lineRule="auto" w:before="0" w:after="0"/>
+              <w:ind w:firstLine="0"/>
+              <w:jc w:val="center"/>
+            </w:pPr>
+            <w:r/>
+            <w:r>
+              <w:rPr>
+                <w:rFonts w:ascii="Times New Roman" w:hAnsi="Times New Roman" w:cs="Times New Roman" w:eastAsia="Times New Roman"/>
+                <w:b w:val="0"/>
+                <w:i w:val="0"/>
+                <w:sz w:val="24"/>
+              </w:rPr>
+              <w:t>Долгосрочная волатильность золота</w:t>
+            </w:r>
+          </w:p>
+        </w:tc>
+      </w:tr>
+      <w:tr>
+        <w:tc>
+          <w:tcPr>
+            <w:tcW w:type="dxa" w:w="3213"/>
+          </w:tcPr>
+          <w:p>
+            <w:pPr>
+              <w:spacing w:line="276" w:lineRule="auto" w:before="0" w:after="0"/>
+              <w:ind w:firstLine="0"/>
+              <w:jc w:val="left"/>
+            </w:pPr>
+            <w:r/>
+            <w:r>
+              <w:rPr>
+                <w:rFonts w:ascii="Times New Roman" w:hAnsi="Times New Roman" w:cs="Times New Roman" w:eastAsia="Times New Roman"/>
+                <w:b w:val="0"/>
+                <w:i w:val="0"/>
+                <w:sz w:val="24"/>
+              </w:rPr>
+              <w:t>silver_rvol_60</w:t>
+            </w:r>
+          </w:p>
+        </w:tc>
+        <w:tc>
+          <w:tcPr>
+            <w:tcW w:type="dxa" w:w="3213"/>
+          </w:tcPr>
+          <w:p>
+            <w:pPr>
+              <w:spacing w:line="276" w:lineRule="auto" w:before="0" w:after="0"/>
+              <w:ind w:firstLine="0"/>
+              <w:jc w:val="center"/>
+            </w:pPr>
+            <w:r/>
+            <w:r>
+              <w:rPr>
+                <w:rFonts w:ascii="Times New Roman" w:hAnsi="Times New Roman" w:cs="Times New Roman" w:eastAsia="Times New Roman"/>
+                <w:b w:val="0"/>
+                <w:i w:val="0"/>
+                <w:sz w:val="24"/>
+              </w:rPr>
+              <w:t>100%</w:t>
+            </w:r>
+          </w:p>
+        </w:tc>
+        <w:tc>
+          <w:tcPr>
+            <w:tcW w:type="dxa" w:w="3213"/>
+          </w:tcPr>
+          <w:p>
+            <w:pPr>
+              <w:spacing w:line="276" w:lineRule="auto" w:before="0" w:after="0"/>
+              <w:ind w:firstLine="0"/>
+              <w:jc w:val="center"/>
+            </w:pPr>
+            <w:r/>
+            <w:r>
+              <w:rPr>
+                <w:rFonts w:ascii="Times New Roman" w:hAnsi="Times New Roman" w:cs="Times New Roman" w:eastAsia="Times New Roman"/>
+                <w:b w:val="0"/>
+                <w:i w:val="0"/>
+                <w:sz w:val="24"/>
+              </w:rPr>
+              <w:t>Долгосрочная волатильность серебра</w:t>
+            </w:r>
+          </w:p>
+        </w:tc>
+      </w:tr>
+      <w:tr>
+        <w:tc>
+          <w:tcPr>
+            <w:tcW w:type="dxa" w:w="3213"/>
+          </w:tcPr>
+          <w:p>
+            <w:pPr>
+              <w:spacing w:line="276" w:lineRule="auto" w:before="0" w:after="0"/>
+              <w:ind w:firstLine="0"/>
+              <w:jc w:val="left"/>
+            </w:pPr>
+            <w:r/>
+            <w:r>
+              <w:rPr>
+                <w:rFonts w:ascii="Times New Roman" w:hAnsi="Times New Roman" w:cs="Times New Roman" w:eastAsia="Times New Roman"/>
+                <w:b w:val="0"/>
+                <w:i w:val="0"/>
+                <w:sz w:val="24"/>
+              </w:rPr>
+              <w:t>palladium_vol_z</w:t>
+            </w:r>
+          </w:p>
+        </w:tc>
+        <w:tc>
+          <w:tcPr>
+            <w:tcW w:type="dxa" w:w="3213"/>
+          </w:tcPr>
+          <w:p>
+            <w:pPr>
+              <w:spacing w:line="276" w:lineRule="auto" w:before="0" w:after="0"/>
+              <w:ind w:firstLine="0"/>
+              <w:jc w:val="center"/>
+            </w:pPr>
+            <w:r/>
+            <w:r>
+              <w:rPr>
+                <w:rFonts w:ascii="Times New Roman" w:hAnsi="Times New Roman" w:cs="Times New Roman" w:eastAsia="Times New Roman"/>
+                <w:b w:val="0"/>
+                <w:i w:val="0"/>
+                <w:sz w:val="24"/>
+              </w:rPr>
+              <w:t>100%</w:t>
+            </w:r>
+          </w:p>
+        </w:tc>
+        <w:tc>
+          <w:tcPr>
+            <w:tcW w:type="dxa" w:w="3213"/>
+          </w:tcPr>
+          <w:p>
+            <w:pPr>
+              <w:spacing w:line="276" w:lineRule="auto" w:before="0" w:after="0"/>
+              <w:ind w:firstLine="0"/>
+              <w:jc w:val="center"/>
+            </w:pPr>
+            <w:r/>
+            <w:r>
+              <w:rPr>
+                <w:rFonts w:ascii="Times New Roman" w:hAnsi="Times New Roman" w:cs="Times New Roman" w:eastAsia="Times New Roman"/>
+                <w:b w:val="0"/>
+                <w:i w:val="0"/>
+                <w:sz w:val="24"/>
+              </w:rPr>
+              <w:t>Z-score объёма палладия</w:t>
+            </w:r>
+          </w:p>
+        </w:tc>
+      </w:tr>
+      <w:tr>
+        <w:tc>
+          <w:tcPr>
+            <w:tcW w:type="dxa" w:w="3213"/>
+          </w:tcPr>
+          <w:p>
+            <w:pPr>
+              <w:spacing w:line="276" w:lineRule="auto" w:before="0" w:after="0"/>
+              <w:ind w:firstLine="0"/>
+              <w:jc w:val="left"/>
+            </w:pPr>
+            <w:r/>
+            <w:r>
+              <w:rPr>
+                <w:rFonts w:ascii="Times New Roman" w:hAnsi="Times New Roman" w:cs="Times New Roman" w:eastAsia="Times New Roman"/>
+                <w:b w:val="0"/>
+                <w:i w:val="0"/>
+                <w:sz w:val="24"/>
+              </w:rPr>
+              <w:t>copper_rvol_60</w:t>
+            </w:r>
+          </w:p>
+        </w:tc>
+        <w:tc>
+          <w:tcPr>
+            <w:tcW w:type="dxa" w:w="3213"/>
+          </w:tcPr>
+          <w:p>
+            <w:pPr>
+              <w:spacing w:line="276" w:lineRule="auto" w:before="0" w:after="0"/>
+              <w:ind w:firstLine="0"/>
+              <w:jc w:val="center"/>
+            </w:pPr>
+            <w:r/>
+            <w:r>
+              <w:rPr>
+                <w:rFonts w:ascii="Times New Roman" w:hAnsi="Times New Roman" w:cs="Times New Roman" w:eastAsia="Times New Roman"/>
+                <w:b w:val="0"/>
+                <w:i w:val="0"/>
+                <w:sz w:val="24"/>
+              </w:rPr>
+              <w:t>100%</w:t>
+            </w:r>
+          </w:p>
+        </w:tc>
+        <w:tc>
+          <w:tcPr>
+            <w:tcW w:type="dxa" w:w="3213"/>
+          </w:tcPr>
+          <w:p>
+            <w:pPr>
+              <w:spacing w:line="276" w:lineRule="auto" w:before="0" w:after="0"/>
+              <w:ind w:firstLine="0"/>
+              <w:jc w:val="center"/>
+            </w:pPr>
+            <w:r/>
+            <w:r>
+              <w:rPr>
+                <w:rFonts w:ascii="Times New Roman" w:hAnsi="Times New Roman" w:cs="Times New Roman" w:eastAsia="Times New Roman"/>
+                <w:b w:val="0"/>
+                <w:i w:val="0"/>
+                <w:sz w:val="24"/>
+              </w:rPr>
+              <w:t>Долгосрочная волатильность меди</w:t>
+            </w:r>
+          </w:p>
+        </w:tc>
+      </w:tr>
+      <w:tr>
+        <w:tc>
+          <w:tcPr>
+            <w:tcW w:type="dxa" w:w="3213"/>
+          </w:tcPr>
+          <w:p>
+            <w:pPr>
+              <w:spacing w:line="276" w:lineRule="auto" w:before="0" w:after="0"/>
+              <w:ind w:firstLine="0"/>
+              <w:jc w:val="left"/>
+            </w:pPr>
+            <w:r/>
+            <w:r>
+              <w:rPr>
+                <w:rFonts w:ascii="Times New Roman" w:hAnsi="Times New Roman" w:cs="Times New Roman" w:eastAsia="Times New Roman"/>
+                <w:b w:val="0"/>
+                <w:i w:val="0"/>
+                <w:sz w:val="24"/>
+              </w:rPr>
+              <w:t>palladium_rvol_60</w:t>
+            </w:r>
+          </w:p>
+        </w:tc>
+        <w:tc>
+          <w:tcPr>
+            <w:tcW w:type="dxa" w:w="3213"/>
+          </w:tcPr>
+          <w:p>
+            <w:pPr>
+              <w:spacing w:line="276" w:lineRule="auto" w:before="0" w:after="0"/>
+              <w:ind w:firstLine="0"/>
+              <w:jc w:val="center"/>
+            </w:pPr>
+            <w:r/>
+            <w:r>
+              <w:rPr>
+                <w:rFonts w:ascii="Times New Roman" w:hAnsi="Times New Roman" w:cs="Times New Roman" w:eastAsia="Times New Roman"/>
+                <w:b w:val="0"/>
+                <w:i w:val="0"/>
+                <w:sz w:val="24"/>
+              </w:rPr>
+              <w:t>100%</w:t>
+            </w:r>
+          </w:p>
+        </w:tc>
+        <w:tc>
+          <w:tcPr>
+            <w:tcW w:type="dxa" w:w="3213"/>
+          </w:tcPr>
+          <w:p>
+            <w:pPr>
+              <w:spacing w:line="276" w:lineRule="auto" w:before="0" w:after="0"/>
+              <w:ind w:firstLine="0"/>
+              <w:jc w:val="center"/>
+            </w:pPr>
+            <w:r/>
+            <w:r>
+              <w:rPr>
+                <w:rFonts w:ascii="Times New Roman" w:hAnsi="Times New Roman" w:cs="Times New Roman" w:eastAsia="Times New Roman"/>
+                <w:b w:val="0"/>
+                <w:i w:val="0"/>
+                <w:sz w:val="24"/>
+              </w:rPr>
+              <w:t>Долгосрочная волатильность палладия</w:t>
+            </w:r>
+          </w:p>
+        </w:tc>
+      </w:tr>
+      <w:tr>
+        <w:tc>
+          <w:tcPr>
+            <w:tcW w:type="dxa" w:w="3213"/>
+          </w:tcPr>
+          <w:p>
+            <w:pPr>
+              <w:spacing w:line="276" w:lineRule="auto" w:before="0" w:after="0"/>
+              <w:ind w:firstLine="0"/>
+              <w:jc w:val="left"/>
+            </w:pPr>
+            <w:r/>
+            <w:r>
+              <w:rPr>
+                <w:rFonts w:ascii="Times New Roman" w:hAnsi="Times New Roman" w:cs="Times New Roman" w:eastAsia="Times New Roman"/>
+                <w:b w:val="0"/>
+                <w:i w:val="0"/>
+                <w:sz w:val="24"/>
+              </w:rPr>
+              <w:t>corr_silver_gold_90</w:t>
+            </w:r>
+          </w:p>
+        </w:tc>
+        <w:tc>
+          <w:tcPr>
+            <w:tcW w:type="dxa" w:w="3213"/>
+          </w:tcPr>
+          <w:p>
+            <w:pPr>
+              <w:spacing w:line="276" w:lineRule="auto" w:before="0" w:after="0"/>
+              <w:ind w:firstLine="0"/>
+              <w:jc w:val="center"/>
+            </w:pPr>
+            <w:r/>
+            <w:r>
+              <w:rPr>
+                <w:rFonts w:ascii="Times New Roman" w:hAnsi="Times New Roman" w:cs="Times New Roman" w:eastAsia="Times New Roman"/>
+                <w:b w:val="0"/>
+                <w:i w:val="0"/>
+                <w:sz w:val="24"/>
+              </w:rPr>
+              <w:t>99%</w:t>
+            </w:r>
+          </w:p>
+        </w:tc>
+        <w:tc>
+          <w:tcPr>
+            <w:tcW w:type="dxa" w:w="3213"/>
+          </w:tcPr>
+          <w:p>
+            <w:pPr>
+              <w:spacing w:line="276" w:lineRule="auto" w:before="0" w:after="0"/>
+              <w:ind w:firstLine="0"/>
+              <w:jc w:val="center"/>
+            </w:pPr>
+            <w:r/>
+            <w:r>
+              <w:rPr>
+                <w:rFonts w:ascii="Times New Roman" w:hAnsi="Times New Roman" w:cs="Times New Roman" w:eastAsia="Times New Roman"/>
+                <w:b w:val="0"/>
+                <w:i w:val="0"/>
+                <w:sz w:val="24"/>
+              </w:rPr>
+              <w:t>90-дневная корреляция silver-gold</w:t>
+            </w:r>
+          </w:p>
+        </w:tc>
+      </w:tr>
+      <w:tr>
+        <w:tc>
+          <w:tcPr>
+            <w:tcW w:type="dxa" w:w="3213"/>
+          </w:tcPr>
+          <w:p>
+            <w:pPr>
+              <w:spacing w:line="276" w:lineRule="auto" w:before="0" w:after="0"/>
+              <w:ind w:firstLine="0"/>
+              <w:jc w:val="left"/>
+            </w:pPr>
+            <w:r/>
+            <w:r>
+              <w:rPr>
+                <w:rFonts w:ascii="Times New Roman" w:hAnsi="Times New Roman" w:cs="Times New Roman" w:eastAsia="Times New Roman"/>
+                <w:b w:val="0"/>
+                <w:i w:val="0"/>
+                <w:sz w:val="24"/>
+              </w:rPr>
+              <w:t>platinum_vol_z</w:t>
+            </w:r>
+          </w:p>
+        </w:tc>
+        <w:tc>
+          <w:tcPr>
+            <w:tcW w:type="dxa" w:w="3213"/>
+          </w:tcPr>
+          <w:p>
+            <w:pPr>
+              <w:spacing w:line="276" w:lineRule="auto" w:before="0" w:after="0"/>
+              <w:ind w:firstLine="0"/>
+              <w:jc w:val="center"/>
+            </w:pPr>
+            <w:r/>
+            <w:r>
+              <w:rPr>
+                <w:rFonts w:ascii="Times New Roman" w:hAnsi="Times New Roman" w:cs="Times New Roman" w:eastAsia="Times New Roman"/>
+                <w:b w:val="0"/>
+                <w:i w:val="0"/>
+                <w:sz w:val="24"/>
+              </w:rPr>
+              <w:t>97%</w:t>
+            </w:r>
+          </w:p>
+        </w:tc>
+        <w:tc>
+          <w:tcPr>
+            <w:tcW w:type="dxa" w:w="3213"/>
+          </w:tcPr>
+          <w:p>
+            <w:pPr>
+              <w:spacing w:line="276" w:lineRule="auto" w:before="0" w:after="0"/>
+              <w:ind w:firstLine="0"/>
+              <w:jc w:val="center"/>
+            </w:pPr>
+            <w:r/>
+            <w:r>
+              <w:rPr>
+                <w:rFonts w:ascii="Times New Roman" w:hAnsi="Times New Roman" w:cs="Times New Roman" w:eastAsia="Times New Roman"/>
+                <w:b w:val="0"/>
+                <w:i w:val="0"/>
+                <w:sz w:val="24"/>
+              </w:rPr>
+              <w:t>Z-score объёма платины</w:t>
+            </w:r>
+          </w:p>
+        </w:tc>
+      </w:tr>
+      <w:tr>
+        <w:tc>
+          <w:tcPr>
+            <w:tcW w:type="dxa" w:w="3213"/>
+          </w:tcPr>
+          <w:p>
+            <w:pPr>
+              <w:spacing w:line="276" w:lineRule="auto" w:before="0" w:after="0"/>
+              <w:ind w:firstLine="0"/>
+              <w:jc w:val="left"/>
+            </w:pPr>
+            <w:r/>
+            <w:r>
+              <w:rPr>
+                <w:rFonts w:ascii="Times New Roman" w:hAnsi="Times New Roman" w:cs="Times New Roman" w:eastAsia="Times New Roman"/>
+                <w:b w:val="0"/>
+                <w:i w:val="0"/>
+                <w:sz w:val="24"/>
+              </w:rPr>
+              <w:t>platinum_rvol_60</w:t>
+            </w:r>
+          </w:p>
+        </w:tc>
+        <w:tc>
+          <w:tcPr>
+            <w:tcW w:type="dxa" w:w="3213"/>
+          </w:tcPr>
+          <w:p>
+            <w:pPr>
+              <w:spacing w:line="276" w:lineRule="auto" w:before="0" w:after="0"/>
+              <w:ind w:firstLine="0"/>
+              <w:jc w:val="center"/>
+            </w:pPr>
+            <w:r/>
+            <w:r>
+              <w:rPr>
+                <w:rFonts w:ascii="Times New Roman" w:hAnsi="Times New Roman" w:cs="Times New Roman" w:eastAsia="Times New Roman"/>
+                <w:b w:val="0"/>
+                <w:i w:val="0"/>
+                <w:sz w:val="24"/>
+              </w:rPr>
+              <w:t>96%</w:t>
+            </w:r>
+          </w:p>
+        </w:tc>
+        <w:tc>
+          <w:tcPr>
+            <w:tcW w:type="dxa" w:w="3213"/>
+          </w:tcPr>
+          <w:p>
+            <w:pPr>
+              <w:spacing w:line="276" w:lineRule="auto" w:before="0" w:after="0"/>
+              <w:ind w:firstLine="0"/>
+              <w:jc w:val="center"/>
+            </w:pPr>
+            <w:r/>
+            <w:r>
+              <w:rPr>
+                <w:rFonts w:ascii="Times New Roman" w:hAnsi="Times New Roman" w:cs="Times New Roman" w:eastAsia="Times New Roman"/>
+                <w:b w:val="0"/>
+                <w:i w:val="0"/>
+                <w:sz w:val="24"/>
+              </w:rPr>
+              <w:t>Долгосрочная волатильность платины</w:t>
+            </w:r>
+          </w:p>
+        </w:tc>
+      </w:tr>
+      <w:tr>
+        <w:tc>
+          <w:tcPr>
+            <w:tcW w:type="dxa" w:w="3213"/>
+          </w:tcPr>
+          <w:p>
+            <w:pPr>
+              <w:spacing w:line="276" w:lineRule="auto" w:before="0" w:after="0"/>
+              <w:ind w:firstLine="0"/>
+              <w:jc w:val="left"/>
+            </w:pPr>
+            <w:r/>
+            <w:r>
+              <w:rPr>
+                <w:rFonts w:ascii="Times New Roman" w:hAnsi="Times New Roman" w:cs="Times New Roman" w:eastAsia="Times New Roman"/>
+                <w:b w:val="0"/>
+                <w:i w:val="0"/>
+                <w:sz w:val="24"/>
+              </w:rPr>
+              <w:t>silver_rvol_20</w:t>
+            </w:r>
+          </w:p>
+        </w:tc>
+        <w:tc>
+          <w:tcPr>
+            <w:tcW w:type="dxa" w:w="3213"/>
+          </w:tcPr>
+          <w:p>
+            <w:pPr>
+              <w:spacing w:line="276" w:lineRule="auto" w:before="0" w:after="0"/>
+              <w:ind w:firstLine="0"/>
+              <w:jc w:val="center"/>
+            </w:pPr>
+            <w:r/>
+            <w:r>
+              <w:rPr>
+                <w:rFonts w:ascii="Times New Roman" w:hAnsi="Times New Roman" w:cs="Times New Roman" w:eastAsia="Times New Roman"/>
+                <w:b w:val="0"/>
+                <w:i w:val="0"/>
+                <w:sz w:val="24"/>
+              </w:rPr>
+              <w:t>89%</w:t>
+            </w:r>
+          </w:p>
+        </w:tc>
+        <w:tc>
+          <w:tcPr>
+            <w:tcW w:type="dxa" w:w="3213"/>
+          </w:tcPr>
+          <w:p>
+            <w:pPr>
+              <w:spacing w:line="276" w:lineRule="auto" w:before="0" w:after="0"/>
+              <w:ind w:firstLine="0"/>
+              <w:jc w:val="center"/>
+            </w:pPr>
+            <w:r/>
+            <w:r>
+              <w:rPr>
+                <w:rFonts w:ascii="Times New Roman" w:hAnsi="Times New Roman" w:cs="Times New Roman" w:eastAsia="Times New Roman"/>
+                <w:b w:val="0"/>
+                <w:i w:val="0"/>
+                <w:sz w:val="24"/>
+              </w:rPr>
+              <w:t>Краткосрочная волатильность серебра</w:t>
+            </w:r>
+          </w:p>
+        </w:tc>
+      </w:tr>
+      <w:tr>
+        <w:tc>
+          <w:tcPr>
+            <w:tcW w:type="dxa" w:w="3213"/>
+          </w:tcPr>
+          <w:p>
+            <w:pPr>
+              <w:spacing w:line="276" w:lineRule="auto" w:before="0" w:after="0"/>
+              <w:ind w:firstLine="0"/>
+              <w:jc w:val="left"/>
+            </w:pPr>
+            <w:r/>
+            <w:r>
+              <w:rPr>
+                <w:rFonts w:ascii="Times New Roman" w:hAnsi="Times New Roman" w:cs="Times New Roman" w:eastAsia="Times New Roman"/>
+                <w:b w:val="0"/>
+                <w:i w:val="0"/>
+                <w:sz w:val="24"/>
+              </w:rPr>
+              <w:t>INDPRO</w:t>
+            </w:r>
+          </w:p>
+        </w:tc>
+        <w:tc>
+          <w:tcPr>
+            <w:tcW w:type="dxa" w:w="3213"/>
+          </w:tcPr>
+          <w:p>
+            <w:pPr>
+              <w:spacing w:line="276" w:lineRule="auto" w:before="0" w:after="0"/>
+              <w:ind w:firstLine="0"/>
+              <w:jc w:val="center"/>
+            </w:pPr>
+            <w:r/>
+            <w:r>
+              <w:rPr>
+                <w:rFonts w:ascii="Times New Roman" w:hAnsi="Times New Roman" w:cs="Times New Roman" w:eastAsia="Times New Roman"/>
+                <w:b w:val="0"/>
+                <w:i w:val="0"/>
+                <w:sz w:val="24"/>
+              </w:rPr>
+              <w:t>86%</w:t>
+            </w:r>
+          </w:p>
+        </w:tc>
+        <w:tc>
+          <w:tcPr>
+            <w:tcW w:type="dxa" w:w="3213"/>
+          </w:tcPr>
+          <w:p>
+            <w:pPr>
+              <w:spacing w:line="276" w:lineRule="auto" w:before="0" w:after="0"/>
+              <w:ind w:firstLine="0"/>
+              <w:jc w:val="center"/>
+            </w:pPr>
+            <w:r/>
+            <w:r>
+              <w:rPr>
+                <w:rFonts w:ascii="Times New Roman" w:hAnsi="Times New Roman" w:cs="Times New Roman" w:eastAsia="Times New Roman"/>
+                <w:b w:val="0"/>
+                <w:i w:val="0"/>
+                <w:sz w:val="24"/>
+              </w:rPr>
+              <w:t>Индекс промышленного производства США</w:t>
+            </w:r>
+          </w:p>
+        </w:tc>
+      </w:tr>
+    </w:tbl>
+    <w:p>
+      <w:pPr>
+        <w:spacing w:line="240" w:lineRule="auto" w:before="0" w:after="120"/>
+      </w:pPr>
+    </w:p>
+    <w:p>
+      <w:pPr>
+        <w:spacing w:line="360" w:lineRule="auto" w:before="0" w:after="0"/>
+        <w:ind w:firstLine="709"/>
+        <w:jc w:val="both"/>
+      </w:pPr>
+      <w:r>
+        <w:rPr>
+          <w:rFonts w:ascii="Times New Roman" w:hAnsi="Times New Roman" w:cs="Times New Roman" w:eastAsia="Times New Roman"/>
+          <w:b w:val="0"/>
+          <w:i w:val="0"/>
+          <w:sz w:val="28"/>
+        </w:rPr>
+        <w:t xml:space="preserve">Главное эмпирическое открытие работы состоит в том, что </w:t>
+      </w:r>
+      <w:r>
+        <w:rPr>
+          <w:rFonts w:ascii="Times New Roman" w:hAnsi="Times New Roman" w:cs="Times New Roman" w:eastAsia="Times New Roman"/>
+          <w:b/>
+          <w:i w:val="0"/>
+          <w:sz w:val="28"/>
+        </w:rPr>
+        <w:t>серебро прогнозируется не по своей собственной цене, а по волатильности всей группы драгоценных и промышленных металлов</w:t>
+      </w:r>
+      <w:r>
+        <w:rPr>
+          <w:rFonts w:ascii="Times New Roman" w:hAnsi="Times New Roman" w:cs="Times New Roman" w:eastAsia="Times New Roman"/>
+          <w:b w:val="0"/>
+          <w:i w:val="0"/>
+          <w:sz w:val="28"/>
+        </w:rPr>
+        <w:t>. Девять из десяти топовых признаков — это меры волатильности и корреляции на пяти разных металлах. Это указывает на наличие общего регима риска, который проявляется одновременно в нескольких активах, и финальная модель эффективно его улавливает.</w:t>
+      </w:r>
+    </w:p>
+    <w:p>
+      <w:pPr>
+        <w:keepNext/>
+        <w:spacing w:line="360" w:lineRule="auto" w:before="240" w:after="120"/>
+        <w:ind w:firstLine="709"/>
+        <w:jc w:val="left"/>
+      </w:pPr>
+      <w:r>
+        <w:rPr>
+          <w:rFonts w:ascii="Times New Roman" w:hAnsi="Times New Roman" w:cs="Times New Roman" w:eastAsia="Times New Roman"/>
+          <w:b/>
+          <w:i w:val="0"/>
+          <w:sz w:val="28"/>
+        </w:rPr>
+        <w:t>4.6 Сравнение с базовой production-моделью</w:t>
+      </w:r>
+    </w:p>
+    <w:p>
+      <w:pPr>
+        <w:spacing w:line="360" w:lineRule="auto" w:before="0" w:after="0"/>
+        <w:ind w:firstLine="709"/>
+        <w:jc w:val="both"/>
+      </w:pPr>
+      <w:r>
+        <w:rPr>
+          <w:rFonts w:ascii="Times New Roman" w:hAnsi="Times New Roman" w:cs="Times New Roman" w:eastAsia="Times New Roman"/>
+          <w:b w:val="0"/>
+          <w:i w:val="0"/>
+          <w:sz w:val="28"/>
+        </w:rPr>
+        <w:t>Для проверки практической ценности E3b было выполнено прямое сравнение с базовой production-моделью на общем периоде 2018–2025 годов. Базовая модель использовала текущие production-параметры OptimalV2 на тех же исторических данных через walk-forward валидацию.</w:t>
+      </w:r>
+    </w:p>
+    <w:p>
+      <w:pPr>
+        <w:keepNext/>
+        <w:spacing w:line="360" w:lineRule="auto" w:before="120" w:after="80"/>
+        <w:ind w:firstLine="0"/>
+        <w:jc w:val="left"/>
+      </w:pPr>
+      <w:r>
+        <w:rPr>
+          <w:rFonts w:ascii="Times New Roman" w:hAnsi="Times New Roman" w:cs="Times New Roman" w:eastAsia="Times New Roman"/>
+          <w:b w:val="0"/>
+          <w:i w:val="0"/>
+          <w:sz w:val="28"/>
+        </w:rPr>
+        <w:t>Таблица 4.3 – Сравнение E3b и базовой production-модели на общем периоде</w:t>
+      </w:r>
+    </w:p>
+    <w:tbl>
+      <w:tblPr>
+        <w:tblStyle w:val="TableGrid"/>
+        <w:tblW w:type="auto" w:w="0"/>
+        <w:jc w:val="center"/>
+        <w:tblLook w:firstColumn="1" w:firstRow="1" w:lastColumn="0" w:lastRow="0" w:noHBand="0" w:noVBand="1" w:val="04A0"/>
+      </w:tblPr>
+      <w:tblGrid>
+        <w:gridCol w:w="2409"/>
+        <w:gridCol w:w="2409"/>
+        <w:gridCol w:w="2409"/>
+        <w:gridCol w:w="2409"/>
+      </w:tblGrid>
+      <w:tr>
+        <w:tc>
+          <w:tcPr>
+            <w:tcW w:type="dxa" w:w="2409"/>
+          </w:tcPr>
+          <w:p>
+            <w:pPr>
+              <w:spacing w:line="276" w:lineRule="auto" w:before="0" w:after="0"/>
+              <w:ind w:firstLine="0"/>
+              <w:jc w:val="center"/>
+            </w:pPr>
+            <w:r/>
+            <w:r>
+              <w:rPr>
+                <w:rFonts w:ascii="Times New Roman" w:hAnsi="Times New Roman" w:cs="Times New Roman" w:eastAsia="Times New Roman"/>
+                <w:b/>
+                <w:i w:val="0"/>
+                <w:sz w:val="24"/>
+              </w:rPr>
+              <w:t>Метрика</w:t>
+            </w:r>
+          </w:p>
+        </w:tc>
+        <w:tc>
+          <w:tcPr>
+            <w:tcW w:type="dxa" w:w="2409"/>
+          </w:tcPr>
+          <w:p>
+            <w:pPr>
+              <w:spacing w:line="276" w:lineRule="auto" w:before="0" w:after="0"/>
+              <w:ind w:firstLine="0"/>
+              <w:jc w:val="center"/>
+            </w:pPr>
+            <w:r/>
+            <w:r>
+              <w:rPr>
+                <w:rFonts w:ascii="Times New Roman" w:hAnsi="Times New Roman" w:cs="Times New Roman" w:eastAsia="Times New Roman"/>
+                <w:b/>
+                <w:i w:val="0"/>
+                <w:sz w:val="24"/>
+              </w:rPr>
+              <w:t>E3b</w:t>
+            </w:r>
+          </w:p>
+        </w:tc>
+        <w:tc>
+          <w:tcPr>
+            <w:tcW w:type="dxa" w:w="2409"/>
+          </w:tcPr>
+          <w:p>
+            <w:pPr>
+              <w:spacing w:line="276" w:lineRule="auto" w:before="0" w:after="0"/>
+              <w:ind w:firstLine="0"/>
+              <w:jc w:val="center"/>
+            </w:pPr>
+            <w:r/>
+            <w:r>
+              <w:rPr>
+                <w:rFonts w:ascii="Times New Roman" w:hAnsi="Times New Roman" w:cs="Times New Roman" w:eastAsia="Times New Roman"/>
+                <w:b/>
+                <w:i w:val="0"/>
+                <w:sz w:val="24"/>
+              </w:rPr>
+              <w:t>Базовая production</w:t>
+            </w:r>
+          </w:p>
+        </w:tc>
+        <w:tc>
+          <w:tcPr>
+            <w:tcW w:type="dxa" w:w="2409"/>
+          </w:tcPr>
+          <w:p>
+            <w:pPr>
+              <w:spacing w:line="276" w:lineRule="auto" w:before="0" w:after="0"/>
+              <w:ind w:firstLine="0"/>
+              <w:jc w:val="center"/>
+            </w:pPr>
+            <w:r/>
+            <w:r>
+              <w:rPr>
+                <w:rFonts w:ascii="Times New Roman" w:hAnsi="Times New Roman" w:cs="Times New Roman" w:eastAsia="Times New Roman"/>
+                <w:b/>
+                <w:i w:val="0"/>
+                <w:sz w:val="24"/>
+              </w:rPr>
+              <w:t>Δ</w:t>
+            </w:r>
+          </w:p>
+        </w:tc>
+      </w:tr>
+      <w:tr>
+        <w:tc>
+          <w:tcPr>
+            <w:tcW w:type="dxa" w:w="2409"/>
+          </w:tcPr>
+          <w:p>
+            <w:pPr>
+              <w:spacing w:line="276" w:lineRule="auto" w:before="0" w:after="0"/>
+              <w:ind w:firstLine="0"/>
+              <w:jc w:val="left"/>
+            </w:pPr>
+            <w:r/>
+            <w:r>
+              <w:rPr>
+                <w:rFonts w:ascii="Times New Roman" w:hAnsi="Times New Roman" w:cs="Times New Roman" w:eastAsia="Times New Roman"/>
+                <w:b w:val="0"/>
+                <w:i w:val="0"/>
+                <w:sz w:val="24"/>
+              </w:rPr>
+              <w:t>Сделок</w:t>
+            </w:r>
+          </w:p>
+        </w:tc>
+        <w:tc>
+          <w:tcPr>
+            <w:tcW w:type="dxa" w:w="2409"/>
+          </w:tcPr>
+          <w:p>
+            <w:pPr>
+              <w:spacing w:line="276" w:lineRule="auto" w:before="0" w:after="0"/>
+              <w:ind w:firstLine="0"/>
+              <w:jc w:val="center"/>
+            </w:pPr>
+            <w:r/>
+            <w:r>
+              <w:rPr>
+                <w:rFonts w:ascii="Times New Roman" w:hAnsi="Times New Roman" w:cs="Times New Roman" w:eastAsia="Times New Roman"/>
+                <w:b w:val="0"/>
+                <w:i w:val="0"/>
+                <w:sz w:val="24"/>
+              </w:rPr>
+              <w:t>37</w:t>
+            </w:r>
+          </w:p>
+        </w:tc>
+        <w:tc>
+          <w:tcPr>
+            <w:tcW w:type="dxa" w:w="2409"/>
+          </w:tcPr>
+          <w:p>
+            <w:pPr>
+              <w:spacing w:line="276" w:lineRule="auto" w:before="0" w:after="0"/>
+              <w:ind w:firstLine="0"/>
+              <w:jc w:val="center"/>
+            </w:pPr>
+            <w:r/>
+            <w:r>
+              <w:rPr>
+                <w:rFonts w:ascii="Times New Roman" w:hAnsi="Times New Roman" w:cs="Times New Roman" w:eastAsia="Times New Roman"/>
+                <w:b w:val="0"/>
+                <w:i w:val="0"/>
+                <w:sz w:val="24"/>
+              </w:rPr>
+              <w:t>71</w:t>
+            </w:r>
+          </w:p>
+        </w:tc>
+        <w:tc>
+          <w:tcPr>
+            <w:tcW w:type="dxa" w:w="2409"/>
+          </w:tcPr>
+          <w:p>
+            <w:pPr>
+              <w:spacing w:line="276" w:lineRule="auto" w:before="0" w:after="0"/>
+              <w:ind w:firstLine="0"/>
+              <w:jc w:val="center"/>
+            </w:pPr>
+            <w:r/>
+            <w:r>
+              <w:rPr>
+                <w:rFonts w:ascii="Times New Roman" w:hAnsi="Times New Roman" w:cs="Times New Roman" w:eastAsia="Times New Roman"/>
+                <w:b w:val="0"/>
+                <w:i w:val="0"/>
+                <w:sz w:val="24"/>
+              </w:rPr>
+              <w:t>—</w:t>
+            </w:r>
+          </w:p>
+        </w:tc>
+      </w:tr>
+      <w:tr>
+        <w:tc>
+          <w:tcPr>
+            <w:tcW w:type="dxa" w:w="2409"/>
+          </w:tcPr>
+          <w:p>
+            <w:pPr>
+              <w:spacing w:line="276" w:lineRule="auto" w:before="0" w:after="0"/>
+              <w:ind w:firstLine="0"/>
+              <w:jc w:val="left"/>
+            </w:pPr>
+            <w:r/>
+            <w:r>
+              <w:rPr>
+                <w:rFonts w:ascii="Times New Roman" w:hAnsi="Times New Roman" w:cs="Times New Roman" w:eastAsia="Times New Roman"/>
+                <w:b w:val="0"/>
+                <w:i w:val="0"/>
+                <w:sz w:val="24"/>
+              </w:rPr>
+              <w:t>Total return</w:t>
+            </w:r>
+          </w:p>
+        </w:tc>
+        <w:tc>
+          <w:tcPr>
+            <w:tcW w:type="dxa" w:w="2409"/>
+          </w:tcPr>
+          <w:p>
+            <w:pPr>
+              <w:spacing w:line="276" w:lineRule="auto" w:before="0" w:after="0"/>
+              <w:ind w:firstLine="0"/>
+              <w:jc w:val="center"/>
+            </w:pPr>
+            <w:r/>
+            <w:r>
+              <w:rPr>
+                <w:rFonts w:ascii="Times New Roman" w:hAnsi="Times New Roman" w:cs="Times New Roman" w:eastAsia="Times New Roman"/>
+                <w:b/>
+                <w:i w:val="0"/>
+                <w:sz w:val="24"/>
+              </w:rPr>
+              <w:t>+104,6%</w:t>
+            </w:r>
+          </w:p>
+        </w:tc>
+        <w:tc>
+          <w:tcPr>
+            <w:tcW w:type="dxa" w:w="2409"/>
+          </w:tcPr>
+          <w:p>
+            <w:pPr>
+              <w:spacing w:line="276" w:lineRule="auto" w:before="0" w:after="0"/>
+              <w:ind w:firstLine="0"/>
+              <w:jc w:val="center"/>
+            </w:pPr>
+            <w:r/>
+            <w:r>
+              <w:rPr>
+                <w:rFonts w:ascii="Times New Roman" w:hAnsi="Times New Roman" w:cs="Times New Roman" w:eastAsia="Times New Roman"/>
+                <w:b w:val="0"/>
+                <w:i w:val="0"/>
+                <w:sz w:val="24"/>
+              </w:rPr>
+              <w:t>−44,0%</w:t>
+            </w:r>
+          </w:p>
+        </w:tc>
+        <w:tc>
+          <w:tcPr>
+            <w:tcW w:type="dxa" w:w="2409"/>
+          </w:tcPr>
+          <w:p>
+            <w:pPr>
+              <w:spacing w:line="276" w:lineRule="auto" w:before="0" w:after="0"/>
+              <w:ind w:firstLine="0"/>
+              <w:jc w:val="center"/>
+            </w:pPr>
+            <w:r/>
+            <w:r>
+              <w:rPr>
+                <w:rFonts w:ascii="Times New Roman" w:hAnsi="Times New Roman" w:cs="Times New Roman" w:eastAsia="Times New Roman"/>
+                <w:b/>
+                <w:i w:val="0"/>
+                <w:sz w:val="24"/>
+              </w:rPr>
+              <w:t>+148,6 п.п.</w:t>
+            </w:r>
+          </w:p>
+        </w:tc>
+      </w:tr>
+      <w:tr>
+        <w:tc>
+          <w:tcPr>
+            <w:tcW w:type="dxa" w:w="2409"/>
+          </w:tcPr>
+          <w:p>
+            <w:pPr>
+              <w:spacing w:line="276" w:lineRule="auto" w:before="0" w:after="0"/>
+              <w:ind w:firstLine="0"/>
+              <w:jc w:val="left"/>
+            </w:pPr>
+            <w:r/>
+            <w:r>
+              <w:rPr>
+                <w:rFonts w:ascii="Times New Roman" w:hAnsi="Times New Roman" w:cs="Times New Roman" w:eastAsia="Times New Roman"/>
+                <w:b w:val="0"/>
+                <w:i w:val="0"/>
+                <w:sz w:val="24"/>
+              </w:rPr>
+              <w:t>Annual return</w:t>
+            </w:r>
+          </w:p>
+        </w:tc>
+        <w:tc>
+          <w:tcPr>
+            <w:tcW w:type="dxa" w:w="2409"/>
+          </w:tcPr>
+          <w:p>
+            <w:pPr>
+              <w:spacing w:line="276" w:lineRule="auto" w:before="0" w:after="0"/>
+              <w:ind w:firstLine="0"/>
+              <w:jc w:val="center"/>
+            </w:pPr>
+            <w:r/>
+            <w:r>
+              <w:rPr>
+                <w:rFonts w:ascii="Times New Roman" w:hAnsi="Times New Roman" w:cs="Times New Roman" w:eastAsia="Times New Roman"/>
+                <w:b/>
+                <w:i w:val="0"/>
+                <w:sz w:val="24"/>
+              </w:rPr>
+              <w:t>+10,3%</w:t>
+            </w:r>
+          </w:p>
+        </w:tc>
+        <w:tc>
+          <w:tcPr>
+            <w:tcW w:type="dxa" w:w="2409"/>
+          </w:tcPr>
+          <w:p>
+            <w:pPr>
+              <w:spacing w:line="276" w:lineRule="auto" w:before="0" w:after="0"/>
+              <w:ind w:firstLine="0"/>
+              <w:jc w:val="center"/>
+            </w:pPr>
+            <w:r/>
+            <w:r>
+              <w:rPr>
+                <w:rFonts w:ascii="Times New Roman" w:hAnsi="Times New Roman" w:cs="Times New Roman" w:eastAsia="Times New Roman"/>
+                <w:b w:val="0"/>
+                <w:i w:val="0"/>
+                <w:sz w:val="24"/>
+              </w:rPr>
+              <w:t>−7,8%</w:t>
+            </w:r>
+          </w:p>
+        </w:tc>
+        <w:tc>
+          <w:tcPr>
+            <w:tcW w:type="dxa" w:w="2409"/>
+          </w:tcPr>
+          <w:p>
+            <w:pPr>
+              <w:spacing w:line="276" w:lineRule="auto" w:before="0" w:after="0"/>
+              <w:ind w:firstLine="0"/>
+              <w:jc w:val="center"/>
+            </w:pPr>
+            <w:r/>
+            <w:r>
+              <w:rPr>
+                <w:rFonts w:ascii="Times New Roman" w:hAnsi="Times New Roman" w:cs="Times New Roman" w:eastAsia="Times New Roman"/>
+                <w:b/>
+                <w:i w:val="0"/>
+                <w:sz w:val="24"/>
+              </w:rPr>
+              <w:t>+18,1 п.п.</w:t>
+            </w:r>
+          </w:p>
+        </w:tc>
+      </w:tr>
+      <w:tr>
+        <w:tc>
+          <w:tcPr>
+            <w:tcW w:type="dxa" w:w="2409"/>
+          </w:tcPr>
+          <w:p>
+            <w:pPr>
+              <w:spacing w:line="276" w:lineRule="auto" w:before="0" w:after="0"/>
+              <w:ind w:firstLine="0"/>
+              <w:jc w:val="left"/>
+            </w:pPr>
+            <w:r/>
+            <w:r>
+              <w:rPr>
+                <w:rFonts w:ascii="Times New Roman" w:hAnsi="Times New Roman" w:cs="Times New Roman" w:eastAsia="Times New Roman"/>
+                <w:b w:val="0"/>
+                <w:i w:val="0"/>
+                <w:sz w:val="24"/>
+              </w:rPr>
+              <w:t>Sharpe</w:t>
+            </w:r>
+          </w:p>
+        </w:tc>
+        <w:tc>
+          <w:tcPr>
+            <w:tcW w:type="dxa" w:w="2409"/>
+          </w:tcPr>
+          <w:p>
+            <w:pPr>
+              <w:spacing w:line="276" w:lineRule="auto" w:before="0" w:after="0"/>
+              <w:ind w:firstLine="0"/>
+              <w:jc w:val="center"/>
+            </w:pPr>
+            <w:r/>
+            <w:r>
+              <w:rPr>
+                <w:rFonts w:ascii="Times New Roman" w:hAnsi="Times New Roman" w:cs="Times New Roman" w:eastAsia="Times New Roman"/>
+                <w:b/>
+                <w:i w:val="0"/>
+                <w:sz w:val="24"/>
+              </w:rPr>
+              <w:t>0,625</w:t>
+            </w:r>
+          </w:p>
+        </w:tc>
+        <w:tc>
+          <w:tcPr>
+            <w:tcW w:type="dxa" w:w="2409"/>
+          </w:tcPr>
+          <w:p>
+            <w:pPr>
+              <w:spacing w:line="276" w:lineRule="auto" w:before="0" w:after="0"/>
+              <w:ind w:firstLine="0"/>
+              <w:jc w:val="center"/>
+            </w:pPr>
+            <w:r/>
+            <w:r>
+              <w:rPr>
+                <w:rFonts w:ascii="Times New Roman" w:hAnsi="Times New Roman" w:cs="Times New Roman" w:eastAsia="Times New Roman"/>
+                <w:b w:val="0"/>
+                <w:i w:val="0"/>
+                <w:sz w:val="24"/>
+              </w:rPr>
+              <w:t>−0,505</w:t>
+            </w:r>
+          </w:p>
+        </w:tc>
+        <w:tc>
+          <w:tcPr>
+            <w:tcW w:type="dxa" w:w="2409"/>
+          </w:tcPr>
+          <w:p>
+            <w:pPr>
+              <w:spacing w:line="276" w:lineRule="auto" w:before="0" w:after="0"/>
+              <w:ind w:firstLine="0"/>
+              <w:jc w:val="center"/>
+            </w:pPr>
+            <w:r/>
+            <w:r>
+              <w:rPr>
+                <w:rFonts w:ascii="Times New Roman" w:hAnsi="Times New Roman" w:cs="Times New Roman" w:eastAsia="Times New Roman"/>
+                <w:b/>
+                <w:i w:val="0"/>
+                <w:sz w:val="24"/>
+              </w:rPr>
+              <w:t>+1,130</w:t>
+            </w:r>
+          </w:p>
+        </w:tc>
+      </w:tr>
+      <w:tr>
+        <w:tc>
+          <w:tcPr>
+            <w:tcW w:type="dxa" w:w="2409"/>
+          </w:tcPr>
+          <w:p>
+            <w:pPr>
+              <w:spacing w:line="276" w:lineRule="auto" w:before="0" w:after="0"/>
+              <w:ind w:firstLine="0"/>
+              <w:jc w:val="left"/>
+            </w:pPr>
+            <w:r/>
+            <w:r>
+              <w:rPr>
+                <w:rFonts w:ascii="Times New Roman" w:hAnsi="Times New Roman" w:cs="Times New Roman" w:eastAsia="Times New Roman"/>
+                <w:b w:val="0"/>
+                <w:i w:val="0"/>
+                <w:sz w:val="24"/>
+              </w:rPr>
+              <w:t>Win rate</w:t>
+            </w:r>
+          </w:p>
+        </w:tc>
+        <w:tc>
+          <w:tcPr>
+            <w:tcW w:type="dxa" w:w="2409"/>
+          </w:tcPr>
+          <w:p>
+            <w:pPr>
+              <w:spacing w:line="276" w:lineRule="auto" w:before="0" w:after="0"/>
+              <w:ind w:firstLine="0"/>
+              <w:jc w:val="center"/>
+            </w:pPr>
+            <w:r/>
+            <w:r>
+              <w:rPr>
+                <w:rFonts w:ascii="Times New Roman" w:hAnsi="Times New Roman" w:cs="Times New Roman" w:eastAsia="Times New Roman"/>
+                <w:b/>
+                <w:i w:val="0"/>
+                <w:sz w:val="24"/>
+              </w:rPr>
+              <w:t>67,6%</w:t>
+            </w:r>
+          </w:p>
+        </w:tc>
+        <w:tc>
+          <w:tcPr>
+            <w:tcW w:type="dxa" w:w="2409"/>
+          </w:tcPr>
+          <w:p>
+            <w:pPr>
+              <w:spacing w:line="276" w:lineRule="auto" w:before="0" w:after="0"/>
+              <w:ind w:firstLine="0"/>
+              <w:jc w:val="center"/>
+            </w:pPr>
+            <w:r/>
+            <w:r>
+              <w:rPr>
+                <w:rFonts w:ascii="Times New Roman" w:hAnsi="Times New Roman" w:cs="Times New Roman" w:eastAsia="Times New Roman"/>
+                <w:b w:val="0"/>
+                <w:i w:val="0"/>
+                <w:sz w:val="24"/>
+              </w:rPr>
+              <w:t>36,6%</w:t>
+            </w:r>
+          </w:p>
+        </w:tc>
+        <w:tc>
+          <w:tcPr>
+            <w:tcW w:type="dxa" w:w="2409"/>
+          </w:tcPr>
+          <w:p>
+            <w:pPr>
+              <w:spacing w:line="276" w:lineRule="auto" w:before="0" w:after="0"/>
+              <w:ind w:firstLine="0"/>
+              <w:jc w:val="center"/>
+            </w:pPr>
+            <w:r/>
+            <w:r>
+              <w:rPr>
+                <w:rFonts w:ascii="Times New Roman" w:hAnsi="Times New Roman" w:cs="Times New Roman" w:eastAsia="Times New Roman"/>
+                <w:b/>
+                <w:i w:val="0"/>
+                <w:sz w:val="24"/>
+              </w:rPr>
+              <w:t>+31,0 п.п.</w:t>
+            </w:r>
+          </w:p>
+        </w:tc>
+      </w:tr>
+      <w:tr>
+        <w:tc>
+          <w:tcPr>
+            <w:tcW w:type="dxa" w:w="2409"/>
+          </w:tcPr>
+          <w:p>
+            <w:pPr>
+              <w:spacing w:line="276" w:lineRule="auto" w:before="0" w:after="0"/>
+              <w:ind w:firstLine="0"/>
+              <w:jc w:val="left"/>
+            </w:pPr>
+            <w:r/>
+            <w:r>
+              <w:rPr>
+                <w:rFonts w:ascii="Times New Roman" w:hAnsi="Times New Roman" w:cs="Times New Roman" w:eastAsia="Times New Roman"/>
+                <w:b w:val="0"/>
+                <w:i w:val="0"/>
+                <w:sz w:val="24"/>
+              </w:rPr>
+              <w:t>Max DD</w:t>
+            </w:r>
+          </w:p>
+        </w:tc>
+        <w:tc>
+          <w:tcPr>
+            <w:tcW w:type="dxa" w:w="2409"/>
+          </w:tcPr>
+          <w:p>
+            <w:pPr>
+              <w:spacing w:line="276" w:lineRule="auto" w:before="0" w:after="0"/>
+              <w:ind w:firstLine="0"/>
+              <w:jc w:val="center"/>
+            </w:pPr>
+            <w:r/>
+            <w:r>
+              <w:rPr>
+                <w:rFonts w:ascii="Times New Roman" w:hAnsi="Times New Roman" w:cs="Times New Roman" w:eastAsia="Times New Roman"/>
+                <w:b/>
+                <w:i w:val="0"/>
+                <w:sz w:val="24"/>
+              </w:rPr>
+              <w:t>−17,4%</w:t>
+            </w:r>
+          </w:p>
+        </w:tc>
+        <w:tc>
+          <w:tcPr>
+            <w:tcW w:type="dxa" w:w="2409"/>
+          </w:tcPr>
+          <w:p>
+            <w:pPr>
+              <w:spacing w:line="276" w:lineRule="auto" w:before="0" w:after="0"/>
+              <w:ind w:firstLine="0"/>
+              <w:jc w:val="center"/>
+            </w:pPr>
+            <w:r/>
+            <w:r>
+              <w:rPr>
+                <w:rFonts w:ascii="Times New Roman" w:hAnsi="Times New Roman" w:cs="Times New Roman" w:eastAsia="Times New Roman"/>
+                <w:b w:val="0"/>
+                <w:i w:val="0"/>
+                <w:sz w:val="24"/>
+              </w:rPr>
+              <w:t>−44,5%</w:t>
+            </w:r>
+          </w:p>
+        </w:tc>
+        <w:tc>
+          <w:tcPr>
+            <w:tcW w:type="dxa" w:w="2409"/>
+          </w:tcPr>
+          <w:p>
+            <w:pPr>
+              <w:spacing w:line="276" w:lineRule="auto" w:before="0" w:after="0"/>
+              <w:ind w:firstLine="0"/>
+              <w:jc w:val="center"/>
+            </w:pPr>
+            <w:r/>
+            <w:r>
+              <w:rPr>
+                <w:rFonts w:ascii="Times New Roman" w:hAnsi="Times New Roman" w:cs="Times New Roman" w:eastAsia="Times New Roman"/>
+                <w:b/>
+                <w:i w:val="0"/>
+                <w:sz w:val="24"/>
+              </w:rPr>
+              <w:t>+27,1 п.п.</w:t>
+            </w:r>
+          </w:p>
+        </w:tc>
+      </w:tr>
+      <w:tr>
+        <w:tc>
+          <w:tcPr>
+            <w:tcW w:type="dxa" w:w="2409"/>
+          </w:tcPr>
+          <w:p>
+            <w:pPr>
+              <w:spacing w:line="276" w:lineRule="auto" w:before="0" w:after="0"/>
+              <w:ind w:firstLine="0"/>
+              <w:jc w:val="left"/>
+            </w:pPr>
+            <w:r/>
+            <w:r>
+              <w:rPr>
+                <w:rFonts w:ascii="Times New Roman" w:hAnsi="Times New Roman" w:cs="Times New Roman" w:eastAsia="Times New Roman"/>
+                <w:b w:val="0"/>
+                <w:i w:val="0"/>
+                <w:sz w:val="24"/>
+              </w:rPr>
+              <w:t>Profit factor</w:t>
+            </w:r>
+          </w:p>
+        </w:tc>
+        <w:tc>
+          <w:tcPr>
+            <w:tcW w:type="dxa" w:w="2409"/>
+          </w:tcPr>
+          <w:p>
+            <w:pPr>
+              <w:spacing w:line="276" w:lineRule="auto" w:before="0" w:after="0"/>
+              <w:ind w:firstLine="0"/>
+              <w:jc w:val="center"/>
+            </w:pPr>
+            <w:r/>
+            <w:r>
+              <w:rPr>
+                <w:rFonts w:ascii="Times New Roman" w:hAnsi="Times New Roman" w:cs="Times New Roman" w:eastAsia="Times New Roman"/>
+                <w:b/>
+                <w:i w:val="0"/>
+                <w:sz w:val="24"/>
+              </w:rPr>
+              <w:t>2,40</w:t>
+            </w:r>
+          </w:p>
+        </w:tc>
+        <w:tc>
+          <w:tcPr>
+            <w:tcW w:type="dxa" w:w="2409"/>
+          </w:tcPr>
+          <w:p>
+            <w:pPr>
+              <w:spacing w:line="276" w:lineRule="auto" w:before="0" w:after="0"/>
+              <w:ind w:firstLine="0"/>
+              <w:jc w:val="center"/>
+            </w:pPr>
+            <w:r/>
+            <w:r>
+              <w:rPr>
+                <w:rFonts w:ascii="Times New Roman" w:hAnsi="Times New Roman" w:cs="Times New Roman" w:eastAsia="Times New Roman"/>
+                <w:b w:val="0"/>
+                <w:i w:val="0"/>
+                <w:sz w:val="24"/>
+              </w:rPr>
+              <w:t>0,65</w:t>
+            </w:r>
+          </w:p>
+        </w:tc>
+        <w:tc>
+          <w:tcPr>
+            <w:tcW w:type="dxa" w:w="2409"/>
+          </w:tcPr>
+          <w:p>
+            <w:pPr>
+              <w:spacing w:line="276" w:lineRule="auto" w:before="0" w:after="0"/>
+              <w:ind w:firstLine="0"/>
+              <w:jc w:val="center"/>
+            </w:pPr>
+            <w:r/>
+            <w:r>
+              <w:rPr>
+                <w:rFonts w:ascii="Times New Roman" w:hAnsi="Times New Roman" w:cs="Times New Roman" w:eastAsia="Times New Roman"/>
+                <w:b/>
+                <w:i w:val="0"/>
+                <w:sz w:val="24"/>
+              </w:rPr>
+              <w:t>+1,75</w:t>
+            </w:r>
+          </w:p>
+        </w:tc>
+      </w:tr>
+    </w:tbl>
+    <w:p>
+      <w:pPr>
+        <w:spacing w:line="240" w:lineRule="auto" w:before="0" w:after="120"/>
+      </w:pPr>
+    </w:p>
+    <w:p>
+      <w:pPr>
+        <w:spacing w:line="360" w:lineRule="auto" w:before="0" w:after="0"/>
+        <w:ind w:firstLine="709"/>
+        <w:jc w:val="both"/>
+      </w:pPr>
+      <w:r>
+        <w:rPr>
+          <w:rFonts w:ascii="Times New Roman" w:hAnsi="Times New Roman" w:cs="Times New Roman" w:eastAsia="Times New Roman"/>
+          <w:b w:val="0"/>
+          <w:i w:val="0"/>
+          <w:sz w:val="28"/>
+        </w:rPr>
+        <w:t>Финальная модель E3b превосходит базовую production-модель по всем семи ключевым метрикам. Накопленная доходность на одинаковом семи-с-половиной-летнем периоде различается на 148 процентных пунктов, win rate почти удваивается, а максимальная просадка снижается более чем вдвое.</w:t>
+      </w:r>
+    </w:p>
+    <w:p>
+      <w:pPr>
+        <w:spacing w:line="360" w:lineRule="auto" w:before="0" w:after="0"/>
+        <w:ind w:firstLine="709"/>
+        <w:jc w:val="both"/>
+      </w:pPr>
+      <w:r>
+        <w:rPr>
+          <w:rFonts w:ascii="Times New Roman" w:hAnsi="Times New Roman" w:cs="Times New Roman" w:eastAsia="Times New Roman"/>
+          <w:b w:val="0"/>
+          <w:i w:val="0"/>
+          <w:sz w:val="28"/>
+        </w:rPr>
+        <w:t>Визуализация сравнения E3b с production-моделью представлена на рисунке 4.6, на котором отчётливо виден разрыв между моделями именно в период 2021–2023 годов — то есть в обычные рыночные условия, а не только в аномалии 2025 года.</w:t>
+      </w:r>
+    </w:p>
+    <w:p>
+      <w:pPr>
+        <w:spacing w:line="240" w:lineRule="auto" w:before="240" w:after="0"/>
+        <w:ind w:firstLine="0"/>
+        <w:jc w:val="center"/>
+      </w:pPr>
+      <w:r>
+        <w:drawing>
+          <wp:inline xmlns:a="http://schemas.openxmlformats.org/drawingml/2006/main" xmlns:pic="http://schemas.openxmlformats.org/drawingml/2006/picture">
+            <wp:extent cx="5760000" cy="4006109"/>
+            <wp:docPr id="6" name="Picture 6"/>
+            <wp:cNvGraphicFramePr>
+              <a:graphicFrameLocks noChangeAspect="1"/>
+            </wp:cNvGraphicFramePr>
+            <a:graphic>
+              <a:graphicData uri="http://schemas.openxmlformats.org/drawingml/2006/picture">
+                <pic:pic>
+                  <pic:nvPicPr>
+                    <pic:cNvPr id="0" name="07_e3b_vs_v25_focused.png"/>
+                    <pic:cNvPicPr/>
+                  </pic:nvPicPr>
+                  <pic:blipFill>
+                    <a:blip r:embed="rId14"/>
+                    <a:stretch>
+                      <a:fillRect/>
+                    </a:stretch>
+                  </pic:blipFill>
+                  <pic:spPr>
+                    <a:xfrm>
+                      <a:off x="0" y="0"/>
+                      <a:ext cx="5760000" cy="4006109"/>
+                    </a:xfrm>
+                    <a:prstGeom prst="rect"/>
+                  </pic:spPr>
+                </pic:pic>
+              </a:graphicData>
+            </a:graphic>
+          </wp:inline>
+        </w:drawing>
+      </w:r>
+    </w:p>
+    <w:p>
+      <w:pPr>
+        <w:spacing w:line="288" w:lineRule="auto" w:before="0" w:after="240"/>
+        <w:ind w:firstLine="0"/>
+        <w:jc w:val="center"/>
+      </w:pPr>
+      <w:r>
+        <w:rPr>
+          <w:rFonts w:ascii="Times New Roman" w:hAnsi="Times New Roman" w:cs="Times New Roman" w:eastAsia="Times New Roman"/>
+          <w:b w:val="0"/>
+          <w:i/>
+          <w:sz w:val="26"/>
+        </w:rPr>
+        <w:t>Рисунок 4.6 – Полное сравнение E3b с базовой production-моделью: накопленная доходность, ключевые метрики, просадки и год-по-году breakdown.</w:t>
+      </w:r>
+    </w:p>
+    <w:p>
+      <w:pPr>
+        <w:keepNext/>
+        <w:spacing w:line="360" w:lineRule="auto" w:before="240" w:after="120"/>
+        <w:ind w:firstLine="709"/>
+        <w:jc w:val="left"/>
+      </w:pPr>
+      <w:r>
+        <w:rPr>
+          <w:rFonts w:ascii="Times New Roman" w:hAnsi="Times New Roman" w:cs="Times New Roman" w:eastAsia="Times New Roman"/>
+          <w:b/>
+          <w:i w:val="0"/>
+          <w:sz w:val="28"/>
+        </w:rPr>
+        <w:t>4.7 Production-интеграция и непрерывное переобучение</w:t>
+      </w:r>
+    </w:p>
+    <w:p>
+      <w:pPr>
+        <w:spacing w:line="360" w:lineRule="auto" w:before="0" w:after="0"/>
+        <w:ind w:firstLine="709"/>
+        <w:jc w:val="both"/>
+      </w:pPr>
+      <w:r>
+        <w:rPr>
+          <w:rFonts w:ascii="Times New Roman" w:hAnsi="Times New Roman" w:cs="Times New Roman" w:eastAsia="Times New Roman"/>
+          <w:b w:val="0"/>
+          <w:i w:val="0"/>
+          <w:sz w:val="28"/>
+        </w:rPr>
+        <w:t>Финальная модель E3b интегрирована в production-инфраструктуру системы. Разработан скрипт автоматического ежедневного запуска scripts/daily_e3b.py, выполняющий полный цикл обновления данных, переобучения модели walk-forward и генерации сигнала на сегодня. Скрипт включает следующие этапы:</w:t>
+      </w:r>
+    </w:p>
+    <w:p>
+      <w:pPr>
+        <w:spacing w:line="360" w:lineRule="auto" w:before="0" w:after="0"/>
+        <w:ind w:firstLine="709"/>
+        <w:jc w:val="both"/>
+      </w:pPr>
+      <w:r>
+        <w:rPr>
+          <w:rFonts w:ascii="Times New Roman" w:hAnsi="Times New Roman" w:cs="Times New Roman" w:eastAsia="Times New Roman"/>
+          <w:b w:val="0"/>
+          <w:i w:val="0"/>
+          <w:sz w:val="28"/>
+        </w:rPr>
+        <w:t>– обновление котировок пяти металлов через yfinance;</w:t>
+      </w:r>
+    </w:p>
+    <w:p>
+      <w:pPr>
+        <w:spacing w:line="360" w:lineRule="auto" w:before="0" w:after="0"/>
+        <w:ind w:firstLine="709"/>
+        <w:jc w:val="both"/>
+      </w:pPr>
+      <w:r>
+        <w:rPr>
+          <w:rFonts w:ascii="Times New Roman" w:hAnsi="Times New Roman" w:cs="Times New Roman" w:eastAsia="Times New Roman"/>
+          <w:b w:val="0"/>
+          <w:i w:val="0"/>
+          <w:sz w:val="28"/>
+        </w:rPr>
+        <w:t>– загрузка свежих макроэкономических данных через FRED;</w:t>
+      </w:r>
+    </w:p>
+    <w:p>
+      <w:pPr>
+        <w:spacing w:line="360" w:lineRule="auto" w:before="0" w:after="0"/>
+        <w:ind w:firstLine="709"/>
+        <w:jc w:val="both"/>
+      </w:pPr>
+      <w:r>
+        <w:rPr>
+          <w:rFonts w:ascii="Times New Roman" w:hAnsi="Times New Roman" w:cs="Times New Roman" w:eastAsia="Times New Roman"/>
+          <w:b w:val="0"/>
+          <w:i w:val="0"/>
+          <w:sz w:val="28"/>
+        </w:rPr>
+        <w:t>– переобучение walk-forward модели на полной истории до вчерашнего дня;</w:t>
+      </w:r>
+    </w:p>
+    <w:p>
+      <w:pPr>
+        <w:spacing w:line="360" w:lineRule="auto" w:before="0" w:after="0"/>
+        <w:ind w:firstLine="709"/>
+        <w:jc w:val="both"/>
+      </w:pPr>
+      <w:r>
+        <w:rPr>
+          <w:rFonts w:ascii="Times New Roman" w:hAnsi="Times New Roman" w:cs="Times New Roman" w:eastAsia="Times New Roman"/>
+          <w:b w:val="0"/>
+          <w:i w:val="0"/>
+          <w:sz w:val="28"/>
+        </w:rPr>
+        <w:t>– финальное обучение классификатора на всех данных с purge 21 день;</w:t>
+      </w:r>
+    </w:p>
+    <w:p>
+      <w:pPr>
+        <w:spacing w:line="360" w:lineRule="auto" w:before="0" w:after="0"/>
+        <w:ind w:firstLine="709"/>
+        <w:jc w:val="both"/>
+      </w:pPr>
+      <w:r>
+        <w:rPr>
+          <w:rFonts w:ascii="Times New Roman" w:hAnsi="Times New Roman" w:cs="Times New Roman" w:eastAsia="Times New Roman"/>
+          <w:b w:val="0"/>
+          <w:i w:val="0"/>
+          <w:sz w:val="28"/>
+        </w:rPr>
+        <w:t>– генерация вероятности роста на сегодня с применением forward-fill в палладии для покрытия свежих дней;</w:t>
+      </w:r>
+    </w:p>
+    <w:p>
+      <w:pPr>
+        <w:spacing w:line="360" w:lineRule="auto" w:before="0" w:after="0"/>
+        <w:ind w:firstLine="709"/>
+        <w:jc w:val="both"/>
+      </w:pPr>
+      <w:r>
+        <w:rPr>
+          <w:rFonts w:ascii="Times New Roman" w:hAnsi="Times New Roman" w:cs="Times New Roman" w:eastAsia="Times New Roman"/>
+          <w:b w:val="0"/>
+          <w:i w:val="0"/>
+          <w:sz w:val="28"/>
+        </w:rPr>
+        <w:t>– классификация сигнала в BUY/HOLD/SELL по адаптивным порогам;</w:t>
+      </w:r>
+    </w:p>
+    <w:p>
+      <w:pPr>
+        <w:spacing w:line="360" w:lineRule="auto" w:before="0" w:after="0"/>
+        <w:ind w:firstLine="709"/>
+        <w:jc w:val="both"/>
+      </w:pPr>
+      <w:r>
+        <w:rPr>
+          <w:rFonts w:ascii="Times New Roman" w:hAnsi="Times New Roman" w:cs="Times New Roman" w:eastAsia="Times New Roman"/>
+          <w:b w:val="0"/>
+          <w:i w:val="0"/>
+          <w:sz w:val="28"/>
+        </w:rPr>
+        <w:t>– сохранение отчётов в daily_reports/e3b/ с timestamp-версионированием;</w:t>
+      </w:r>
+    </w:p>
+    <w:p>
+      <w:pPr>
+        <w:spacing w:line="360" w:lineRule="auto" w:before="0" w:after="0"/>
+        <w:ind w:firstLine="709"/>
+        <w:jc w:val="both"/>
+      </w:pPr>
+      <w:r>
+        <w:rPr>
+          <w:rFonts w:ascii="Times New Roman" w:hAnsi="Times New Roman" w:cs="Times New Roman" w:eastAsia="Times New Roman"/>
+          <w:b w:val="0"/>
+          <w:i w:val="0"/>
+          <w:sz w:val="28"/>
+        </w:rPr>
+        <w:t>– отправка уведомления в Telegram с автоматическим различением action и info сообщений.</w:t>
+      </w:r>
+    </w:p>
+    <w:p>
+      <w:pPr>
+        <w:spacing w:line="360" w:lineRule="auto" w:before="0" w:after="0"/>
+        <w:ind w:firstLine="709"/>
+        <w:jc w:val="both"/>
+      </w:pPr>
+      <w:r>
+        <w:rPr>
+          <w:rFonts w:ascii="Times New Roman" w:hAnsi="Times New Roman" w:cs="Times New Roman" w:eastAsia="Times New Roman"/>
+          <w:b w:val="0"/>
+          <w:i w:val="0"/>
+          <w:sz w:val="28"/>
+        </w:rPr>
+        <w:t>Запуск автоматизирован через GitHub Actions с расписанием 08:00, 14:00 и 22:00 по московскому времени в рабочие дни (cron-выражения 0 5/11/19 * * 1-5 в UTC). Это обеспечивает три точки переобучения в день: перед открытием Московской биржи, в середине сессии и после закрытия COMEX, что покрывает все ключевые моменты для принятия торговых решений.</w:t>
+      </w:r>
+    </w:p>
+    <w:p>
+      <w:pPr>
+        <w:spacing w:line="360" w:lineRule="auto" w:before="0" w:after="0"/>
+        <w:ind w:firstLine="709"/>
+        <w:jc w:val="both"/>
+      </w:pPr>
+      <w:r>
+        <w:rPr>
+          <w:rFonts w:ascii="Times New Roman" w:hAnsi="Times New Roman" w:cs="Times New Roman" w:eastAsia="Times New Roman"/>
+          <w:b w:val="0"/>
+          <w:i w:val="0"/>
+          <w:sz w:val="28"/>
+        </w:rPr>
+        <w:t>Дополнительно реализован механизм дедупликации сигналов: при каждом запуске система находит последний сохранённый сигнал и сравнивает с новым. Если сигнал не изменился — отправляется информационное напоминание ("сигнал не изменился — действий не требуется"). Если сигнал сменился (например, HOLD → BUY) — отправляется уведомление о действии ("действовать сейчас"). Это решает практическую UX-проблему: три уведомления BUY в день не воспринимаются как три отдельные команды на покупку, а одно действительное изменение чётко выделяется.</w:t>
+      </w:r>
+    </w:p>
+    <w:p>
+      <w:pPr>
+        <w:spacing w:line="360" w:lineRule="auto" w:before="0" w:after="0"/>
+        <w:ind w:firstLine="709"/>
+        <w:jc w:val="both"/>
+      </w:pPr>
+      <w:r>
+        <w:rPr>
+          <w:rFonts w:ascii="Times New Roman" w:hAnsi="Times New Roman" w:cs="Times New Roman" w:eastAsia="Times New Roman"/>
+          <w:b w:val="0"/>
+          <w:i w:val="0"/>
+          <w:sz w:val="28"/>
+        </w:rPr>
+        <w:t>Пользовательский интерфейс системы (Streamlit-приложение simple_app.py) автоматически переключается на E3b как первичный источник сигнала с fallback на старую модель для обратной совместимости. На главной странице "Сейчас" пользователь видит метку источника (E3b / production / fallback), текущий сигнал, цену серебра и автоматическое предупреждение о повторном уведомлении дня.</w:t>
+      </w:r>
+    </w:p>
+    <w:p>
+      <w:pPr>
+        <w:spacing w:line="360" w:lineRule="auto" w:before="0" w:after="0"/>
+        <w:ind w:firstLine="709"/>
+        <w:jc w:val="both"/>
+      </w:pPr>
+      <w:r>
+        <w:rPr>
+          <w:rFonts w:ascii="Times New Roman" w:hAnsi="Times New Roman" w:cs="Times New Roman" w:eastAsia="Times New Roman"/>
+          <w:b w:val="0"/>
+          <w:i w:val="0"/>
+          <w:sz w:val="28"/>
+        </w:rPr>
+        <w:t>Таким образом, разработанная модель E3b не только показывает значительное методологическое улучшение в исследовательской части, но и полностью интегрирована в production-инфраструктуру с автоматизированным переобучением и доставкой сигналов конечному пользователю.</w:t>
       </w:r>
     </w:p>
     <w:p>
@@ -8859,6 +13226,140 @@
           <w:i w:val="0"/>
           <w:sz w:val="28"/>
         </w:rPr>
+        <w:t>ЗАКЛЮЧЕНИЕ</w:t>
+      </w:r>
+    </w:p>
+    <w:p>
+      <w:pPr>
+        <w:spacing w:line="360" w:lineRule="auto" w:before="0" w:after="0"/>
+        <w:ind w:firstLine="709"/>
+        <w:jc w:val="both"/>
+      </w:pPr>
+      <w:r>
+        <w:rPr>
+          <w:rFonts w:ascii="Times New Roman" w:hAnsi="Times New Roman" w:cs="Times New Roman" w:eastAsia="Times New Roman"/>
+          <w:b w:val="0"/>
+          <w:i w:val="0"/>
+          <w:sz w:val="28"/>
+        </w:rPr>
+        <w:t>В рамках выпускной квалификационной работы была разработана и реализована программная система интеллектуального торгового помощника на основе ансамбля моделей машинного обучения, предназначенная для формирования торговых сигналов на рынке фьючерсов на серебро.</w:t>
+      </w:r>
+    </w:p>
+    <w:p>
+      <w:pPr>
+        <w:spacing w:line="360" w:lineRule="auto" w:before="0" w:after="0"/>
+        <w:ind w:firstLine="709"/>
+        <w:jc w:val="both"/>
+      </w:pPr>
+      <w:r>
+        <w:rPr>
+          <w:rFonts w:ascii="Times New Roman" w:hAnsi="Times New Roman" w:cs="Times New Roman" w:eastAsia="Times New Roman"/>
+          <w:b w:val="0"/>
+          <w:i w:val="0"/>
+          <w:sz w:val="28"/>
+        </w:rPr>
+        <w:t>В ходе выполнения работы удалось объединить несколько связанных направлений – формирование признакового описания состояния рынка, разметку обучающих данных по методу тройного барьерного размечивания, обучение ансамблевой ML-модели с режим-зависимой специализацией, исполнение торговых сигналов с применением механики trailing stop и периода охлаждения, валидацию результатов методом walk-forward, а также автоматизированную доставку рекомендаций пользователю через веб-интерфейс и мессенджер. В результате был создан программный продукт, позволяющий выполнять полный цикл формирования торговых рекомендаций без необходимости ручного запуска отдельных скриптов или интерпретации промежуточных результатов.</w:t>
+      </w:r>
+    </w:p>
+    <w:p>
+      <w:pPr>
+        <w:spacing w:line="360" w:lineRule="auto" w:before="0" w:after="0"/>
+        <w:ind w:firstLine="709"/>
+        <w:jc w:val="both"/>
+      </w:pPr>
+      <w:r>
+        <w:rPr>
+          <w:rFonts w:ascii="Times New Roman" w:hAnsi="Times New Roman" w:cs="Times New Roman" w:eastAsia="Times New Roman"/>
+          <w:b w:val="0"/>
+          <w:i w:val="0"/>
+          <w:sz w:val="28"/>
+        </w:rPr>
+        <w:t>Практическая проверка системы на исторических данных за восьмилетний период показала, что предложенный подход способен формировать торговые сигналы с положительной накопленной доходностью в +31.4% при выполнении 38 сделок, тогда как контрольная стратегия со случайными сигналами демонстрирует отрицательную доходность -2.7% при 78 сделках. Особенно заметный эффект ML-модели был получен в стабильных рыночных условиях периода 2018–2024 годов, где модель добавила +10.45 процентных пункта годовой доходности относительно случайного baseline. Одновременно эксперименты с аномальным периодом 2025 года показали, что в условиях существенного сдвига рыночного режима качество ML-стратегии может временно ухудшаться, что согласуется с известным в литературе свойством моделей машинного обучения деградировать при изменении распределения входных данных.</w:t>
+      </w:r>
+    </w:p>
+    <w:p>
+      <w:pPr>
+        <w:spacing w:line="360" w:lineRule="auto" w:before="0" w:after="0"/>
+        <w:ind w:firstLine="709"/>
+        <w:jc w:val="both"/>
+      </w:pPr>
+      <w:r>
+        <w:rPr>
+          <w:rFonts w:ascii="Times New Roman" w:hAnsi="Times New Roman" w:cs="Times New Roman" w:eastAsia="Times New Roman"/>
+          <w:b w:val="0"/>
+          <w:i w:val="0"/>
+          <w:sz w:val="28"/>
+        </w:rPr>
+        <w:t>В процессе разработки удалось не только реализовать базовую функциональность системы, но и выявить ряд практических ограничений, которые напрямую влияют на итоговый результат. Наиболее заметные сложности были связаны с нестационарностью финансовых временных рядов, с необходимостью корректного учёта внутридневных движений цены при тройном барьерном размечивании, с обеспечением устойчивости классификации рыночного режима, с обработкой временной недоступности внешних сервисов (Tinkoff Invest API, Telegram Bot API) и с проблемой деградации модели при структурном сдвиге рынка. Отдельного внимания потребовала задача организации автоматизированного переобучения модели на свежих данных, реализованного через платформу GitHub Actions с тремя ежедневными запусками.</w:t>
+      </w:r>
+    </w:p>
+    <w:p>
+      <w:pPr>
+        <w:spacing w:line="360" w:lineRule="auto" w:before="0" w:after="0"/>
+        <w:ind w:firstLine="709"/>
+        <w:jc w:val="both"/>
+      </w:pPr>
+      <w:r>
+        <w:rPr>
+          <w:rFonts w:ascii="Times New Roman" w:hAnsi="Times New Roman" w:cs="Times New Roman" w:eastAsia="Times New Roman"/>
+          <w:b w:val="0"/>
+          <w:i w:val="0"/>
+          <w:sz w:val="28"/>
+        </w:rPr>
+        <w:t>Полученный опыт показал, что дальнейшее развитие разработанной системы может быть связано не только с улучшением самой модели, но и с развитием всего пайплайна формирования сигналов. Перспективным направлением является интеграция дополнительных признаков из альтернативных источников данных (макроэкономические показатели, индексы настроений рынка), повышение качества классификации рыночного режима через применение более сложных методов (скрытые марковские модели), внедрение адаптивного порога формирования сигналов в зависимости от текущей волатильности, а также расширение поддержки на другие инструменты драгоценных металлов (золото, платина, палладий).</w:t>
+      </w:r>
+    </w:p>
+    <w:p>
+      <w:pPr>
+        <w:spacing w:line="360" w:lineRule="auto" w:before="0" w:after="0"/>
+        <w:ind w:firstLine="709"/>
+        <w:jc w:val="both"/>
+      </w:pPr>
+      <w:r>
+        <w:rPr>
+          <w:rFonts w:ascii="Times New Roman" w:hAnsi="Times New Roman" w:cs="Times New Roman" w:eastAsia="Times New Roman"/>
+          <w:b w:val="0"/>
+          <w:i w:val="0"/>
+          <w:sz w:val="28"/>
+        </w:rPr>
+        <w:t>Особое направление развития связано с проблемой адаптации к структурным сдвигам рынка. Текущая реализация полагается на регулярное переобучение модели на свежих данных, однако в периоды резких сдвигов рыночного режима этот механизм может оказаться недостаточным. Перспективным направлением является разработка специализированных методов детектирования структурного сдвига и автоматического переключения между моделями, обученными на разных режимах, что позволит сократить период деградации качества модели после смены рыночных условий.</w:t>
+      </w:r>
+    </w:p>
+    <w:p>
+      <w:pPr>
+        <w:spacing w:line="360" w:lineRule="auto" w:before="0" w:after="0"/>
+        <w:ind w:firstLine="709"/>
+        <w:jc w:val="both"/>
+      </w:pPr>
+      <w:r>
+        <w:rPr>
+          <w:rFonts w:ascii="Times New Roman" w:hAnsi="Times New Roman" w:cs="Times New Roman" w:eastAsia="Times New Roman"/>
+          <w:b w:val="0"/>
+          <w:i w:val="0"/>
+          <w:sz w:val="28"/>
+        </w:rPr>
+        <w:t>Результаты выполненной работы подтверждают, что поставленная цель была достигнута, а разработанная система уже может использоваться как практический инструмент формирования торговых сигналов на рынке фьючерсов на серебро в стабильных рыночных условиях. При этом проведённые эксперименты показали наличие дальнейшего потенциала развития, что делает разработанный программный продукт хорошей основой для последующих исследований в области применения машинного обучения в алгоритмической торговле.</w:t>
+      </w:r>
+    </w:p>
+    <w:p>
+      <w:r>
+        <w:br w:type="page"/>
+      </w:r>
+    </w:p>
+    <w:p>
+      <w:pPr>
+        <w:keepNext/>
+        <w:spacing w:line="360" w:lineRule="auto" w:before="0" w:after="240"/>
+        <w:ind w:firstLine="0"/>
+        <w:jc w:val="center"/>
+      </w:pPr>
+      <w:r>
+        <w:rPr>
+          <w:rFonts w:ascii="Times New Roman" w:hAnsi="Times New Roman" w:cs="Times New Roman" w:eastAsia="Times New Roman"/>
+          <w:b/>
+          <w:i w:val="0"/>
+          <w:sz w:val="28"/>
+        </w:rPr>
         <w:t>ГЛОССАРИЙ</w:t>
       </w:r>
     </w:p>
@@ -8875,7 +13376,24 @@
           <w:i w:val="0"/>
           <w:sz w:val="28"/>
         </w:rPr>
-        <w:t>Алгоритмическая торговля – автоматизированный процесс совершения биржевых сделок на основе заранее определённого алгоритма без непосредственного участия человека.</w:t>
+      </w:r>
+      <w:r>
+        <w:rPr>
+          <w:rFonts w:ascii="Times New Roman" w:hAnsi="Times New Roman" w:cs="Times New Roman" w:eastAsia="Times New Roman"/>
+          <w:b/>
+          <w:i w:val="0"/>
+          <w:sz w:val="28"/>
+        </w:rPr>
+        <w:t>Алгоритмическая торговля</w:t>
+      </w:r>
+      <w:r>
+        <w:rPr>
+          <w:rFonts w:ascii="Times New Roman" w:hAnsi="Times New Roman" w:cs="Times New Roman" w:eastAsia="Times New Roman"/>
+          <w:b w:val="0"/>
+          <w:i w:val="0"/>
+          <w:sz w:val="28"/>
+        </w:rPr>
+        <w:t xml:space="preserve"> – автоматизированный процесс совершения биржевых сделок на основе заранее определённого алгоритма без непосредственного участия человека.</w:t>
       </w:r>
     </w:p>
     <w:p>
@@ -8891,7 +13409,24 @@
           <w:i w:val="0"/>
           <w:sz w:val="28"/>
         </w:rPr>
-        <w:t>Ансамбль моделей – метод машинного обучения, объединяющий предсказания нескольких отдельных моделей для получения итогового решения с улучшенными статистическими свойствами.</w:t>
+      </w:r>
+      <w:r>
+        <w:rPr>
+          <w:rFonts w:ascii="Times New Roman" w:hAnsi="Times New Roman" w:cs="Times New Roman" w:eastAsia="Times New Roman"/>
+          <w:b/>
+          <w:i w:val="0"/>
+          <w:sz w:val="28"/>
+        </w:rPr>
+        <w:t>Ансамбль моделей</w:t>
+      </w:r>
+      <w:r>
+        <w:rPr>
+          <w:rFonts w:ascii="Times New Roman" w:hAnsi="Times New Roman" w:cs="Times New Roman" w:eastAsia="Times New Roman"/>
+          <w:b w:val="0"/>
+          <w:i w:val="0"/>
+          <w:sz w:val="28"/>
+        </w:rPr>
+        <w:t xml:space="preserve"> – метод машинного обучения, объединяющий предсказания нескольких отдельных моделей для получения итогового решения с улучшенными статистическими свойствами.</w:t>
       </w:r>
     </w:p>
     <w:p>
@@ -8907,7 +13442,24 @@
           <w:i w:val="0"/>
           <w:sz w:val="28"/>
         </w:rPr>
-        <w:t>Walk-forward анализ – метод последовательной валидации торговой стратегии, при котором модель обучается на скользящем окне исторических данных и тестируется на следующем за ним временном интервале.</w:t>
+      </w:r>
+      <w:r>
+        <w:rPr>
+          <w:rFonts w:ascii="Times New Roman" w:hAnsi="Times New Roman" w:cs="Times New Roman" w:eastAsia="Times New Roman"/>
+          <w:b/>
+          <w:i w:val="0"/>
+          <w:sz w:val="28"/>
+        </w:rPr>
+        <w:t>Walk-forward анализ</w:t>
+      </w:r>
+      <w:r>
+        <w:rPr>
+          <w:rFonts w:ascii="Times New Roman" w:hAnsi="Times New Roman" w:cs="Times New Roman" w:eastAsia="Times New Roman"/>
+          <w:b w:val="0"/>
+          <w:i w:val="0"/>
+          <w:sz w:val="28"/>
+        </w:rPr>
+        <w:t xml:space="preserve"> – метод последовательной валидации торговой стратегии, при котором модель обучается на скользящем окне исторических данных и тестируется на следующем за ним временном интервале.</w:t>
       </w:r>
     </w:p>
     <w:p>
@@ -8923,7 +13475,24 @@
           <w:i w:val="0"/>
           <w:sz w:val="28"/>
         </w:rPr>
-        <w:t>Гистограммный градиентный бустинг (HistGradientBoosting) – высокопроизводительная реализация градиентного бустинга на деревьях решений с квантованием значений признаков для ускорения обучения.</w:t>
+      </w:r>
+      <w:r>
+        <w:rPr>
+          <w:rFonts w:ascii="Times New Roman" w:hAnsi="Times New Roman" w:cs="Times New Roman" w:eastAsia="Times New Roman"/>
+          <w:b/>
+          <w:i w:val="0"/>
+          <w:sz w:val="28"/>
+        </w:rPr>
+        <w:t>Гистограммный градиентный бустинг (HistGradientBoosting)</w:t>
+      </w:r>
+      <w:r>
+        <w:rPr>
+          <w:rFonts w:ascii="Times New Roman" w:hAnsi="Times New Roman" w:cs="Times New Roman" w:eastAsia="Times New Roman"/>
+          <w:b w:val="0"/>
+          <w:i w:val="0"/>
+          <w:sz w:val="28"/>
+        </w:rPr>
+        <w:t xml:space="preserve"> – высокопроизводительная реализация градиентного бустинга на деревьях решений с квантованием значений признаков для ускорения обучения.</w:t>
       </w:r>
     </w:p>
     <w:p>
@@ -8939,7 +13508,24 @@
           <w:i w:val="0"/>
           <w:sz w:val="28"/>
         </w:rPr>
-        <w:t>Дефлированный коэффициент Шарпа (DSR) – статистический показатель результативности торговой стратегии, скорректированный с учётом числа протестированных конфигураций и эффекта множественного тестирования.</w:t>
+      </w:r>
+      <w:r>
+        <w:rPr>
+          <w:rFonts w:ascii="Times New Roman" w:hAnsi="Times New Roman" w:cs="Times New Roman" w:eastAsia="Times New Roman"/>
+          <w:b/>
+          <w:i w:val="0"/>
+          <w:sz w:val="28"/>
+        </w:rPr>
+        <w:t>Дефлированный коэффициент Шарпа (DSR)</w:t>
+      </w:r>
+      <w:r>
+        <w:rPr>
+          <w:rFonts w:ascii="Times New Roman" w:hAnsi="Times New Roman" w:cs="Times New Roman" w:eastAsia="Times New Roman"/>
+          <w:b w:val="0"/>
+          <w:i w:val="0"/>
+          <w:sz w:val="28"/>
+        </w:rPr>
+        <w:t xml:space="preserve"> – статистический показатель результативности торговой стратегии, скорректированный с учётом числа протестированных конфигураций и эффекта множественного тестирования.</w:t>
       </w:r>
     </w:p>
     <w:p>
@@ -8955,7 +13541,24 @@
           <w:i w:val="0"/>
           <w:sz w:val="28"/>
         </w:rPr>
-        <w:t>Комбинаторная очищенная кросс-валидация (CPCV) – метод валидации, в котором обучающая выборка разбивается на N фрагментов, из которых произвольным образом выбираются k фрагментов в качестве тестовой выборки.</w:t>
+      </w:r>
+      <w:r>
+        <w:rPr>
+          <w:rFonts w:ascii="Times New Roman" w:hAnsi="Times New Roman" w:cs="Times New Roman" w:eastAsia="Times New Roman"/>
+          <w:b/>
+          <w:i w:val="0"/>
+          <w:sz w:val="28"/>
+        </w:rPr>
+        <w:t>Комбинаторная очищенная кросс-валидация (CPCV)</w:t>
+      </w:r>
+      <w:r>
+        <w:rPr>
+          <w:rFonts w:ascii="Times New Roman" w:hAnsi="Times New Roman" w:cs="Times New Roman" w:eastAsia="Times New Roman"/>
+          <w:b w:val="0"/>
+          <w:i w:val="0"/>
+          <w:sz w:val="28"/>
+        </w:rPr>
+        <w:t xml:space="preserve"> – метод валидации, в котором обучающая выборка разбивается на N фрагментов, из которых произвольным образом выбираются k фрагментов в качестве тестовой выборки.</w:t>
       </w:r>
     </w:p>
     <w:p>
@@ -8971,7 +13574,24 @@
           <w:i w:val="0"/>
           <w:sz w:val="28"/>
         </w:rPr>
-        <w:t>Период охлаждения (cooldown) – минимальный временной интервал между двумя последовательными сигналами на вход в позицию, применяемый для снижения частоты сделок.</w:t>
+      </w:r>
+      <w:r>
+        <w:rPr>
+          <w:rFonts w:ascii="Times New Roman" w:hAnsi="Times New Roman" w:cs="Times New Roman" w:eastAsia="Times New Roman"/>
+          <w:b/>
+          <w:i w:val="0"/>
+          <w:sz w:val="28"/>
+        </w:rPr>
+        <w:t>Период охлаждения (cooldown)</w:t>
+      </w:r>
+      <w:r>
+        <w:rPr>
+          <w:rFonts w:ascii="Times New Roman" w:hAnsi="Times New Roman" w:cs="Times New Roman" w:eastAsia="Times New Roman"/>
+          <w:b w:val="0"/>
+          <w:i w:val="0"/>
+          <w:sz w:val="28"/>
+        </w:rPr>
+        <w:t xml:space="preserve"> – минимальный временной интервал между двумя последовательными сигналами на вход в позицию, применяемый для снижения частоты сделок.</w:t>
       </w:r>
     </w:p>
     <w:p>
@@ -8987,7 +13607,24 @@
           <w:i w:val="0"/>
           <w:sz w:val="28"/>
         </w:rPr>
-        <w:t>Сдвиг распределения (dataset shift) – ситуация, при которой статистические свойства входных данных модели в эксплуатации отличаются от свойств обучающей выборки.</w:t>
+      </w:r>
+      <w:r>
+        <w:rPr>
+          <w:rFonts w:ascii="Times New Roman" w:hAnsi="Times New Roman" w:cs="Times New Roman" w:eastAsia="Times New Roman"/>
+          <w:b/>
+          <w:i w:val="0"/>
+          <w:sz w:val="28"/>
+        </w:rPr>
+        <w:t>Сдвиг распределения (dataset shift)</w:t>
+      </w:r>
+      <w:r>
+        <w:rPr>
+          <w:rFonts w:ascii="Times New Roman" w:hAnsi="Times New Roman" w:cs="Times New Roman" w:eastAsia="Times New Roman"/>
+          <w:b w:val="0"/>
+          <w:i w:val="0"/>
+          <w:sz w:val="28"/>
+        </w:rPr>
+        <w:t xml:space="preserve"> – ситуация, при которой статистические свойства входных данных модели в эксплуатации отличаются от свойств обучающей выборки.</w:t>
       </w:r>
     </w:p>
     <w:p>
@@ -9003,7 +13640,24 @@
           <w:i w:val="0"/>
           <w:sz w:val="28"/>
         </w:rPr>
-        <w:t>Стационарный блочный бутстрап (Politis-Romano) – метод формирования синтетических временных рядов с сохранением структуры автокорреляции исходных данных для оценки статистической значимости результатов.</w:t>
+      </w:r>
+      <w:r>
+        <w:rPr>
+          <w:rFonts w:ascii="Times New Roman" w:hAnsi="Times New Roman" w:cs="Times New Roman" w:eastAsia="Times New Roman"/>
+          <w:b/>
+          <w:i w:val="0"/>
+          <w:sz w:val="28"/>
+        </w:rPr>
+        <w:t>Стационарный блочный бутстрап (Politis-Romano)</w:t>
+      </w:r>
+      <w:r>
+        <w:rPr>
+          <w:rFonts w:ascii="Times New Roman" w:hAnsi="Times New Roman" w:cs="Times New Roman" w:eastAsia="Times New Roman"/>
+          <w:b w:val="0"/>
+          <w:i w:val="0"/>
+          <w:sz w:val="28"/>
+        </w:rPr>
+        <w:t xml:space="preserve"> – метод формирования синтетических временных рядов с сохранением структуры автокорреляции исходных данных для оценки статистической значимости результатов.</w:t>
       </w:r>
     </w:p>
     <w:p>
@@ -9019,7 +13673,24 @@
           <w:i w:val="0"/>
           <w:sz w:val="28"/>
         </w:rPr>
-        <w:t>Тройное барьерное размечивание (Triple Barrier Method) – метод формирования меток для обучения торговой ML-модели, при котором для каждого наблюдения определяется первый достигнутый из трёх барьеров (верхнего, нижнего или временного).</w:t>
+      </w:r>
+      <w:r>
+        <w:rPr>
+          <w:rFonts w:ascii="Times New Roman" w:hAnsi="Times New Roman" w:cs="Times New Roman" w:eastAsia="Times New Roman"/>
+          <w:b/>
+          <w:i w:val="0"/>
+          <w:sz w:val="28"/>
+        </w:rPr>
+        <w:t>Тройное барьерное размечивание (Triple Barrier Method)</w:t>
+      </w:r>
+      <w:r>
+        <w:rPr>
+          <w:rFonts w:ascii="Times New Roman" w:hAnsi="Times New Roman" w:cs="Times New Roman" w:eastAsia="Times New Roman"/>
+          <w:b w:val="0"/>
+          <w:i w:val="0"/>
+          <w:sz w:val="28"/>
+        </w:rPr>
+        <w:t xml:space="preserve"> – метод формирования меток для обучения торговой ML-модели, при котором для каждого наблюдения определяется первый достигнутый из трёх барьеров (верхнего, нижнего или временного).</w:t>
       </w:r>
     </w:p>
     <w:p>
@@ -9035,7 +13706,24 @@
           <w:i w:val="0"/>
           <w:sz w:val="28"/>
         </w:rPr>
-        <w:t>Trailing stop – динамический уровень стоп-лосса, автоматически подтягивающийся вслед за движением цены в благоприятном для позиции направлении.</w:t>
+      </w:r>
+      <w:r>
+        <w:rPr>
+          <w:rFonts w:ascii="Times New Roman" w:hAnsi="Times New Roman" w:cs="Times New Roman" w:eastAsia="Times New Roman"/>
+          <w:b/>
+          <w:i w:val="0"/>
+          <w:sz w:val="28"/>
+        </w:rPr>
+        <w:t>Trailing stop</w:t>
+      </w:r>
+      <w:r>
+        <w:rPr>
+          <w:rFonts w:ascii="Times New Roman" w:hAnsi="Times New Roman" w:cs="Times New Roman" w:eastAsia="Times New Roman"/>
+          <w:b w:val="0"/>
+          <w:i w:val="0"/>
+          <w:sz w:val="28"/>
+        </w:rPr>
+        <w:t xml:space="preserve"> – динамический уровень стоп-лосса, автоматически подтягивающийся вслед за движением цены в благоприятном для позиции направлении.</w:t>
       </w:r>
     </w:p>
     <w:p>
@@ -9051,7 +13739,24 @@
           <w:i w:val="0"/>
           <w:sz w:val="28"/>
         </w:rPr>
-        <w:t>Фьючерс на серебро (SLVRUBF) – расчётный фьючерсный контракт на серебро, торгуемый на Московской бирже и номинированный в российских рублях.</w:t>
+      </w:r>
+      <w:r>
+        <w:rPr>
+          <w:rFonts w:ascii="Times New Roman" w:hAnsi="Times New Roman" w:cs="Times New Roman" w:eastAsia="Times New Roman"/>
+          <w:b/>
+          <w:i w:val="0"/>
+          <w:sz w:val="28"/>
+        </w:rPr>
+        <w:t>Фьючерс на серебро (SLVRUBF)</w:t>
+      </w:r>
+      <w:r>
+        <w:rPr>
+          <w:rFonts w:ascii="Times New Roman" w:hAnsi="Times New Roman" w:cs="Times New Roman" w:eastAsia="Times New Roman"/>
+          <w:b w:val="0"/>
+          <w:i w:val="0"/>
+          <w:sz w:val="28"/>
+        </w:rPr>
+        <w:t xml:space="preserve"> – расчётный фьючерсный контракт на серебро, торгуемый на Московской бирже и номинированный в российских рублях.</w:t>
       </w:r>
     </w:p>
     <w:p>
@@ -9067,7 +13772,24 @@
           <w:i w:val="0"/>
           <w:sz w:val="28"/>
         </w:rPr>
-        <w:t>FIGI – Financial Instrument Global Identifier, международный идентификатор финансового инструмента.</w:t>
+      </w:r>
+      <w:r>
+        <w:rPr>
+          <w:rFonts w:ascii="Times New Roman" w:hAnsi="Times New Roman" w:cs="Times New Roman" w:eastAsia="Times New Roman"/>
+          <w:b/>
+          <w:i w:val="0"/>
+          <w:sz w:val="28"/>
+        </w:rPr>
+        <w:t>FIGI</w:t>
+      </w:r>
+      <w:r>
+        <w:rPr>
+          <w:rFonts w:ascii="Times New Roman" w:hAnsi="Times New Roman" w:cs="Times New Roman" w:eastAsia="Times New Roman"/>
+          <w:b w:val="0"/>
+          <w:i w:val="0"/>
+          <w:sz w:val="28"/>
+        </w:rPr>
+        <w:t xml:space="preserve"> – Financial Instrument Global Identifier, международный идентификатор финансового инструмента.</w:t>
       </w:r>
     </w:p>
     <w:p>

</xml_diff>